<commit_message>
Se agrego mas informacion de lo avanzado a la Bitacora
</commit_message>
<xml_diff>
--- a/Bitácora-PolyIA.docx
+++ b/Bitácora-PolyIA.docx
@@ -523,6 +523,12 @@
         <w:rPr>
           <w:rFonts w:ascii="Arial" w:hAnsi="Arial" w:cs="Arial"/>
         </w:rPr>
+        <w:t>-</w:t>
+      </w:r>
+      <w:r>
+        <w:rPr>
+          <w:rFonts w:ascii="Arial" w:hAnsi="Arial" w:cs="Arial"/>
+        </w:rPr>
         <w:t xml:space="preserve">Creación de entorno virtual en </w:t>
       </w:r>
       <w:proofErr w:type="spellStart"/>
@@ -846,6 +852,12 @@
         <w:rPr>
           <w:rFonts w:ascii="Arial" w:hAnsi="Arial" w:cs="Arial"/>
         </w:rPr>
+        <w:t>-</w:t>
+      </w:r>
+      <w:r>
+        <w:rPr>
+          <w:rFonts w:ascii="Arial" w:hAnsi="Arial" w:cs="Arial"/>
+        </w:rPr>
         <w:t xml:space="preserve">Iniciado </w:t>
       </w:r>
       <w:proofErr w:type="spellStart"/>
@@ -1071,6 +1083,70 @@
           <w:rFonts w:ascii="Arial" w:hAnsi="Arial" w:cs="Arial"/>
         </w:rPr>
         <w:t xml:space="preserve"> /api/chat/local.</w:t>
+      </w:r>
+    </w:p>
+    <w:p>
+      <w:pPr>
+        <w:pStyle w:val="NormalWeb"/>
+        <w:rPr>
+          <w:rFonts w:ascii="Arial" w:hAnsi="Arial" w:cs="Arial"/>
+        </w:rPr>
+      </w:pPr>
+      <w:r>
+        <w:rPr>
+          <w:rFonts w:ascii="Arial" w:hAnsi="Arial" w:cs="Arial"/>
+        </w:rPr>
+        <w:t xml:space="preserve">-Se le hizo un </w:t>
+      </w:r>
+      <w:proofErr w:type="spellStart"/>
+      <w:r>
+        <w:rPr>
+          <w:rFonts w:ascii="Arial" w:hAnsi="Arial" w:cs="Arial"/>
+        </w:rPr>
+        <w:t>rework</w:t>
+      </w:r>
+      <w:proofErr w:type="spellEnd"/>
+      <w:r>
+        <w:rPr>
+          <w:rFonts w:ascii="Arial" w:hAnsi="Arial" w:cs="Arial"/>
+        </w:rPr>
+        <w:t xml:space="preserve"> nuevo a la interfaz cambiando un poco lo que el usuario final vera en la página. Ahora ya no aparecen las opciones de IA que puedes utilizar que antes aparecían como </w:t>
+      </w:r>
+      <w:proofErr w:type="spellStart"/>
+      <w:r>
+        <w:rPr>
+          <w:rFonts w:ascii="Arial" w:hAnsi="Arial" w:cs="Arial"/>
+        </w:rPr>
+        <w:t>Cha</w:t>
+      </w:r>
+      <w:bookmarkStart w:id="0" w:name="_GoBack"/>
+      <w:bookmarkEnd w:id="0"/>
+      <w:r>
+        <w:rPr>
+          <w:rFonts w:ascii="Arial" w:hAnsi="Arial" w:cs="Arial"/>
+        </w:rPr>
+        <w:t>tGPT</w:t>
+      </w:r>
+      <w:proofErr w:type="spellEnd"/>
+      <w:r>
+        <w:rPr>
+          <w:rFonts w:ascii="Arial" w:hAnsi="Arial" w:cs="Arial"/>
+        </w:rPr>
+        <w:t xml:space="preserve">, Claude, </w:t>
+      </w:r>
+      <w:proofErr w:type="spellStart"/>
+      <w:r>
+        <w:rPr>
+          <w:rFonts w:ascii="Arial" w:hAnsi="Arial" w:cs="Arial"/>
+        </w:rPr>
+        <w:t>Gemini</w:t>
+      </w:r>
+      <w:proofErr w:type="spellEnd"/>
+      <w:r>
+        <w:rPr>
+          <w:rFonts w:ascii="Arial" w:hAnsi="Arial" w:cs="Arial"/>
+        </w:rPr>
+        <w:t>, esto para enfocar mejor el trabajo del proyecto y no gastar tiempo importante en cosas que no son tan necesarias. También se le agrego un botón nuevo en el cual puedes cambiar a modo noche y todo se volverá oscuro, esto más que nada porque todo era muy blanco y ya el usuario puede decidir.</w:t>
       </w:r>
     </w:p>
     <w:p>
@@ -1135,7 +1211,6 @@
           <w:rFonts w:ascii="Arial" w:hAnsi="Arial" w:cs="Arial"/>
         </w:rPr>
       </w:pPr>
-      <w:bookmarkStart w:id="0" w:name="_GoBack"/>
       <w:r>
         <w:rPr>
           <w:rFonts w:ascii="Arial" w:hAnsi="Arial" w:cs="Arial"/>
@@ -1184,7 +1259,6 @@
           </wp:inline>
         </w:drawing>
       </w:r>
-      <w:bookmarkEnd w:id="0"/>
     </w:p>
     <w:p>
       <w:pPr>

</xml_diff>

<commit_message>
Se agregaaron nuevas modificaciones al archivo Word
</commit_message>
<xml_diff>
--- a/Bitácora-PolyIA.docx
+++ b/Bitácora-PolyIA.docx
@@ -823,23 +823,76 @@
     <w:p>
       <w:pPr>
         <w:pStyle w:val="NormalWeb"/>
-        <w:jc w:val="center"/>
-        <w:rPr>
-          <w:rFonts w:ascii="Arial" w:hAnsi="Arial" w:cs="Arial"/>
-          <w:b/>
-          <w:sz w:val="32"/>
+        <w:rPr>
+          <w:rFonts w:ascii="Arial" w:hAnsi="Arial" w:cs="Arial"/>
         </w:rPr>
       </w:pPr>
-      <w:proofErr w:type="spellStart"/>
-      <w:r>
-        <w:rPr>
-          <w:rFonts w:ascii="Arial" w:hAnsi="Arial" w:cs="Arial"/>
-          <w:b/>
-          <w:sz w:val="32"/>
-        </w:rPr>
-        <w:t>Frontend</w:t>
-      </w:r>
-      <w:proofErr w:type="spellEnd"/>
+      <w:r>
+        <w:rPr>
+          <w:rFonts w:ascii="Arial" w:hAnsi="Arial" w:cs="Arial"/>
+        </w:rPr>
+        <w:t>-</w:t>
+      </w:r>
+      <w:r>
+        <w:rPr>
+          <w:rFonts w:ascii="Arial" w:hAnsi="Arial" w:cs="Arial"/>
+        </w:rPr>
+        <w:t>Se solucionó</w:t>
+      </w:r>
+      <w:r>
+        <w:rPr>
+          <w:rFonts w:ascii="Arial" w:hAnsi="Arial" w:cs="Arial"/>
+        </w:rPr>
+        <w:t xml:space="preserve"> el error en el que al man</w:t>
+      </w:r>
+      <w:r>
+        <w:rPr>
+          <w:rFonts w:ascii="Arial" w:hAnsi="Arial" w:cs="Arial"/>
+        </w:rPr>
+        <w:t xml:space="preserve">dar tus lecciones completadas al chat tutor se duplicaban, lo que causaba que este tardara más en analizarlas, también ahora los errores exactos salen directos en el log para así solucionarlo mejor, esto se quitará en la versión final. El problema era que se ejecutaba </w:t>
+      </w:r>
+      <w:proofErr w:type="spellStart"/>
+      <w:r>
+        <w:rPr>
+          <w:rFonts w:ascii="Arial" w:hAnsi="Arial" w:cs="Arial"/>
+        </w:rPr>
+        <w:t>UseEffect</w:t>
+      </w:r>
+      <w:proofErr w:type="spellEnd"/>
+      <w:r>
+        <w:rPr>
+          <w:rFonts w:ascii="Arial" w:hAnsi="Arial" w:cs="Arial"/>
+        </w:rPr>
+        <w:t xml:space="preserve"> en lugar de </w:t>
+      </w:r>
+      <w:proofErr w:type="spellStart"/>
+      <w:r>
+        <w:rPr>
+          <w:rFonts w:ascii="Arial" w:hAnsi="Arial" w:cs="Arial"/>
+        </w:rPr>
+        <w:t>Useref</w:t>
+      </w:r>
+      <w:proofErr w:type="spellEnd"/>
+      <w:r>
+        <w:rPr>
+          <w:rFonts w:ascii="Arial" w:hAnsi="Arial" w:cs="Arial"/>
+        </w:rPr>
+        <w:t xml:space="preserve">, recordatorio que usamos la versión 18 de </w:t>
+      </w:r>
+      <w:proofErr w:type="spellStart"/>
+      <w:r>
+        <w:rPr>
+          <w:rFonts w:ascii="Arial" w:hAnsi="Arial" w:cs="Arial"/>
+        </w:rPr>
+        <w:t>React</w:t>
+      </w:r>
+      <w:proofErr w:type="spellEnd"/>
+      <w:r>
+        <w:rPr>
+          <w:rFonts w:ascii="Arial" w:hAnsi="Arial" w:cs="Arial"/>
+        </w:rPr>
+        <w:t>.</w:t>
+      </w:r>
     </w:p>
     <w:p>
       <w:pPr>
@@ -852,34 +905,20 @@
         <w:rPr>
           <w:rFonts w:ascii="Arial" w:hAnsi="Arial" w:cs="Arial"/>
         </w:rPr>
-        <w:t>-</w:t>
-      </w:r>
-      <w:r>
-        <w:rPr>
-          <w:rFonts w:ascii="Arial" w:hAnsi="Arial" w:cs="Arial"/>
-        </w:rPr>
-        <w:t xml:space="preserve">Iniciado </w:t>
-      </w:r>
-      <w:proofErr w:type="spellStart"/>
-      <w:r>
-        <w:rPr>
-          <w:rFonts w:ascii="Arial" w:hAnsi="Arial" w:cs="Arial"/>
-        </w:rPr>
-        <w:t>dev</w:t>
-      </w:r>
-      <w:proofErr w:type="spellEnd"/>
-      <w:r>
-        <w:rPr>
-          <w:rFonts w:ascii="Arial" w:hAnsi="Arial" w:cs="Arial"/>
-        </w:rPr>
-        <w:t xml:space="preserve"> server: </w:t>
-      </w:r>
-      <w:proofErr w:type="spellStart"/>
-      <w:r>
-        <w:rPr>
-          <w:rFonts w:ascii="Arial" w:hAnsi="Arial" w:cs="Arial"/>
-        </w:rPr>
-        <w:t>npm</w:t>
+        <w:t>-S</w:t>
+      </w:r>
+      <w:r>
+        <w:rPr>
+          <w:rFonts w:ascii="Arial" w:hAnsi="Arial" w:cs="Arial"/>
+        </w:rPr>
+        <w:t>e modificó el .</w:t>
+      </w:r>
+      <w:proofErr w:type="spellStart"/>
+      <w:r>
+        <w:rPr>
+          <w:rFonts w:ascii="Arial" w:hAnsi="Arial" w:cs="Arial"/>
+        </w:rPr>
+        <w:t>env</w:t>
       </w:r>
       <w:proofErr w:type="spellEnd"/>
       <w:r>
@@ -893,261 +932,78 @@
         <w:rPr>
           <w:rFonts w:ascii="Arial" w:hAnsi="Arial" w:cs="Arial"/>
         </w:rPr>
-        <w:t>run</w:t>
-      </w:r>
-      <w:proofErr w:type="spellEnd"/>
-      <w:r>
-        <w:rPr>
-          <w:rFonts w:ascii="Arial" w:hAnsi="Arial" w:cs="Arial"/>
-        </w:rPr>
-        <w:t xml:space="preserve"> </w:t>
-      </w:r>
-      <w:proofErr w:type="spellStart"/>
-      <w:r>
-        <w:rPr>
-          <w:rFonts w:ascii="Arial" w:hAnsi="Arial" w:cs="Arial"/>
-        </w:rPr>
-        <w:t>dev</w:t>
-      </w:r>
-      <w:proofErr w:type="spellEnd"/>
-      <w:r>
-        <w:rPr>
-          <w:rFonts w:ascii="Arial" w:hAnsi="Arial" w:cs="Arial"/>
-        </w:rPr>
-        <w:t xml:space="preserve">. Pruebas de </w:t>
-      </w:r>
-      <w:proofErr w:type="spellStart"/>
-      <w:r>
-        <w:rPr>
-          <w:rFonts w:ascii="Arial" w:hAnsi="Arial" w:cs="Arial"/>
-        </w:rPr>
-        <w:t>login</w:t>
-      </w:r>
-      <w:proofErr w:type="spellEnd"/>
-      <w:r>
-        <w:rPr>
-          <w:rFonts w:ascii="Arial" w:hAnsi="Arial" w:cs="Arial"/>
-        </w:rPr>
-        <w:t>/</w:t>
-      </w:r>
-      <w:proofErr w:type="spellStart"/>
-      <w:r>
-        <w:rPr>
-          <w:rFonts w:ascii="Arial" w:hAnsi="Arial" w:cs="Arial"/>
-        </w:rPr>
-        <w:t>register</w:t>
-      </w:r>
-      <w:proofErr w:type="spellEnd"/>
-      <w:r>
-        <w:rPr>
-          <w:rFonts w:ascii="Arial" w:hAnsi="Arial" w:cs="Arial"/>
-        </w:rPr>
-        <w:t xml:space="preserve"> en http://localhost:5173. Avances: Proxy de Vite configurado para redirigir a </w:t>
-      </w:r>
-      <w:proofErr w:type="spellStart"/>
-      <w:r>
-        <w:rPr>
-          <w:rFonts w:ascii="Arial" w:hAnsi="Arial" w:cs="Arial"/>
-        </w:rPr>
-        <w:t>backend</w:t>
-      </w:r>
-      <w:proofErr w:type="spellEnd"/>
-      <w:r>
-        <w:rPr>
-          <w:rFonts w:ascii="Arial" w:hAnsi="Arial" w:cs="Arial"/>
-        </w:rPr>
-        <w:t xml:space="preserve"> en puerto 8001. Componentes como </w:t>
-      </w:r>
-      <w:proofErr w:type="spellStart"/>
-      <w:r>
-        <w:rPr>
-          <w:rFonts w:ascii="Arial" w:hAnsi="Arial" w:cs="Arial"/>
-        </w:rPr>
-        <w:t>LoginForm.jsx</w:t>
-      </w:r>
-      <w:proofErr w:type="spellEnd"/>
-      <w:r>
-        <w:rPr>
-          <w:rFonts w:ascii="Arial" w:hAnsi="Arial" w:cs="Arial"/>
-        </w:rPr>
-        <w:t xml:space="preserve"> y </w:t>
-      </w:r>
-      <w:proofErr w:type="spellStart"/>
-      <w:r>
-        <w:rPr>
-          <w:rFonts w:ascii="Arial" w:hAnsi="Arial" w:cs="Arial"/>
-        </w:rPr>
-        <w:t>Dashboard.jsx</w:t>
-      </w:r>
-      <w:proofErr w:type="spellEnd"/>
-      <w:r>
-        <w:rPr>
-          <w:rFonts w:ascii="Arial" w:hAnsi="Arial" w:cs="Arial"/>
-        </w:rPr>
-        <w:t xml:space="preserve"> cargan correctamente. Autenticación JWT probada: Registro de usuario de prueba y </w:t>
-      </w:r>
-      <w:proofErr w:type="spellStart"/>
-      <w:r>
-        <w:rPr>
-          <w:rFonts w:ascii="Arial" w:hAnsi="Arial" w:cs="Arial"/>
-        </w:rPr>
-        <w:t>login</w:t>
-      </w:r>
-      <w:proofErr w:type="spellEnd"/>
-      <w:r>
-        <w:rPr>
-          <w:rFonts w:ascii="Arial" w:hAnsi="Arial" w:cs="Arial"/>
-        </w:rPr>
-        <w:t xml:space="preserve"> exitoso. Problemas encontrados: Errores de CORS; resueltos agregando orígenes en </w:t>
-      </w:r>
-      <w:proofErr w:type="spellStart"/>
-      <w:r>
-        <w:rPr>
-          <w:rFonts w:ascii="Arial" w:hAnsi="Arial" w:cs="Arial"/>
-        </w:rPr>
-        <w:t>backend</w:t>
-      </w:r>
-      <w:proofErr w:type="spellEnd"/>
-      <w:r>
-        <w:rPr>
-          <w:rFonts w:ascii="Arial" w:hAnsi="Arial" w:cs="Arial"/>
-        </w:rPr>
-        <w:t xml:space="preserve"> .</w:t>
-      </w:r>
-      <w:proofErr w:type="spellStart"/>
-      <w:r>
-        <w:rPr>
-          <w:rFonts w:ascii="Arial" w:hAnsi="Arial" w:cs="Arial"/>
-        </w:rPr>
-        <w:t>env</w:t>
-      </w:r>
-      <w:proofErr w:type="spellEnd"/>
-      <w:r>
-        <w:rPr>
-          <w:rFonts w:ascii="Arial" w:hAnsi="Arial" w:cs="Arial"/>
-        </w:rPr>
-        <w:t xml:space="preserve">. Soluciones aplicadas: Usado </w:t>
-      </w:r>
-      <w:proofErr w:type="spellStart"/>
-      <w:r>
-        <w:rPr>
-          <w:rFonts w:ascii="Arial" w:hAnsi="Arial" w:cs="Arial"/>
-        </w:rPr>
-        <w:t>AuthContext.jsx</w:t>
-      </w:r>
-      <w:proofErr w:type="spellEnd"/>
-      <w:r>
-        <w:rPr>
-          <w:rFonts w:ascii="Arial" w:hAnsi="Arial" w:cs="Arial"/>
-        </w:rPr>
-        <w:t xml:space="preserve"> para manejar estado global de </w:t>
-      </w:r>
-      <w:proofErr w:type="spellStart"/>
-      <w:r>
-        <w:rPr>
-          <w:rFonts w:ascii="Arial" w:hAnsi="Arial" w:cs="Arial"/>
-        </w:rPr>
-        <w:t>auth</w:t>
-      </w:r>
-      <w:proofErr w:type="spellEnd"/>
-      <w:r>
-        <w:rPr>
-          <w:rFonts w:ascii="Arial" w:hAnsi="Arial" w:cs="Arial"/>
-        </w:rPr>
-        <w:t xml:space="preserve">. Pendientes: Integrar </w:t>
-      </w:r>
-      <w:proofErr w:type="spellStart"/>
-      <w:r>
-        <w:rPr>
-          <w:rFonts w:ascii="Arial" w:hAnsi="Arial" w:cs="Arial"/>
-        </w:rPr>
-        <w:t>ChatTutor.jsx</w:t>
-      </w:r>
-      <w:proofErr w:type="spellEnd"/>
-      <w:r>
-        <w:rPr>
-          <w:rFonts w:ascii="Arial" w:hAnsi="Arial" w:cs="Arial"/>
-        </w:rPr>
-        <w:t xml:space="preserve"> con </w:t>
-      </w:r>
-      <w:proofErr w:type="spellStart"/>
-      <w:r>
-        <w:rPr>
-          <w:rFonts w:ascii="Arial" w:hAnsi="Arial" w:cs="Arial"/>
-        </w:rPr>
-        <w:t>endpoint</w:t>
-      </w:r>
-      <w:proofErr w:type="spellEnd"/>
-      <w:r>
-        <w:rPr>
-          <w:rFonts w:ascii="Arial" w:hAnsi="Arial" w:cs="Arial"/>
-        </w:rPr>
-        <w:t xml:space="preserve"> /api/chat/local.</w:t>
+        <w:t>example</w:t>
+      </w:r>
+      <w:proofErr w:type="spellEnd"/>
+      <w:r>
+        <w:rPr>
+          <w:rFonts w:ascii="Arial" w:hAnsi="Arial" w:cs="Arial"/>
+        </w:rPr>
+        <w:t xml:space="preserve"> que exponía </w:t>
+      </w:r>
+      <w:proofErr w:type="gramStart"/>
+      <w:r>
+        <w:rPr>
+          <w:rFonts w:ascii="Arial" w:hAnsi="Arial" w:cs="Arial"/>
+        </w:rPr>
+        <w:t>la</w:t>
+      </w:r>
+      <w:proofErr w:type="gramEnd"/>
+      <w:r>
+        <w:rPr>
+          <w:rFonts w:ascii="Arial" w:hAnsi="Arial" w:cs="Arial"/>
+        </w:rPr>
+        <w:t xml:space="preserve"> api </w:t>
+      </w:r>
+      <w:proofErr w:type="spellStart"/>
+      <w:r>
+        <w:rPr>
+          <w:rFonts w:ascii="Arial" w:hAnsi="Arial" w:cs="Arial"/>
+        </w:rPr>
+        <w:t>key</w:t>
+      </w:r>
+      <w:proofErr w:type="spellEnd"/>
+      <w:r>
+        <w:rPr>
+          <w:rFonts w:ascii="Arial" w:hAnsi="Arial" w:cs="Arial"/>
+        </w:rPr>
+        <w:t xml:space="preserve"> de </w:t>
+      </w:r>
+      <w:proofErr w:type="spellStart"/>
+      <w:r>
+        <w:rPr>
+          <w:rFonts w:ascii="Arial" w:hAnsi="Arial" w:cs="Arial"/>
+        </w:rPr>
+        <w:t>gemini</w:t>
+      </w:r>
+      <w:proofErr w:type="spellEnd"/>
+      <w:r>
+        <w:rPr>
+          <w:rFonts w:ascii="Arial" w:hAnsi="Arial" w:cs="Arial"/>
+        </w:rPr>
+        <w:t>.</w:t>
       </w:r>
     </w:p>
     <w:p>
       <w:pPr>
         <w:pStyle w:val="NormalWeb"/>
-        <w:rPr>
-          <w:rFonts w:ascii="Arial" w:hAnsi="Arial" w:cs="Arial"/>
+        <w:jc w:val="center"/>
+        <w:rPr>
+          <w:rFonts w:ascii="Arial" w:hAnsi="Arial" w:cs="Arial"/>
+          <w:b/>
+          <w:sz w:val="32"/>
         </w:rPr>
       </w:pPr>
-      <w:r>
-        <w:rPr>
-          <w:rFonts w:ascii="Arial" w:hAnsi="Arial" w:cs="Arial"/>
-        </w:rPr>
-        <w:t xml:space="preserve">-Se le hizo un </w:t>
-      </w:r>
-      <w:proofErr w:type="spellStart"/>
-      <w:r>
-        <w:rPr>
-          <w:rFonts w:ascii="Arial" w:hAnsi="Arial" w:cs="Arial"/>
-        </w:rPr>
-        <w:t>rework</w:t>
-      </w:r>
-      <w:proofErr w:type="spellEnd"/>
-      <w:r>
-        <w:rPr>
-          <w:rFonts w:ascii="Arial" w:hAnsi="Arial" w:cs="Arial"/>
-        </w:rPr>
-        <w:t xml:space="preserve"> nuevo a la interfaz cambiando un poco lo que el usuario final vera en la página. Ahora ya no aparecen las opciones de IA que puedes utilizar que antes aparecían como </w:t>
-      </w:r>
-      <w:proofErr w:type="spellStart"/>
-      <w:r>
-        <w:rPr>
-          <w:rFonts w:ascii="Arial" w:hAnsi="Arial" w:cs="Arial"/>
-        </w:rPr>
-        <w:t>Cha</w:t>
-      </w:r>
-      <w:bookmarkStart w:id="0" w:name="_GoBack"/>
-      <w:bookmarkEnd w:id="0"/>
-      <w:r>
-        <w:rPr>
-          <w:rFonts w:ascii="Arial" w:hAnsi="Arial" w:cs="Arial"/>
-        </w:rPr>
-        <w:t>tGPT</w:t>
-      </w:r>
-      <w:proofErr w:type="spellEnd"/>
-      <w:r>
-        <w:rPr>
-          <w:rFonts w:ascii="Arial" w:hAnsi="Arial" w:cs="Arial"/>
-        </w:rPr>
-        <w:t xml:space="preserve">, Claude, </w:t>
-      </w:r>
-      <w:proofErr w:type="spellStart"/>
-      <w:r>
-        <w:rPr>
-          <w:rFonts w:ascii="Arial" w:hAnsi="Arial" w:cs="Arial"/>
-        </w:rPr>
-        <w:t>Gemini</w:t>
-      </w:r>
-      <w:proofErr w:type="spellEnd"/>
-      <w:r>
-        <w:rPr>
-          <w:rFonts w:ascii="Arial" w:hAnsi="Arial" w:cs="Arial"/>
-        </w:rPr>
-        <w:t>, esto para enfocar mejor el trabajo del proyecto y no gastar tiempo importante en cosas que no son tan necesarias. También se le agrego un botón nuevo en el cual puedes cambiar a modo noche y todo se volverá oscuro, esto más que nada porque todo era muy blanco y ya el usuario puede decidir.</w:t>
-      </w:r>
+      <w:proofErr w:type="spellStart"/>
+      <w:r>
+        <w:rPr>
+          <w:rFonts w:ascii="Arial" w:hAnsi="Arial" w:cs="Arial"/>
+          <w:b/>
+          <w:sz w:val="32"/>
+        </w:rPr>
+        <w:t>Frontend</w:t>
+      </w:r>
+      <w:proofErr w:type="spellEnd"/>
     </w:p>
     <w:p>
       <w:pPr>
@@ -1159,10 +1015,701 @@
       <w:r>
         <w:rPr>
           <w:rFonts w:ascii="Arial" w:hAnsi="Arial" w:cs="Arial"/>
+        </w:rPr>
+        <w:t>-</w:t>
+      </w:r>
+      <w:r>
+        <w:rPr>
+          <w:rFonts w:ascii="Arial" w:hAnsi="Arial" w:cs="Arial"/>
+        </w:rPr>
+        <w:t xml:space="preserve">Iniciado </w:t>
+      </w:r>
+      <w:proofErr w:type="spellStart"/>
+      <w:r>
+        <w:rPr>
+          <w:rFonts w:ascii="Arial" w:hAnsi="Arial" w:cs="Arial"/>
+        </w:rPr>
+        <w:t>dev</w:t>
+      </w:r>
+      <w:proofErr w:type="spellEnd"/>
+      <w:r>
+        <w:rPr>
+          <w:rFonts w:ascii="Arial" w:hAnsi="Arial" w:cs="Arial"/>
+        </w:rPr>
+        <w:t xml:space="preserve"> server: </w:t>
+      </w:r>
+      <w:proofErr w:type="spellStart"/>
+      <w:r>
+        <w:rPr>
+          <w:rFonts w:ascii="Arial" w:hAnsi="Arial" w:cs="Arial"/>
+        </w:rPr>
+        <w:t>npm</w:t>
+      </w:r>
+      <w:proofErr w:type="spellEnd"/>
+      <w:r>
+        <w:rPr>
+          <w:rFonts w:ascii="Arial" w:hAnsi="Arial" w:cs="Arial"/>
+        </w:rPr>
+        <w:t xml:space="preserve"> </w:t>
+      </w:r>
+      <w:proofErr w:type="spellStart"/>
+      <w:r>
+        <w:rPr>
+          <w:rFonts w:ascii="Arial" w:hAnsi="Arial" w:cs="Arial"/>
+        </w:rPr>
+        <w:t>run</w:t>
+      </w:r>
+      <w:proofErr w:type="spellEnd"/>
+      <w:r>
+        <w:rPr>
+          <w:rFonts w:ascii="Arial" w:hAnsi="Arial" w:cs="Arial"/>
+        </w:rPr>
+        <w:t xml:space="preserve"> </w:t>
+      </w:r>
+      <w:proofErr w:type="spellStart"/>
+      <w:r>
+        <w:rPr>
+          <w:rFonts w:ascii="Arial" w:hAnsi="Arial" w:cs="Arial"/>
+        </w:rPr>
+        <w:t>dev</w:t>
+      </w:r>
+      <w:proofErr w:type="spellEnd"/>
+      <w:r>
+        <w:rPr>
+          <w:rFonts w:ascii="Arial" w:hAnsi="Arial" w:cs="Arial"/>
+        </w:rPr>
+        <w:t xml:space="preserve">. Pruebas de </w:t>
+      </w:r>
+      <w:proofErr w:type="spellStart"/>
+      <w:r>
+        <w:rPr>
+          <w:rFonts w:ascii="Arial" w:hAnsi="Arial" w:cs="Arial"/>
+        </w:rPr>
+        <w:t>login</w:t>
+      </w:r>
+      <w:proofErr w:type="spellEnd"/>
+      <w:r>
+        <w:rPr>
+          <w:rFonts w:ascii="Arial" w:hAnsi="Arial" w:cs="Arial"/>
+        </w:rPr>
+        <w:t>/</w:t>
+      </w:r>
+      <w:proofErr w:type="spellStart"/>
+      <w:r>
+        <w:rPr>
+          <w:rFonts w:ascii="Arial" w:hAnsi="Arial" w:cs="Arial"/>
+        </w:rPr>
+        <w:t>register</w:t>
+      </w:r>
+      <w:proofErr w:type="spellEnd"/>
+      <w:r>
+        <w:rPr>
+          <w:rFonts w:ascii="Arial" w:hAnsi="Arial" w:cs="Arial"/>
+        </w:rPr>
+        <w:t xml:space="preserve"> en http://localhost:5173. Avances: Proxy de Vite configurado para redirigir a </w:t>
+      </w:r>
+      <w:proofErr w:type="spellStart"/>
+      <w:r>
+        <w:rPr>
+          <w:rFonts w:ascii="Arial" w:hAnsi="Arial" w:cs="Arial"/>
+        </w:rPr>
+        <w:t>backend</w:t>
+      </w:r>
+      <w:proofErr w:type="spellEnd"/>
+      <w:r>
+        <w:rPr>
+          <w:rFonts w:ascii="Arial" w:hAnsi="Arial" w:cs="Arial"/>
+        </w:rPr>
+        <w:t xml:space="preserve"> en puerto 8001. Componentes como </w:t>
+      </w:r>
+      <w:proofErr w:type="spellStart"/>
+      <w:r>
+        <w:rPr>
+          <w:rFonts w:ascii="Arial" w:hAnsi="Arial" w:cs="Arial"/>
+        </w:rPr>
+        <w:t>LoginForm.jsx</w:t>
+      </w:r>
+      <w:proofErr w:type="spellEnd"/>
+      <w:r>
+        <w:rPr>
+          <w:rFonts w:ascii="Arial" w:hAnsi="Arial" w:cs="Arial"/>
+        </w:rPr>
+        <w:t xml:space="preserve"> y </w:t>
+      </w:r>
+      <w:proofErr w:type="spellStart"/>
+      <w:r>
+        <w:rPr>
+          <w:rFonts w:ascii="Arial" w:hAnsi="Arial" w:cs="Arial"/>
+        </w:rPr>
+        <w:t>Dashboard.jsx</w:t>
+      </w:r>
+      <w:proofErr w:type="spellEnd"/>
+      <w:r>
+        <w:rPr>
+          <w:rFonts w:ascii="Arial" w:hAnsi="Arial" w:cs="Arial"/>
+        </w:rPr>
+        <w:t xml:space="preserve"> cargan correctamente. Autenticación JWT probada: Registro de usuario de prueba y </w:t>
+      </w:r>
+      <w:proofErr w:type="spellStart"/>
+      <w:r>
+        <w:rPr>
+          <w:rFonts w:ascii="Arial" w:hAnsi="Arial" w:cs="Arial"/>
+        </w:rPr>
+        <w:t>login</w:t>
+      </w:r>
+      <w:proofErr w:type="spellEnd"/>
+      <w:r>
+        <w:rPr>
+          <w:rFonts w:ascii="Arial" w:hAnsi="Arial" w:cs="Arial"/>
+        </w:rPr>
+        <w:t xml:space="preserve"> exitoso. Problemas encontrados: Errores de CORS; resueltos agregando orígenes en </w:t>
+      </w:r>
+      <w:proofErr w:type="spellStart"/>
+      <w:r>
+        <w:rPr>
+          <w:rFonts w:ascii="Arial" w:hAnsi="Arial" w:cs="Arial"/>
+        </w:rPr>
+        <w:t>backend</w:t>
+      </w:r>
+      <w:proofErr w:type="spellEnd"/>
+      <w:r>
+        <w:rPr>
+          <w:rFonts w:ascii="Arial" w:hAnsi="Arial" w:cs="Arial"/>
+        </w:rPr>
+        <w:t xml:space="preserve"> .</w:t>
+      </w:r>
+      <w:proofErr w:type="spellStart"/>
+      <w:r>
+        <w:rPr>
+          <w:rFonts w:ascii="Arial" w:hAnsi="Arial" w:cs="Arial"/>
+        </w:rPr>
+        <w:t>env</w:t>
+      </w:r>
+      <w:proofErr w:type="spellEnd"/>
+      <w:r>
+        <w:rPr>
+          <w:rFonts w:ascii="Arial" w:hAnsi="Arial" w:cs="Arial"/>
+        </w:rPr>
+        <w:t xml:space="preserve">. Soluciones aplicadas: Usado </w:t>
+      </w:r>
+      <w:proofErr w:type="spellStart"/>
+      <w:r>
+        <w:rPr>
+          <w:rFonts w:ascii="Arial" w:hAnsi="Arial" w:cs="Arial"/>
+        </w:rPr>
+        <w:t>AuthContext.jsx</w:t>
+      </w:r>
+      <w:proofErr w:type="spellEnd"/>
+      <w:r>
+        <w:rPr>
+          <w:rFonts w:ascii="Arial" w:hAnsi="Arial" w:cs="Arial"/>
+        </w:rPr>
+        <w:t xml:space="preserve"> para manejar estado global de </w:t>
+      </w:r>
+      <w:proofErr w:type="spellStart"/>
+      <w:r>
+        <w:rPr>
+          <w:rFonts w:ascii="Arial" w:hAnsi="Arial" w:cs="Arial"/>
+        </w:rPr>
+        <w:t>auth</w:t>
+      </w:r>
+      <w:proofErr w:type="spellEnd"/>
+      <w:r>
+        <w:rPr>
+          <w:rFonts w:ascii="Arial" w:hAnsi="Arial" w:cs="Arial"/>
+        </w:rPr>
+        <w:t xml:space="preserve">. Pendientes: Integrar </w:t>
+      </w:r>
+      <w:proofErr w:type="spellStart"/>
+      <w:r>
+        <w:rPr>
+          <w:rFonts w:ascii="Arial" w:hAnsi="Arial" w:cs="Arial"/>
+        </w:rPr>
+        <w:t>ChatTutor.jsx</w:t>
+      </w:r>
+      <w:proofErr w:type="spellEnd"/>
+      <w:r>
+        <w:rPr>
+          <w:rFonts w:ascii="Arial" w:hAnsi="Arial" w:cs="Arial"/>
+        </w:rPr>
+        <w:t xml:space="preserve"> con </w:t>
+      </w:r>
+      <w:proofErr w:type="spellStart"/>
+      <w:r>
+        <w:rPr>
+          <w:rFonts w:ascii="Arial" w:hAnsi="Arial" w:cs="Arial"/>
+        </w:rPr>
+        <w:t>endpoint</w:t>
+      </w:r>
+      <w:proofErr w:type="spellEnd"/>
+      <w:r>
+        <w:rPr>
+          <w:rFonts w:ascii="Arial" w:hAnsi="Arial" w:cs="Arial"/>
+        </w:rPr>
+        <w:t xml:space="preserve"> /api/chat/local.</w:t>
+      </w:r>
+    </w:p>
+    <w:p>
+      <w:pPr>
+        <w:pStyle w:val="NormalWeb"/>
+        <w:rPr>
+          <w:rFonts w:ascii="Arial" w:hAnsi="Arial" w:cs="Arial"/>
+        </w:rPr>
+      </w:pPr>
+      <w:r>
+        <w:rPr>
+          <w:rFonts w:ascii="Arial" w:hAnsi="Arial" w:cs="Arial"/>
+        </w:rPr>
+        <w:t xml:space="preserve">-Se le hizo un </w:t>
+      </w:r>
+      <w:proofErr w:type="spellStart"/>
+      <w:r>
+        <w:rPr>
+          <w:rFonts w:ascii="Arial" w:hAnsi="Arial" w:cs="Arial"/>
+        </w:rPr>
+        <w:t>rework</w:t>
+      </w:r>
+      <w:proofErr w:type="spellEnd"/>
+      <w:r>
+        <w:rPr>
+          <w:rFonts w:ascii="Arial" w:hAnsi="Arial" w:cs="Arial"/>
+        </w:rPr>
+        <w:t xml:space="preserve"> nuevo a la interfaz cambiando un poco lo que el usuario final vera en la página. Ahora ya no aparecen las opciones de IA que puedes utilizar que antes aparecían como </w:t>
+      </w:r>
+      <w:proofErr w:type="spellStart"/>
+      <w:r>
+        <w:rPr>
+          <w:rFonts w:ascii="Arial" w:hAnsi="Arial" w:cs="Arial"/>
+        </w:rPr>
+        <w:t>ChatGPT</w:t>
+      </w:r>
+      <w:proofErr w:type="spellEnd"/>
+      <w:r>
+        <w:rPr>
+          <w:rFonts w:ascii="Arial" w:hAnsi="Arial" w:cs="Arial"/>
+        </w:rPr>
+        <w:t xml:space="preserve">, Claude, </w:t>
+      </w:r>
+      <w:proofErr w:type="spellStart"/>
+      <w:r>
+        <w:rPr>
+          <w:rFonts w:ascii="Arial" w:hAnsi="Arial" w:cs="Arial"/>
+        </w:rPr>
+        <w:t>Gemini</w:t>
+      </w:r>
+      <w:proofErr w:type="spellEnd"/>
+      <w:r>
+        <w:rPr>
+          <w:rFonts w:ascii="Arial" w:hAnsi="Arial" w:cs="Arial"/>
+        </w:rPr>
+        <w:t>, esto para enfocar mejor el trabajo del proyecto y no gastar tiempo importante en cosas que no son tan necesarias. También se le agrego un botón nuevo en el cual puedes cambiar a modo noche y todo se volverá oscuro, esto más que nada porque todo era muy blanco y ya el usuario puede decidir.</w:t>
+      </w:r>
+    </w:p>
+    <w:p>
+      <w:pPr>
+        <w:pStyle w:val="NormalWeb"/>
+        <w:rPr>
+          <w:rFonts w:ascii="Arial" w:hAnsi="Arial" w:cs="Arial"/>
+        </w:rPr>
+      </w:pPr>
+      <w:r>
+        <w:rPr>
+          <w:rFonts w:ascii="Arial" w:hAnsi="Arial" w:cs="Arial"/>
+        </w:rPr>
+        <w:t>-</w:t>
+      </w:r>
+      <w:r>
+        <w:rPr>
+          <w:rFonts w:ascii="Arial" w:hAnsi="Arial" w:cs="Arial"/>
+        </w:rPr>
+        <w:t xml:space="preserve">Se añadió un nuevo </w:t>
+      </w:r>
+      <w:proofErr w:type="spellStart"/>
+      <w:r>
+        <w:rPr>
+          <w:rFonts w:ascii="Arial" w:hAnsi="Arial" w:cs="Arial"/>
+        </w:rPr>
+        <w:t>frontend</w:t>
+      </w:r>
+      <w:proofErr w:type="spellEnd"/>
+      <w:r>
+        <w:rPr>
+          <w:rFonts w:ascii="Arial" w:hAnsi="Arial" w:cs="Arial"/>
+        </w:rPr>
+        <w:t xml:space="preserve"> cambiando algunos puntos de api, ahora necesitas tener un </w:t>
+      </w:r>
+      <w:proofErr w:type="spellStart"/>
+      <w:r>
+        <w:rPr>
+          <w:rFonts w:ascii="Arial" w:hAnsi="Arial" w:cs="Arial"/>
+        </w:rPr>
+        <w:t>minimo</w:t>
+      </w:r>
+      <w:proofErr w:type="spellEnd"/>
+      <w:r>
+        <w:rPr>
+          <w:rFonts w:ascii="Arial" w:hAnsi="Arial" w:cs="Arial"/>
+        </w:rPr>
+        <w:t xml:space="preserve"> de 10 lecciones aprobadas de 5 diferentes temas para pasar al siguiente dominio del lenguaje, requieres </w:t>
+      </w:r>
+      <w:proofErr w:type="spellStart"/>
+      <w:r>
+        <w:rPr>
+          <w:rFonts w:ascii="Arial" w:hAnsi="Arial" w:cs="Arial"/>
+        </w:rPr>
+        <w:t>tambien</w:t>
+      </w:r>
+      <w:proofErr w:type="spellEnd"/>
+      <w:r>
+        <w:rPr>
+          <w:rFonts w:ascii="Arial" w:hAnsi="Arial" w:cs="Arial"/>
+        </w:rPr>
+        <w:t xml:space="preserve"> pasar al menos 1 de cada tema para continuar con la siguiente. Se </w:t>
+      </w:r>
+      <w:proofErr w:type="spellStart"/>
+      <w:r>
+        <w:rPr>
+          <w:rFonts w:ascii="Arial" w:hAnsi="Arial" w:cs="Arial"/>
+        </w:rPr>
+        <w:t>añadio</w:t>
+      </w:r>
+      <w:proofErr w:type="spellEnd"/>
+      <w:r>
+        <w:rPr>
+          <w:rFonts w:ascii="Arial" w:hAnsi="Arial" w:cs="Arial"/>
+        </w:rPr>
+        <w:t xml:space="preserve"> la </w:t>
+      </w:r>
+      <w:proofErr w:type="spellStart"/>
+      <w:r>
+        <w:rPr>
+          <w:rFonts w:ascii="Arial" w:hAnsi="Arial" w:cs="Arial"/>
+        </w:rPr>
+        <w:t>libreria</w:t>
+      </w:r>
+      <w:proofErr w:type="spellEnd"/>
+      <w:r>
+        <w:rPr>
+          <w:rFonts w:ascii="Arial" w:hAnsi="Arial" w:cs="Arial"/>
+        </w:rPr>
+        <w:t xml:space="preserve"> de </w:t>
+      </w:r>
+      <w:proofErr w:type="spellStart"/>
+      <w:r>
+        <w:rPr>
+          <w:rFonts w:ascii="Arial" w:hAnsi="Arial" w:cs="Arial"/>
+        </w:rPr>
+        <w:t>python</w:t>
+      </w:r>
+      <w:proofErr w:type="spellEnd"/>
+      <w:r>
+        <w:rPr>
+          <w:rFonts w:ascii="Arial" w:hAnsi="Arial" w:cs="Arial"/>
+        </w:rPr>
+        <w:t xml:space="preserve"> </w:t>
+      </w:r>
+      <w:proofErr w:type="spellStart"/>
+      <w:r>
+        <w:rPr>
+          <w:rFonts w:ascii="Arial" w:hAnsi="Arial" w:cs="Arial"/>
+        </w:rPr>
+        <w:t>edge-tts</w:t>
+      </w:r>
+      <w:proofErr w:type="spellEnd"/>
+      <w:r>
+        <w:rPr>
+          <w:rFonts w:ascii="Arial" w:hAnsi="Arial" w:cs="Arial"/>
+        </w:rPr>
+        <w:t xml:space="preserve"> para emular voces en los audios y suenen menos </w:t>
+      </w:r>
+      <w:proofErr w:type="spellStart"/>
+      <w:r>
+        <w:rPr>
+          <w:rFonts w:ascii="Arial" w:hAnsi="Arial" w:cs="Arial"/>
+        </w:rPr>
+        <w:t>roboticas</w:t>
+      </w:r>
+      <w:proofErr w:type="spellEnd"/>
+      <w:r>
+        <w:rPr>
+          <w:rFonts w:ascii="Arial" w:hAnsi="Arial" w:cs="Arial"/>
+        </w:rPr>
+        <w:t xml:space="preserve"> en </w:t>
+      </w:r>
+      <w:proofErr w:type="spellStart"/>
+      <w:r>
+        <w:rPr>
+          <w:rFonts w:ascii="Arial" w:hAnsi="Arial" w:cs="Arial"/>
+        </w:rPr>
+        <w:t>mas</w:t>
+      </w:r>
+      <w:proofErr w:type="spellEnd"/>
+      <w:r>
+        <w:rPr>
+          <w:rFonts w:ascii="Arial" w:hAnsi="Arial" w:cs="Arial"/>
+        </w:rPr>
+        <w:t xml:space="preserve"> idiomas, los puntos api nuevos son POST /api/</w:t>
+      </w:r>
+      <w:proofErr w:type="spellStart"/>
+      <w:r>
+        <w:rPr>
+          <w:rFonts w:ascii="Arial" w:hAnsi="Arial" w:cs="Arial"/>
+        </w:rPr>
+        <w:t>tts</w:t>
+      </w:r>
+      <w:proofErr w:type="spellEnd"/>
+    </w:p>
+    <w:p>
+      <w:pPr>
+        <w:pStyle w:val="NormalWeb"/>
+        <w:rPr>
+          <w:rFonts w:ascii="Arial" w:hAnsi="Arial" w:cs="Arial"/>
+        </w:rPr>
+      </w:pPr>
+      <w:r>
+        <w:rPr>
+          <w:rFonts w:ascii="Arial" w:hAnsi="Arial" w:cs="Arial"/>
+        </w:rPr>
+        <w:lastRenderedPageBreak/>
+        <w:t>GET /api/progreso</w:t>
+      </w:r>
+    </w:p>
+    <w:p>
+      <w:pPr>
+        <w:pStyle w:val="NormalWeb"/>
+        <w:rPr>
+          <w:rFonts w:ascii="Arial" w:hAnsi="Arial" w:cs="Arial"/>
+        </w:rPr>
+      </w:pPr>
+      <w:r>
+        <w:rPr>
+          <w:rFonts w:ascii="Arial" w:hAnsi="Arial" w:cs="Arial"/>
+        </w:rPr>
+        <w:t>GET /api/progreso</w:t>
+      </w:r>
+      <w:proofErr w:type="gramStart"/>
+      <w:r>
+        <w:rPr>
+          <w:rFonts w:ascii="Arial" w:hAnsi="Arial" w:cs="Arial"/>
+        </w:rPr>
+        <w:t>/{</w:t>
+      </w:r>
+      <w:proofErr w:type="gramEnd"/>
+      <w:r>
+        <w:rPr>
+          <w:rFonts w:ascii="Arial" w:hAnsi="Arial" w:cs="Arial"/>
+        </w:rPr>
+        <w:t>idioma}</w:t>
+      </w:r>
+    </w:p>
+    <w:p>
+      <w:pPr>
+        <w:pStyle w:val="NormalWeb"/>
+        <w:rPr>
+          <w:rFonts w:ascii="Arial" w:hAnsi="Arial" w:cs="Arial"/>
+        </w:rPr>
+      </w:pPr>
+      <w:r>
+        <w:rPr>
+          <w:rFonts w:ascii="Arial" w:hAnsi="Arial" w:cs="Arial"/>
+        </w:rPr>
+        <w:t>GET /api/</w:t>
+      </w:r>
+      <w:proofErr w:type="spellStart"/>
+      <w:r>
+        <w:rPr>
+          <w:rFonts w:ascii="Arial" w:hAnsi="Arial" w:cs="Arial"/>
+        </w:rPr>
+        <w:t>leccion</w:t>
+      </w:r>
+      <w:proofErr w:type="spellEnd"/>
+      <w:r>
+        <w:rPr>
+          <w:rFonts w:ascii="Arial" w:hAnsi="Arial" w:cs="Arial"/>
+        </w:rPr>
+        <w:t>/lista</w:t>
+      </w:r>
+    </w:p>
+    <w:p>
+      <w:pPr>
+        <w:pStyle w:val="NormalWeb"/>
+        <w:rPr>
+          <w:rFonts w:ascii="Arial" w:hAnsi="Arial" w:cs="Arial"/>
+        </w:rPr>
+      </w:pPr>
+      <w:r>
+        <w:rPr>
+          <w:rFonts w:ascii="Arial" w:hAnsi="Arial" w:cs="Arial"/>
+        </w:rPr>
+        <w:t>POST /api/</w:t>
+      </w:r>
+      <w:proofErr w:type="spellStart"/>
+      <w:r>
+        <w:rPr>
+          <w:rFonts w:ascii="Arial" w:hAnsi="Arial" w:cs="Arial"/>
+        </w:rPr>
+        <w:t>leccion</w:t>
+      </w:r>
+      <w:proofErr w:type="spellEnd"/>
+      <w:proofErr w:type="gramStart"/>
+      <w:r>
+        <w:rPr>
+          <w:rFonts w:ascii="Arial" w:hAnsi="Arial" w:cs="Arial"/>
+        </w:rPr>
+        <w:t>/{</w:t>
+      </w:r>
+      <w:proofErr w:type="gramEnd"/>
+      <w:r>
+        <w:rPr>
+          <w:rFonts w:ascii="Arial" w:hAnsi="Arial" w:cs="Arial"/>
+        </w:rPr>
+        <w:t>id}/completar</w:t>
+      </w:r>
+    </w:p>
+    <w:p>
+      <w:pPr>
+        <w:pStyle w:val="NormalWeb"/>
+        <w:rPr>
+          <w:rFonts w:ascii="Arial" w:hAnsi="Arial" w:cs="Arial"/>
+        </w:rPr>
+      </w:pPr>
+      <w:r>
+        <w:rPr>
+          <w:rFonts w:ascii="Arial" w:hAnsi="Arial" w:cs="Arial"/>
+        </w:rPr>
+        <w:t>Con</w:t>
+      </w:r>
+      <w:r>
+        <w:rPr>
+          <w:rFonts w:ascii="Arial" w:hAnsi="Arial" w:cs="Arial"/>
+        </w:rPr>
+        <w:t xml:space="preserve"> ello se modificaron los </w:t>
+      </w:r>
+      <w:r>
+        <w:rPr>
+          <w:rFonts w:ascii="Arial" w:hAnsi="Arial" w:cs="Arial"/>
+        </w:rPr>
+        <w:t>parámetros</w:t>
+      </w:r>
+      <w:r>
+        <w:rPr>
+          <w:rFonts w:ascii="Arial" w:hAnsi="Arial" w:cs="Arial"/>
+        </w:rPr>
+        <w:t xml:space="preserve"> de entrada para</w:t>
+      </w:r>
+    </w:p>
+    <w:p>
+      <w:pPr>
+        <w:pStyle w:val="NormalWeb"/>
+        <w:rPr>
+          <w:rFonts w:ascii="Arial" w:hAnsi="Arial" w:cs="Arial"/>
+        </w:rPr>
+      </w:pPr>
+      <w:r>
+        <w:rPr>
+          <w:rFonts w:ascii="Arial" w:hAnsi="Arial" w:cs="Arial"/>
+        </w:rPr>
+        <w:t>POST /api/</w:t>
+      </w:r>
+      <w:proofErr w:type="spellStart"/>
+      <w:r>
+        <w:rPr>
+          <w:rFonts w:ascii="Arial" w:hAnsi="Arial" w:cs="Arial"/>
+        </w:rPr>
+        <w:t>leccion</w:t>
+      </w:r>
+      <w:proofErr w:type="spellEnd"/>
+      <w:r>
+        <w:rPr>
+          <w:rFonts w:ascii="Arial" w:hAnsi="Arial" w:cs="Arial"/>
+        </w:rPr>
+        <w:t>/generar</w:t>
+      </w:r>
+    </w:p>
+    <w:p>
+      <w:pPr>
+        <w:pStyle w:val="NormalWeb"/>
+        <w:rPr>
+          <w:rFonts w:ascii="Arial" w:hAnsi="Arial" w:cs="Arial"/>
+        </w:rPr>
+      </w:pPr>
+      <w:r>
+        <w:rPr>
+          <w:rFonts w:ascii="Arial" w:hAnsi="Arial" w:cs="Arial"/>
+        </w:rPr>
+        <w:t>Se</w:t>
+      </w:r>
+      <w:r>
+        <w:rPr>
+          <w:rFonts w:ascii="Arial" w:hAnsi="Arial" w:cs="Arial"/>
+        </w:rPr>
+        <w:t xml:space="preserve"> </w:t>
+      </w:r>
+      <w:r>
+        <w:rPr>
+          <w:rFonts w:ascii="Arial" w:hAnsi="Arial" w:cs="Arial"/>
+        </w:rPr>
+        <w:t>modificó</w:t>
+      </w:r>
+      <w:r>
+        <w:rPr>
+          <w:rFonts w:ascii="Arial" w:hAnsi="Arial" w:cs="Arial"/>
+        </w:rPr>
+        <w:t xml:space="preserve"> el modelo </w:t>
+      </w:r>
+      <w:proofErr w:type="spellStart"/>
+      <w:r>
+        <w:rPr>
+          <w:rFonts w:ascii="Arial" w:hAnsi="Arial" w:cs="Arial"/>
+        </w:rPr>
+        <w:t>qwen</w:t>
+      </w:r>
+      <w:proofErr w:type="spellEnd"/>
+      <w:r>
+        <w:rPr>
+          <w:rFonts w:ascii="Arial" w:hAnsi="Arial" w:cs="Arial"/>
+        </w:rPr>
+        <w:t xml:space="preserve"> usado a qwen3:8b, en </w:t>
+      </w:r>
+      <w:r>
+        <w:rPr>
+          <w:rFonts w:ascii="Arial" w:hAnsi="Arial" w:cs="Arial"/>
+        </w:rPr>
+        <w:t>consideración</w:t>
+      </w:r>
+      <w:r>
+        <w:rPr>
+          <w:rFonts w:ascii="Arial" w:hAnsi="Arial" w:cs="Arial"/>
+        </w:rPr>
+        <w:t xml:space="preserve"> cambiarlo porque responde lento. Ahora las lecciones pueden ser exportadas al chat tutor para que te de un </w:t>
+      </w:r>
+      <w:r>
+        <w:rPr>
+          <w:rFonts w:ascii="Arial" w:hAnsi="Arial" w:cs="Arial"/>
+        </w:rPr>
+        <w:t>análisis</w:t>
+      </w:r>
+      <w:r>
+        <w:rPr>
+          <w:rFonts w:ascii="Arial" w:hAnsi="Arial" w:cs="Arial"/>
+        </w:rPr>
+        <w:t xml:space="preserve"> de estas mismas.</w:t>
+      </w:r>
+    </w:p>
+    <w:p>
+      <w:pPr>
+        <w:pStyle w:val="NormalWeb"/>
+        <w:rPr>
+          <w:rFonts w:ascii="Arial" w:hAnsi="Arial" w:cs="Arial"/>
+        </w:rPr>
+      </w:pPr>
+      <w:r>
+        <w:rPr>
+          <w:rFonts w:ascii="Arial" w:hAnsi="Arial" w:cs="Arial"/>
           <w:noProof/>
         </w:rPr>
         <w:drawing>
-          <wp:inline distT="0" distB="0" distL="0" distR="0">
+          <wp:inline distT="0" distB="0" distL="0" distR="0" wp14:anchorId="508F1B25" wp14:editId="1D114717">
             <wp:extent cx="5612130" cy="2633980"/>
             <wp:effectExtent l="0" t="0" r="7620" b="0"/>
             <wp:docPr id="2" name="Imagen 2"/>
@@ -1216,11 +1763,10 @@
           <w:rFonts w:ascii="Arial" w:hAnsi="Arial" w:cs="Arial"/>
           <w:noProof/>
         </w:rPr>
-        <w:lastRenderedPageBreak/>
         <w:drawing>
-          <wp:inline distT="0" distB="0" distL="0" distR="0">
-            <wp:extent cx="5612130" cy="2806065"/>
-            <wp:effectExtent l="0" t="0" r="7620" b="0"/>
+          <wp:inline distT="0" distB="0" distL="0" distR="0" wp14:anchorId="64B193F6" wp14:editId="0B8623E7">
+            <wp:extent cx="5234940" cy="2617470"/>
+            <wp:effectExtent l="0" t="0" r="3810" b="0"/>
             <wp:docPr id="3" name="Imagen 3"/>
             <wp:cNvGraphicFramePr>
               <a:graphicFrameLocks xmlns:a="http://schemas.openxmlformats.org/drawingml/2006/main" noChangeAspect="1"/>
@@ -1247,7 +1793,7 @@
                   <pic:spPr>
                     <a:xfrm>
                       <a:off x="0" y="0"/>
-                      <a:ext cx="5612130" cy="2806065"/>
+                      <a:ext cx="5234940" cy="2617470"/>
                     </a:xfrm>
                     <a:prstGeom prst="rect">
                       <a:avLst/>
@@ -1277,6 +1823,108 @@
           <w:sz w:val="32"/>
         </w:rPr>
       </w:pPr>
+      <w:r>
+        <w:rPr>
+          <w:rFonts w:ascii="Arial" w:hAnsi="Arial" w:cs="Arial"/>
+          <w:b/>
+          <w:noProof/>
+          <w:sz w:val="32"/>
+          <w:lang w:eastAsia="es-MX"/>
+        </w:rPr>
+        <w:drawing>
+          <wp:inline distT="0" distB="0" distL="0" distR="0">
+            <wp:extent cx="5612130" cy="2971165"/>
+            <wp:effectExtent l="0" t="0" r="7620" b="635"/>
+            <wp:docPr id="4" name="Imagen 4"/>
+            <wp:cNvGraphicFramePr>
+              <a:graphicFrameLocks xmlns:a="http://schemas.openxmlformats.org/drawingml/2006/main" noChangeAspect="1"/>
+            </wp:cNvGraphicFramePr>
+            <a:graphic xmlns:a="http://schemas.openxmlformats.org/drawingml/2006/main">
+              <a:graphicData uri="http://schemas.openxmlformats.org/drawingml/2006/picture">
+                <pic:pic xmlns:pic="http://schemas.openxmlformats.org/drawingml/2006/picture">
+                  <pic:nvPicPr>
+                    <pic:cNvPr id="4" name="WhatsApp Image 2026-03-11 at 9.59.42 PM.jpeg"/>
+                    <pic:cNvPicPr/>
+                  </pic:nvPicPr>
+                  <pic:blipFill>
+                    <a:blip r:embed="rId7" cstate="print">
+                      <a:extLst>
+                        <a:ext uri="{28A0092B-C50C-407E-A947-70E740481C1C}">
+                          <a14:useLocalDpi xmlns:a14="http://schemas.microsoft.com/office/drawing/2010/main" val="0"/>
+                        </a:ext>
+                      </a:extLst>
+                    </a:blip>
+                    <a:stretch>
+                      <a:fillRect/>
+                    </a:stretch>
+                  </pic:blipFill>
+                  <pic:spPr>
+                    <a:xfrm>
+                      <a:off x="0" y="0"/>
+                      <a:ext cx="5612130" cy="2971165"/>
+                    </a:xfrm>
+                    <a:prstGeom prst="rect">
+                      <a:avLst/>
+                    </a:prstGeom>
+                  </pic:spPr>
+                </pic:pic>
+              </a:graphicData>
+            </a:graphic>
+          </wp:inline>
+        </w:drawing>
+      </w:r>
+      <w:bookmarkStart w:id="0" w:name="_GoBack"/>
+      <w:bookmarkEnd w:id="0"/>
+      <w:r>
+        <w:rPr>
+          <w:rFonts w:ascii="Arial" w:hAnsi="Arial" w:cs="Arial"/>
+          <w:b/>
+          <w:noProof/>
+          <w:sz w:val="32"/>
+          <w:lang w:eastAsia="es-MX"/>
+        </w:rPr>
+        <w:drawing>
+          <wp:inline distT="0" distB="0" distL="0" distR="0">
+            <wp:extent cx="5612130" cy="1487170"/>
+            <wp:effectExtent l="0" t="0" r="7620" b="0"/>
+            <wp:docPr id="5" name="Imagen 5"/>
+            <wp:cNvGraphicFramePr>
+              <a:graphicFrameLocks xmlns:a="http://schemas.openxmlformats.org/drawingml/2006/main" noChangeAspect="1"/>
+            </wp:cNvGraphicFramePr>
+            <a:graphic xmlns:a="http://schemas.openxmlformats.org/drawingml/2006/main">
+              <a:graphicData uri="http://schemas.openxmlformats.org/drawingml/2006/picture">
+                <pic:pic xmlns:pic="http://schemas.openxmlformats.org/drawingml/2006/picture">
+                  <pic:nvPicPr>
+                    <pic:cNvPr id="5" name="WhatsApp Image 2026-03-11 at 9.59.51 PM.jpeg"/>
+                    <pic:cNvPicPr/>
+                  </pic:nvPicPr>
+                  <pic:blipFill>
+                    <a:blip r:embed="rId8" cstate="print">
+                      <a:extLst>
+                        <a:ext uri="{28A0092B-C50C-407E-A947-70E740481C1C}">
+                          <a14:useLocalDpi xmlns:a14="http://schemas.microsoft.com/office/drawing/2010/main" val="0"/>
+                        </a:ext>
+                      </a:extLst>
+                    </a:blip>
+                    <a:stretch>
+                      <a:fillRect/>
+                    </a:stretch>
+                  </pic:blipFill>
+                  <pic:spPr>
+                    <a:xfrm>
+                      <a:off x="0" y="0"/>
+                      <a:ext cx="5612130" cy="1487170"/>
+                    </a:xfrm>
+                    <a:prstGeom prst="rect">
+                      <a:avLst/>
+                    </a:prstGeom>
+                  </pic:spPr>
+                </pic:pic>
+              </a:graphicData>
+            </a:graphic>
+          </wp:inline>
+        </w:drawing>
+      </w:r>
     </w:p>
     <w:sectPr>
       <w:pgSz w:w="12240" w:h="15840"/>

</xml_diff>

<commit_message>
Se agregaron nuevas actualizaciones al Word
</commit_message>
<xml_diff>
--- a/Bitácora-PolyIA.docx
+++ b/Bitácora-PolyIA.docx
@@ -1577,25 +1577,7 @@
         <w:rPr>
           <w:rFonts w:ascii="Arial" w:hAnsi="Arial" w:cs="Arial"/>
         </w:rPr>
-        <w:t>Con</w:t>
-      </w:r>
-      <w:r>
-        <w:rPr>
-          <w:rFonts w:ascii="Arial" w:hAnsi="Arial" w:cs="Arial"/>
-        </w:rPr>
-        <w:t xml:space="preserve"> ello se modificaron los </w:t>
-      </w:r>
-      <w:r>
-        <w:rPr>
-          <w:rFonts w:ascii="Arial" w:hAnsi="Arial" w:cs="Arial"/>
-        </w:rPr>
-        <w:t>parámetros</w:t>
-      </w:r>
-      <w:r>
-        <w:rPr>
-          <w:rFonts w:ascii="Arial" w:hAnsi="Arial" w:cs="Arial"/>
-        </w:rPr>
-        <w:t xml:space="preserve"> de entrada para</w:t>
+        <w:t>Con ello se modificaron los parámetros de entrada para</w:t>
       </w:r>
     </w:p>
     <w:p>
@@ -1637,25 +1619,7 @@
         <w:rPr>
           <w:rFonts w:ascii="Arial" w:hAnsi="Arial" w:cs="Arial"/>
         </w:rPr>
-        <w:t>Se</w:t>
-      </w:r>
-      <w:r>
-        <w:rPr>
-          <w:rFonts w:ascii="Arial" w:hAnsi="Arial" w:cs="Arial"/>
-        </w:rPr>
-        <w:t xml:space="preserve"> </w:t>
-      </w:r>
-      <w:r>
-        <w:rPr>
-          <w:rFonts w:ascii="Arial" w:hAnsi="Arial" w:cs="Arial"/>
-        </w:rPr>
-        <w:t>modificó</w:t>
-      </w:r>
-      <w:r>
-        <w:rPr>
-          <w:rFonts w:ascii="Arial" w:hAnsi="Arial" w:cs="Arial"/>
-        </w:rPr>
-        <w:t xml:space="preserve"> el modelo </w:t>
+        <w:t xml:space="preserve">Se modificó el modelo </w:t>
       </w:r>
       <w:proofErr w:type="spellStart"/>
       <w:r>
@@ -1669,31 +1633,7 @@
         <w:rPr>
           <w:rFonts w:ascii="Arial" w:hAnsi="Arial" w:cs="Arial"/>
         </w:rPr>
-        <w:t xml:space="preserve"> usado a qwen3:8b, en </w:t>
-      </w:r>
-      <w:r>
-        <w:rPr>
-          <w:rFonts w:ascii="Arial" w:hAnsi="Arial" w:cs="Arial"/>
-        </w:rPr>
-        <w:t>consideración</w:t>
-      </w:r>
-      <w:r>
-        <w:rPr>
-          <w:rFonts w:ascii="Arial" w:hAnsi="Arial" w:cs="Arial"/>
-        </w:rPr>
-        <w:t xml:space="preserve"> cambiarlo porque responde lento. Ahora las lecciones pueden ser exportadas al chat tutor para que te de un </w:t>
-      </w:r>
-      <w:r>
-        <w:rPr>
-          <w:rFonts w:ascii="Arial" w:hAnsi="Arial" w:cs="Arial"/>
-        </w:rPr>
-        <w:t>análisis</w:t>
-      </w:r>
-      <w:r>
-        <w:rPr>
-          <w:rFonts w:ascii="Arial" w:hAnsi="Arial" w:cs="Arial"/>
-        </w:rPr>
-        <w:t xml:space="preserve"> de estas mismas.</w:t>
+        <w:t xml:space="preserve"> usado a qwen3:8b, en consideración cambiarlo porque responde lento. Ahora las lecciones pueden ser exportadas al chat tutor para que te de un análisis de estas mismas.</w:t>
       </w:r>
     </w:p>
     <w:p>
@@ -1873,8 +1813,6 @@
           </wp:inline>
         </w:drawing>
       </w:r>
-      <w:bookmarkStart w:id="0" w:name="_GoBack"/>
-      <w:bookmarkEnd w:id="0"/>
       <w:r>
         <w:rPr>
           <w:rFonts w:ascii="Arial" w:hAnsi="Arial" w:cs="Arial"/>
@@ -1925,6 +1863,1596 @@
           </wp:inline>
         </w:drawing>
       </w:r>
+    </w:p>
+    <w:p>
+      <w:pPr>
+        <w:rPr>
+          <w:rFonts w:ascii="Arial" w:hAnsi="Arial" w:cs="Arial"/>
+          <w:b/>
+          <w:sz w:val="32"/>
+        </w:rPr>
+      </w:pPr>
+    </w:p>
+    <w:p>
+      <w:pPr>
+        <w:spacing w:line="240" w:lineRule="auto"/>
+        <w:rPr>
+          <w:rFonts w:ascii="Arial" w:hAnsi="Arial" w:cs="Arial"/>
+          <w:sz w:val="24"/>
+        </w:rPr>
+      </w:pPr>
+      <w:r>
+        <w:rPr>
+          <w:rFonts w:ascii="Arial" w:hAnsi="Arial" w:cs="Arial"/>
+          <w:sz w:val="24"/>
+        </w:rPr>
+        <w:t>-</w:t>
+      </w:r>
+      <w:r>
+        <w:rPr>
+          <w:rFonts w:ascii="Arial" w:hAnsi="Arial" w:cs="Arial"/>
+          <w:sz w:val="24"/>
+        </w:rPr>
+        <w:t>Existía</w:t>
+      </w:r>
+      <w:r>
+        <w:rPr>
+          <w:rFonts w:ascii="Arial" w:hAnsi="Arial" w:cs="Arial"/>
+          <w:sz w:val="24"/>
+        </w:rPr>
+        <w:t xml:space="preserve"> un problema bastante grande cuando el sistema </w:t>
+      </w:r>
+      <w:r>
+        <w:rPr>
+          <w:rFonts w:ascii="Arial" w:hAnsi="Arial" w:cs="Arial"/>
+          <w:sz w:val="24"/>
+        </w:rPr>
+        <w:t>generaba</w:t>
+      </w:r>
+      <w:r>
+        <w:rPr>
+          <w:rFonts w:ascii="Arial" w:hAnsi="Arial" w:cs="Arial"/>
+          <w:sz w:val="24"/>
+        </w:rPr>
+        <w:t xml:space="preserve"> una </w:t>
+      </w:r>
+      <w:r>
+        <w:rPr>
+          <w:rFonts w:ascii="Arial" w:hAnsi="Arial" w:cs="Arial"/>
+          <w:sz w:val="24"/>
+        </w:rPr>
+        <w:t>lección</w:t>
+      </w:r>
+      <w:r>
+        <w:rPr>
+          <w:rFonts w:ascii="Arial" w:hAnsi="Arial" w:cs="Arial"/>
+          <w:sz w:val="24"/>
+        </w:rPr>
+        <w:t xml:space="preserve">, el audio no se </w:t>
+      </w:r>
+      <w:r>
+        <w:rPr>
+          <w:rFonts w:ascii="Arial" w:hAnsi="Arial" w:cs="Arial"/>
+          <w:sz w:val="24"/>
+        </w:rPr>
+        <w:t>generaba</w:t>
+      </w:r>
+      <w:r>
+        <w:rPr>
+          <w:rFonts w:ascii="Arial" w:hAnsi="Arial" w:cs="Arial"/>
+          <w:sz w:val="24"/>
+        </w:rPr>
+        <w:t xml:space="preserve"> correctamente, ahora esto se </w:t>
+      </w:r>
+      <w:r>
+        <w:rPr>
+          <w:rFonts w:ascii="Arial" w:hAnsi="Arial" w:cs="Arial"/>
+          <w:sz w:val="24"/>
+        </w:rPr>
+        <w:t>solucionó</w:t>
+      </w:r>
+      <w:r>
+        <w:rPr>
+          <w:rFonts w:ascii="Arial" w:hAnsi="Arial" w:cs="Arial"/>
+          <w:sz w:val="24"/>
+        </w:rPr>
+        <w:t xml:space="preserve"> haciendo lo siguiente:</w:t>
+      </w:r>
+    </w:p>
+    <w:p>
+      <w:pPr>
+        <w:spacing w:line="240" w:lineRule="auto"/>
+        <w:rPr>
+          <w:rFonts w:ascii="Arial" w:hAnsi="Arial" w:cs="Arial"/>
+          <w:sz w:val="24"/>
+        </w:rPr>
+      </w:pPr>
+      <w:r>
+        <w:rPr>
+          <w:rFonts w:ascii="Arial" w:hAnsi="Arial" w:cs="Arial"/>
+          <w:sz w:val="24"/>
+        </w:rPr>
+        <w:t>Tenía</w:t>
+      </w:r>
+      <w:r>
+        <w:rPr>
+          <w:rFonts w:ascii="Arial" w:hAnsi="Arial" w:cs="Arial"/>
+          <w:sz w:val="24"/>
+        </w:rPr>
+        <w:t xml:space="preserve"> un bug de conexión </w:t>
+      </w:r>
+      <w:proofErr w:type="spellStart"/>
+      <w:r>
+        <w:rPr>
+          <w:rFonts w:ascii="Arial" w:hAnsi="Arial" w:cs="Arial"/>
+          <w:sz w:val="24"/>
+        </w:rPr>
+        <w:t>WebSocket</w:t>
+      </w:r>
+      <w:proofErr w:type="spellEnd"/>
+      <w:r>
+        <w:rPr>
+          <w:rFonts w:ascii="Arial" w:hAnsi="Arial" w:cs="Arial"/>
+          <w:sz w:val="24"/>
+        </w:rPr>
+        <w:t xml:space="preserve"> con el servicio de Microsoft — todas las llamada</w:t>
+      </w:r>
+      <w:r>
+        <w:rPr>
+          <w:rFonts w:ascii="Arial" w:hAnsi="Arial" w:cs="Arial"/>
+          <w:sz w:val="24"/>
+        </w:rPr>
+        <w:t>s TTS fallaban silenciosamente.</w:t>
+      </w:r>
+    </w:p>
+    <w:p>
+      <w:pPr>
+        <w:spacing w:line="240" w:lineRule="auto"/>
+        <w:rPr>
+          <w:rFonts w:ascii="Arial" w:hAnsi="Arial" w:cs="Arial"/>
+          <w:sz w:val="24"/>
+        </w:rPr>
+      </w:pPr>
+      <w:r>
+        <w:rPr>
+          <w:rFonts w:ascii="Arial" w:hAnsi="Arial" w:cs="Arial"/>
+          <w:sz w:val="24"/>
+        </w:rPr>
+        <w:t>Cambios realizados:</w:t>
+      </w:r>
+    </w:p>
+    <w:p>
+      <w:pPr>
+        <w:spacing w:line="240" w:lineRule="auto"/>
+        <w:rPr>
+          <w:rFonts w:ascii="Arial" w:hAnsi="Arial" w:cs="Arial"/>
+          <w:sz w:val="24"/>
+        </w:rPr>
+      </w:pPr>
+      <w:r>
+        <w:rPr>
+          <w:rFonts w:ascii="Arial" w:hAnsi="Arial" w:cs="Arial"/>
+          <w:sz w:val="24"/>
+        </w:rPr>
+        <w:t xml:space="preserve">requirements.txt — </w:t>
+      </w:r>
+      <w:proofErr w:type="spellStart"/>
+      <w:r>
+        <w:rPr>
+          <w:rFonts w:ascii="Arial" w:hAnsi="Arial" w:cs="Arial"/>
+          <w:sz w:val="24"/>
+        </w:rPr>
+        <w:t>edge-tts</w:t>
+      </w:r>
+      <w:proofErr w:type="spellEnd"/>
+      <w:r>
+        <w:rPr>
+          <w:rFonts w:ascii="Arial" w:hAnsi="Arial" w:cs="Arial"/>
+          <w:sz w:val="24"/>
+        </w:rPr>
+        <w:t xml:space="preserve"> de 6.1.12 a &gt;=7.0.0 </w:t>
+      </w:r>
+    </w:p>
+    <w:p>
+      <w:pPr>
+        <w:spacing w:line="240" w:lineRule="auto"/>
+        <w:rPr>
+          <w:rFonts w:ascii="Arial" w:hAnsi="Arial" w:cs="Arial"/>
+          <w:sz w:val="24"/>
+        </w:rPr>
+      </w:pPr>
+      <w:proofErr w:type="spellStart"/>
+      <w:r>
+        <w:rPr>
+          <w:rFonts w:ascii="Arial" w:hAnsi="Arial" w:cs="Arial"/>
+          <w:sz w:val="24"/>
+        </w:rPr>
+        <w:t>LessonExercise.jsx</w:t>
+      </w:r>
+      <w:proofErr w:type="spellEnd"/>
+      <w:r>
+        <w:rPr>
+          <w:rFonts w:ascii="Arial" w:hAnsi="Arial" w:cs="Arial"/>
+          <w:sz w:val="24"/>
+        </w:rPr>
+        <w:t xml:space="preserve"> —Se </w:t>
+      </w:r>
+      <w:r>
+        <w:rPr>
+          <w:rFonts w:ascii="Arial" w:hAnsi="Arial" w:cs="Arial"/>
+          <w:sz w:val="24"/>
+        </w:rPr>
+        <w:t>reescribió</w:t>
+      </w:r>
+      <w:r>
+        <w:rPr>
+          <w:rFonts w:ascii="Arial" w:hAnsi="Arial" w:cs="Arial"/>
+          <w:sz w:val="24"/>
+        </w:rPr>
+        <w:t xml:space="preserve"> el componente </w:t>
+      </w:r>
+      <w:proofErr w:type="spellStart"/>
+      <w:r>
+        <w:rPr>
+          <w:rFonts w:ascii="Arial" w:hAnsi="Arial" w:cs="Arial"/>
+          <w:sz w:val="24"/>
+        </w:rPr>
+        <w:t>AudioButton</w:t>
+      </w:r>
+      <w:proofErr w:type="spellEnd"/>
+      <w:r>
+        <w:rPr>
+          <w:rFonts w:ascii="Arial" w:hAnsi="Arial" w:cs="Arial"/>
+          <w:sz w:val="24"/>
+        </w:rPr>
+        <w:t xml:space="preserve"> con manejo correcto de estado:</w:t>
+      </w:r>
+    </w:p>
+    <w:p>
+      <w:pPr>
+        <w:spacing w:line="240" w:lineRule="auto"/>
+        <w:rPr>
+          <w:rFonts w:ascii="Arial" w:hAnsi="Arial" w:cs="Arial"/>
+          <w:sz w:val="24"/>
+        </w:rPr>
+      </w:pPr>
+      <w:r>
+        <w:rPr>
+          <w:rFonts w:ascii="Arial" w:hAnsi="Arial" w:cs="Arial"/>
+          <w:sz w:val="24"/>
+        </w:rPr>
+        <w:t xml:space="preserve">Ahora usa </w:t>
+      </w:r>
+      <w:proofErr w:type="spellStart"/>
+      <w:r>
+        <w:rPr>
+          <w:rFonts w:ascii="Arial" w:hAnsi="Arial" w:cs="Arial"/>
+          <w:sz w:val="24"/>
+        </w:rPr>
+        <w:t>Promises</w:t>
+      </w:r>
+      <w:proofErr w:type="spellEnd"/>
+      <w:r>
+        <w:rPr>
+          <w:rFonts w:ascii="Arial" w:hAnsi="Arial" w:cs="Arial"/>
+          <w:sz w:val="24"/>
+        </w:rPr>
+        <w:t xml:space="preserve"> para rastrear el ciclo completo del audio (</w:t>
+      </w:r>
+      <w:proofErr w:type="spellStart"/>
+      <w:r>
+        <w:rPr>
+          <w:rFonts w:ascii="Arial" w:hAnsi="Arial" w:cs="Arial"/>
+          <w:sz w:val="24"/>
+        </w:rPr>
+        <w:t>loading</w:t>
+      </w:r>
+      <w:proofErr w:type="spellEnd"/>
+      <w:r>
+        <w:rPr>
+          <w:rFonts w:ascii="Arial" w:hAnsi="Arial" w:cs="Arial"/>
+          <w:sz w:val="24"/>
+        </w:rPr>
+        <w:t xml:space="preserve"> → </w:t>
+      </w:r>
+      <w:proofErr w:type="spellStart"/>
+      <w:r>
+        <w:rPr>
+          <w:rFonts w:ascii="Arial" w:hAnsi="Arial" w:cs="Arial"/>
+          <w:sz w:val="24"/>
+        </w:rPr>
+        <w:t>playing</w:t>
+      </w:r>
+      <w:proofErr w:type="spellEnd"/>
+      <w:r>
+        <w:rPr>
+          <w:rFonts w:ascii="Arial" w:hAnsi="Arial" w:cs="Arial"/>
+          <w:sz w:val="24"/>
+        </w:rPr>
+        <w:t xml:space="preserve"> → idle)</w:t>
+      </w:r>
+    </w:p>
+    <w:p>
+      <w:pPr>
+        <w:spacing w:line="240" w:lineRule="auto"/>
+        <w:rPr>
+          <w:rFonts w:ascii="Arial" w:hAnsi="Arial" w:cs="Arial"/>
+          <w:sz w:val="24"/>
+        </w:rPr>
+      </w:pPr>
+      <w:r>
+        <w:rPr>
+          <w:rFonts w:ascii="Arial" w:hAnsi="Arial" w:cs="Arial"/>
+          <w:sz w:val="24"/>
+        </w:rPr>
+        <w:t xml:space="preserve">Intenta primero el audio pre-generado, si falla hace </w:t>
+      </w:r>
+      <w:proofErr w:type="spellStart"/>
+      <w:r>
+        <w:rPr>
+          <w:rFonts w:ascii="Arial" w:hAnsi="Arial" w:cs="Arial"/>
+          <w:sz w:val="24"/>
+        </w:rPr>
+        <w:t>fallback</w:t>
+      </w:r>
+      <w:proofErr w:type="spellEnd"/>
+      <w:r>
+        <w:rPr>
+          <w:rFonts w:ascii="Arial" w:hAnsi="Arial" w:cs="Arial"/>
+          <w:sz w:val="24"/>
+        </w:rPr>
+        <w:t xml:space="preserve"> a /api/</w:t>
+      </w:r>
+      <w:proofErr w:type="spellStart"/>
+      <w:r>
+        <w:rPr>
+          <w:rFonts w:ascii="Arial" w:hAnsi="Arial" w:cs="Arial"/>
+          <w:sz w:val="24"/>
+        </w:rPr>
+        <w:t>tts</w:t>
+      </w:r>
+      <w:proofErr w:type="spellEnd"/>
+      <w:r>
+        <w:rPr>
+          <w:rFonts w:ascii="Arial" w:hAnsi="Arial" w:cs="Arial"/>
+          <w:sz w:val="24"/>
+        </w:rPr>
+        <w:t xml:space="preserve"> bajo demanda</w:t>
+      </w:r>
+    </w:p>
+    <w:p>
+      <w:pPr>
+        <w:spacing w:line="240" w:lineRule="auto"/>
+        <w:rPr>
+          <w:rFonts w:ascii="Arial" w:hAnsi="Arial" w:cs="Arial"/>
+          <w:sz w:val="24"/>
+        </w:rPr>
+      </w:pPr>
+      <w:r>
+        <w:rPr>
+          <w:rFonts w:ascii="Arial" w:hAnsi="Arial" w:cs="Arial"/>
+          <w:sz w:val="24"/>
+        </w:rPr>
+        <w:lastRenderedPageBreak/>
+        <w:t>Limpieza co</w:t>
+      </w:r>
+      <w:r>
+        <w:rPr>
+          <w:rFonts w:ascii="Arial" w:hAnsi="Arial" w:cs="Arial"/>
+          <w:sz w:val="24"/>
+        </w:rPr>
+        <w:t>rrecta de recursos al desmontar</w:t>
+      </w:r>
+      <w:r>
+        <w:rPr>
+          <w:rFonts w:ascii="Arial" w:hAnsi="Arial" w:cs="Arial"/>
+          <w:sz w:val="24"/>
+        </w:rPr>
+        <w:t xml:space="preserve">. El </w:t>
+      </w:r>
+      <w:proofErr w:type="spellStart"/>
+      <w:r>
+        <w:rPr>
+          <w:rFonts w:ascii="Arial" w:hAnsi="Arial" w:cs="Arial"/>
+          <w:sz w:val="24"/>
+        </w:rPr>
+        <w:t>endpoint</w:t>
+      </w:r>
+      <w:proofErr w:type="spellEnd"/>
+      <w:r>
+        <w:rPr>
+          <w:rFonts w:ascii="Arial" w:hAnsi="Arial" w:cs="Arial"/>
+          <w:sz w:val="24"/>
+        </w:rPr>
+        <w:t xml:space="preserve"> /api/</w:t>
+      </w:r>
+      <w:proofErr w:type="spellStart"/>
+      <w:r>
+        <w:rPr>
+          <w:rFonts w:ascii="Arial" w:hAnsi="Arial" w:cs="Arial"/>
+          <w:sz w:val="24"/>
+        </w:rPr>
+        <w:t>tts</w:t>
+      </w:r>
+      <w:proofErr w:type="spellEnd"/>
+      <w:r>
+        <w:rPr>
+          <w:rFonts w:ascii="Arial" w:hAnsi="Arial" w:cs="Arial"/>
+          <w:sz w:val="24"/>
+        </w:rPr>
+        <w:t xml:space="preserve"> está funcionando</w:t>
+      </w:r>
+      <w:r>
+        <w:rPr>
+          <w:rFonts w:ascii="Arial" w:hAnsi="Arial" w:cs="Arial"/>
+          <w:sz w:val="24"/>
+        </w:rPr>
+        <w:t>.</w:t>
+      </w:r>
+    </w:p>
+    <w:p>
+      <w:pPr>
+        <w:spacing w:line="240" w:lineRule="auto"/>
+        <w:rPr>
+          <w:rFonts w:ascii="Arial" w:hAnsi="Arial" w:cs="Arial"/>
+          <w:sz w:val="24"/>
+        </w:rPr>
+      </w:pPr>
+      <w:r>
+        <w:rPr>
+          <w:rFonts w:ascii="Arial" w:hAnsi="Arial" w:cs="Arial"/>
+          <w:noProof/>
+          <w:sz w:val="24"/>
+          <w:lang w:eastAsia="es-MX"/>
+        </w:rPr>
+        <w:drawing>
+          <wp:inline distT="0" distB="0" distL="0" distR="0">
+            <wp:extent cx="5612130" cy="2840990"/>
+            <wp:effectExtent l="0" t="0" r="7620" b="0"/>
+            <wp:docPr id="6" name="Imagen 6"/>
+            <wp:cNvGraphicFramePr>
+              <a:graphicFrameLocks xmlns:a="http://schemas.openxmlformats.org/drawingml/2006/main" noChangeAspect="1"/>
+            </wp:cNvGraphicFramePr>
+            <a:graphic xmlns:a="http://schemas.openxmlformats.org/drawingml/2006/main">
+              <a:graphicData uri="http://schemas.openxmlformats.org/drawingml/2006/picture">
+                <pic:pic xmlns:pic="http://schemas.openxmlformats.org/drawingml/2006/picture">
+                  <pic:nvPicPr>
+                    <pic:cNvPr id="6" name="WhatsApp Image 2026-03-25 at 8.03.07 PM.jpeg"/>
+                    <pic:cNvPicPr/>
+                  </pic:nvPicPr>
+                  <pic:blipFill>
+                    <a:blip r:embed="rId9" cstate="print">
+                      <a:extLst>
+                        <a:ext uri="{28A0092B-C50C-407E-A947-70E740481C1C}">
+                          <a14:useLocalDpi xmlns:a14="http://schemas.microsoft.com/office/drawing/2010/main" val="0"/>
+                        </a:ext>
+                      </a:extLst>
+                    </a:blip>
+                    <a:stretch>
+                      <a:fillRect/>
+                    </a:stretch>
+                  </pic:blipFill>
+                  <pic:spPr>
+                    <a:xfrm>
+                      <a:off x="0" y="0"/>
+                      <a:ext cx="5612130" cy="2840990"/>
+                    </a:xfrm>
+                    <a:prstGeom prst="rect">
+                      <a:avLst/>
+                    </a:prstGeom>
+                  </pic:spPr>
+                </pic:pic>
+              </a:graphicData>
+            </a:graphic>
+          </wp:inline>
+        </w:drawing>
+      </w:r>
+    </w:p>
+    <w:p>
+      <w:pPr>
+        <w:spacing w:line="240" w:lineRule="auto"/>
+        <w:rPr>
+          <w:rFonts w:ascii="Arial" w:hAnsi="Arial" w:cs="Arial"/>
+          <w:sz w:val="24"/>
+        </w:rPr>
+      </w:pPr>
+      <w:r>
+        <w:rPr>
+          <w:rFonts w:ascii="Arial" w:hAnsi="Arial" w:cs="Arial"/>
+          <w:sz w:val="24"/>
+        </w:rPr>
+        <w:t>*</w:t>
+      </w:r>
+      <w:r>
+        <w:rPr>
+          <w:rFonts w:ascii="Arial" w:hAnsi="Arial" w:cs="Arial"/>
+          <w:sz w:val="24"/>
+        </w:rPr>
+        <w:t xml:space="preserve">El </w:t>
+      </w:r>
+      <w:proofErr w:type="spellStart"/>
+      <w:r>
+        <w:rPr>
+          <w:rFonts w:ascii="Arial" w:hAnsi="Arial" w:cs="Arial"/>
+          <w:sz w:val="24"/>
+        </w:rPr>
+        <w:t>frontend</w:t>
+      </w:r>
+      <w:proofErr w:type="spellEnd"/>
+      <w:r>
+        <w:rPr>
+          <w:rFonts w:ascii="Arial" w:hAnsi="Arial" w:cs="Arial"/>
+          <w:sz w:val="24"/>
+        </w:rPr>
+        <w:t xml:space="preserve"> ya debería haber recargado automáticamente (</w:t>
+      </w:r>
+      <w:proofErr w:type="spellStart"/>
+      <w:r>
+        <w:rPr>
+          <w:rFonts w:ascii="Arial" w:hAnsi="Arial" w:cs="Arial"/>
+          <w:sz w:val="24"/>
+        </w:rPr>
+        <w:t>hot</w:t>
+      </w:r>
+      <w:proofErr w:type="spellEnd"/>
+      <w:r>
+        <w:rPr>
+          <w:rFonts w:ascii="Arial" w:hAnsi="Arial" w:cs="Arial"/>
+          <w:sz w:val="24"/>
+        </w:rPr>
+        <w:t xml:space="preserve"> </w:t>
+      </w:r>
+      <w:proofErr w:type="spellStart"/>
+      <w:r>
+        <w:rPr>
+          <w:rFonts w:ascii="Arial" w:hAnsi="Arial" w:cs="Arial"/>
+          <w:sz w:val="24"/>
+        </w:rPr>
+        <w:t>reload</w:t>
+      </w:r>
+      <w:proofErr w:type="spellEnd"/>
+      <w:r>
+        <w:rPr>
+          <w:rFonts w:ascii="Arial" w:hAnsi="Arial" w:cs="Arial"/>
+          <w:sz w:val="24"/>
+        </w:rPr>
+        <w:t>)</w:t>
+      </w:r>
+    </w:p>
+    <w:p>
+      <w:pPr>
+        <w:spacing w:line="240" w:lineRule="auto"/>
+        <w:rPr>
+          <w:rFonts w:ascii="Arial" w:hAnsi="Arial" w:cs="Arial"/>
+          <w:sz w:val="24"/>
+        </w:rPr>
+      </w:pPr>
+      <w:r>
+        <w:rPr>
+          <w:rFonts w:ascii="Arial" w:hAnsi="Arial" w:cs="Arial"/>
+          <w:sz w:val="24"/>
+        </w:rPr>
+        <w:t>Genera una lección de Comprensión Auditiva y haz clic en "Escuchar audio"</w:t>
+      </w:r>
+    </w:p>
+    <w:p>
+      <w:pPr>
+        <w:spacing w:line="240" w:lineRule="auto"/>
+        <w:rPr>
+          <w:rFonts w:ascii="Arial" w:hAnsi="Arial" w:cs="Arial"/>
+          <w:sz w:val="24"/>
+        </w:rPr>
+      </w:pPr>
+      <w:r>
+        <w:rPr>
+          <w:rFonts w:ascii="Arial" w:hAnsi="Arial" w:cs="Arial"/>
+          <w:sz w:val="24"/>
+        </w:rPr>
+        <w:t>Debería mostrar "Cargando…" → "Reproduciendo…" → se escucha la voz → vuelve a "Escuchar audio</w:t>
+      </w:r>
+      <w:r>
+        <w:rPr>
+          <w:rFonts w:ascii="Arial" w:hAnsi="Arial" w:cs="Arial"/>
+          <w:sz w:val="24"/>
+        </w:rPr>
+        <w:t>.</w:t>
+      </w:r>
+    </w:p>
+    <w:p>
+      <w:pPr>
+        <w:spacing w:line="240" w:lineRule="auto"/>
+        <w:rPr>
+          <w:rFonts w:ascii="Arial" w:hAnsi="Arial" w:cs="Arial"/>
+          <w:sz w:val="24"/>
+        </w:rPr>
+      </w:pPr>
+      <w:r>
+        <w:rPr>
+          <w:rFonts w:ascii="Arial" w:hAnsi="Arial" w:cs="Arial"/>
+          <w:noProof/>
+          <w:sz w:val="24"/>
+          <w:lang w:eastAsia="es-MX"/>
+        </w:rPr>
+        <w:drawing>
+          <wp:inline distT="0" distB="0" distL="0" distR="0">
+            <wp:extent cx="5612130" cy="2662555"/>
+            <wp:effectExtent l="0" t="0" r="7620" b="4445"/>
+            <wp:docPr id="7" name="Imagen 7"/>
+            <wp:cNvGraphicFramePr>
+              <a:graphicFrameLocks xmlns:a="http://schemas.openxmlformats.org/drawingml/2006/main" noChangeAspect="1"/>
+            </wp:cNvGraphicFramePr>
+            <a:graphic xmlns:a="http://schemas.openxmlformats.org/drawingml/2006/main">
+              <a:graphicData uri="http://schemas.openxmlformats.org/drawingml/2006/picture">
+                <pic:pic xmlns:pic="http://schemas.openxmlformats.org/drawingml/2006/picture">
+                  <pic:nvPicPr>
+                    <pic:cNvPr id="7" name="WhatsApp Image 2026-03-25 at 8.15.25 PM.jpeg"/>
+                    <pic:cNvPicPr/>
+                  </pic:nvPicPr>
+                  <pic:blipFill>
+                    <a:blip r:embed="rId10" cstate="print">
+                      <a:extLst>
+                        <a:ext uri="{28A0092B-C50C-407E-A947-70E740481C1C}">
+                          <a14:useLocalDpi xmlns:a14="http://schemas.microsoft.com/office/drawing/2010/main" val="0"/>
+                        </a:ext>
+                      </a:extLst>
+                    </a:blip>
+                    <a:stretch>
+                      <a:fillRect/>
+                    </a:stretch>
+                  </pic:blipFill>
+                  <pic:spPr>
+                    <a:xfrm>
+                      <a:off x="0" y="0"/>
+                      <a:ext cx="5612130" cy="2662555"/>
+                    </a:xfrm>
+                    <a:prstGeom prst="rect">
+                      <a:avLst/>
+                    </a:prstGeom>
+                  </pic:spPr>
+                </pic:pic>
+              </a:graphicData>
+            </a:graphic>
+          </wp:inline>
+        </w:drawing>
+      </w:r>
+    </w:p>
+    <w:p>
+      <w:pPr>
+        <w:spacing w:line="240" w:lineRule="auto"/>
+        <w:rPr>
+          <w:rFonts w:ascii="Arial" w:hAnsi="Arial" w:cs="Arial"/>
+          <w:sz w:val="24"/>
+        </w:rPr>
+      </w:pPr>
+      <w:r>
+        <w:rPr>
+          <w:rFonts w:ascii="Arial" w:hAnsi="Arial" w:cs="Arial"/>
+          <w:sz w:val="24"/>
+        </w:rPr>
+        <w:t xml:space="preserve">*Ahora puedes adjuntar las lecciones que vayas realizando o que vayas a realizar para pedirle al </w:t>
+      </w:r>
+      <w:proofErr w:type="spellStart"/>
+      <w:r>
+        <w:rPr>
+          <w:rFonts w:ascii="Arial" w:hAnsi="Arial" w:cs="Arial"/>
+          <w:sz w:val="24"/>
+        </w:rPr>
+        <w:t>chatbot</w:t>
+      </w:r>
+      <w:proofErr w:type="spellEnd"/>
+      <w:r>
+        <w:rPr>
+          <w:rFonts w:ascii="Arial" w:hAnsi="Arial" w:cs="Arial"/>
+          <w:sz w:val="24"/>
+        </w:rPr>
+        <w:t xml:space="preserve"> ayuda para resolverlo o que te diga que es lo que puedes hacer para mejorar.</w:t>
+      </w:r>
+    </w:p>
+    <w:p>
+      <w:pPr>
+        <w:spacing w:line="240" w:lineRule="auto"/>
+        <w:rPr>
+          <w:rFonts w:ascii="Arial" w:hAnsi="Arial" w:cs="Arial"/>
+          <w:sz w:val="24"/>
+        </w:rPr>
+      </w:pPr>
+      <w:r>
+        <w:rPr>
+          <w:rFonts w:ascii="Arial" w:hAnsi="Arial" w:cs="Arial"/>
+          <w:noProof/>
+          <w:sz w:val="24"/>
+          <w:lang w:eastAsia="es-MX"/>
+        </w:rPr>
+        <w:lastRenderedPageBreak/>
+        <w:drawing>
+          <wp:inline distT="0" distB="0" distL="0" distR="0">
+            <wp:extent cx="5612130" cy="2564130"/>
+            <wp:effectExtent l="0" t="0" r="7620" b="7620"/>
+            <wp:docPr id="8" name="Imagen 8"/>
+            <wp:cNvGraphicFramePr>
+              <a:graphicFrameLocks xmlns:a="http://schemas.openxmlformats.org/drawingml/2006/main" noChangeAspect="1"/>
+            </wp:cNvGraphicFramePr>
+            <a:graphic xmlns:a="http://schemas.openxmlformats.org/drawingml/2006/main">
+              <a:graphicData uri="http://schemas.openxmlformats.org/drawingml/2006/picture">
+                <pic:pic xmlns:pic="http://schemas.openxmlformats.org/drawingml/2006/picture">
+                  <pic:nvPicPr>
+                    <pic:cNvPr id="8" name="WhatsApp Image 2026-03-25 at 8.27.56 PM.jpeg"/>
+                    <pic:cNvPicPr/>
+                  </pic:nvPicPr>
+                  <pic:blipFill>
+                    <a:blip r:embed="rId11" cstate="print">
+                      <a:extLst>
+                        <a:ext uri="{28A0092B-C50C-407E-A947-70E740481C1C}">
+                          <a14:useLocalDpi xmlns:a14="http://schemas.microsoft.com/office/drawing/2010/main" val="0"/>
+                        </a:ext>
+                      </a:extLst>
+                    </a:blip>
+                    <a:stretch>
+                      <a:fillRect/>
+                    </a:stretch>
+                  </pic:blipFill>
+                  <pic:spPr>
+                    <a:xfrm>
+                      <a:off x="0" y="0"/>
+                      <a:ext cx="5612130" cy="2564130"/>
+                    </a:xfrm>
+                    <a:prstGeom prst="rect">
+                      <a:avLst/>
+                    </a:prstGeom>
+                  </pic:spPr>
+                </pic:pic>
+              </a:graphicData>
+            </a:graphic>
+          </wp:inline>
+        </w:drawing>
+      </w:r>
+    </w:p>
+    <w:p>
+      <w:pPr>
+        <w:spacing w:line="240" w:lineRule="auto"/>
+        <w:rPr>
+          <w:rFonts w:ascii="Arial" w:hAnsi="Arial" w:cs="Arial"/>
+          <w:sz w:val="24"/>
+        </w:rPr>
+      </w:pPr>
+      <w:r>
+        <w:rPr>
+          <w:rFonts w:ascii="Arial" w:hAnsi="Arial" w:cs="Arial"/>
+          <w:sz w:val="24"/>
+        </w:rPr>
+        <w:t>*</w:t>
+      </w:r>
+      <w:proofErr w:type="spellStart"/>
+      <w:r>
+        <w:rPr>
+          <w:rFonts w:ascii="Arial" w:hAnsi="Arial" w:cs="Arial"/>
+          <w:sz w:val="24"/>
+        </w:rPr>
+        <w:t>Backend</w:t>
+      </w:r>
+      <w:proofErr w:type="spellEnd"/>
+      <w:r>
+        <w:rPr>
+          <w:rFonts w:ascii="Arial" w:hAnsi="Arial" w:cs="Arial"/>
+          <w:sz w:val="24"/>
+        </w:rPr>
+        <w:t>:</w:t>
+      </w:r>
+    </w:p>
+    <w:p>
+      <w:pPr>
+        <w:spacing w:line="240" w:lineRule="auto"/>
+        <w:rPr>
+          <w:rFonts w:ascii="Arial" w:hAnsi="Arial" w:cs="Arial"/>
+          <w:sz w:val="24"/>
+        </w:rPr>
+      </w:pPr>
+      <w:r>
+        <w:rPr>
+          <w:rFonts w:ascii="Arial" w:hAnsi="Arial" w:cs="Arial"/>
+          <w:sz w:val="24"/>
+        </w:rPr>
+        <w:t xml:space="preserve">models.py — Nueva columna </w:t>
+      </w:r>
+      <w:r>
+        <w:rPr>
+          <w:rFonts w:ascii="Arial" w:hAnsi="Arial" w:cs="Arial"/>
+          <w:sz w:val="24"/>
+        </w:rPr>
+        <w:t>foto perfil</w:t>
+      </w:r>
+      <w:r>
+        <w:rPr>
+          <w:rFonts w:ascii="Arial" w:hAnsi="Arial" w:cs="Arial"/>
+          <w:sz w:val="24"/>
+        </w:rPr>
+        <w:t xml:space="preserve"> en la tabla usuarios</w:t>
+      </w:r>
+    </w:p>
+    <w:p>
+      <w:pPr>
+        <w:spacing w:line="240" w:lineRule="auto"/>
+        <w:rPr>
+          <w:rFonts w:ascii="Arial" w:hAnsi="Arial" w:cs="Arial"/>
+          <w:sz w:val="24"/>
+        </w:rPr>
+      </w:pPr>
+      <w:r>
+        <w:rPr>
+          <w:rFonts w:ascii="Arial" w:hAnsi="Arial" w:cs="Arial"/>
+          <w:sz w:val="24"/>
+        </w:rPr>
+        <w:t xml:space="preserve">schemas.py — </w:t>
+      </w:r>
+      <w:proofErr w:type="spellStart"/>
+      <w:r>
+        <w:rPr>
+          <w:rFonts w:ascii="Arial" w:hAnsi="Arial" w:cs="Arial"/>
+          <w:sz w:val="24"/>
+        </w:rPr>
+        <w:t>Schemas</w:t>
+      </w:r>
+      <w:proofErr w:type="spellEnd"/>
+      <w:r>
+        <w:rPr>
+          <w:rFonts w:ascii="Arial" w:hAnsi="Arial" w:cs="Arial"/>
+          <w:sz w:val="24"/>
+        </w:rPr>
+        <w:t xml:space="preserve"> </w:t>
+      </w:r>
+      <w:proofErr w:type="spellStart"/>
+      <w:r>
+        <w:rPr>
+          <w:rFonts w:ascii="Arial" w:hAnsi="Arial" w:cs="Arial"/>
+          <w:sz w:val="24"/>
+        </w:rPr>
+        <w:t>UpdateProfileRequest</w:t>
+      </w:r>
+      <w:proofErr w:type="spellEnd"/>
+      <w:r>
+        <w:rPr>
+          <w:rFonts w:ascii="Arial" w:hAnsi="Arial" w:cs="Arial"/>
+          <w:sz w:val="24"/>
+        </w:rPr>
+        <w:t xml:space="preserve"> y </w:t>
+      </w:r>
+      <w:proofErr w:type="spellStart"/>
+      <w:r>
+        <w:rPr>
+          <w:rFonts w:ascii="Arial" w:hAnsi="Arial" w:cs="Arial"/>
+          <w:sz w:val="24"/>
+        </w:rPr>
+        <w:t>ChangePasswordRequest</w:t>
+      </w:r>
+      <w:proofErr w:type="spellEnd"/>
+    </w:p>
+    <w:p>
+      <w:pPr>
+        <w:spacing w:line="240" w:lineRule="auto"/>
+        <w:rPr>
+          <w:rFonts w:ascii="Arial" w:hAnsi="Arial" w:cs="Arial"/>
+          <w:sz w:val="24"/>
+        </w:rPr>
+      </w:pPr>
+      <w:r>
+        <w:rPr>
+          <w:rFonts w:ascii="Arial" w:hAnsi="Arial" w:cs="Arial"/>
+          <w:sz w:val="24"/>
+        </w:rPr>
+        <w:t xml:space="preserve">main.py — Nuevos </w:t>
+      </w:r>
+      <w:proofErr w:type="spellStart"/>
+      <w:r>
+        <w:rPr>
+          <w:rFonts w:ascii="Arial" w:hAnsi="Arial" w:cs="Arial"/>
+          <w:sz w:val="24"/>
+        </w:rPr>
+        <w:t>endpoints</w:t>
+      </w:r>
+      <w:proofErr w:type="spellEnd"/>
+      <w:r>
+        <w:rPr>
+          <w:rFonts w:ascii="Arial" w:hAnsi="Arial" w:cs="Arial"/>
+          <w:sz w:val="24"/>
+        </w:rPr>
+        <w:t>:</w:t>
+      </w:r>
+    </w:p>
+    <w:p>
+      <w:pPr>
+        <w:spacing w:line="240" w:lineRule="auto"/>
+        <w:rPr>
+          <w:rFonts w:ascii="Arial" w:hAnsi="Arial" w:cs="Arial"/>
+          <w:sz w:val="24"/>
+        </w:rPr>
+      </w:pPr>
+      <w:r>
+        <w:rPr>
+          <w:rFonts w:ascii="Arial" w:hAnsi="Arial" w:cs="Arial"/>
+          <w:sz w:val="24"/>
+        </w:rPr>
+        <w:t>PUT /api/</w:t>
+      </w:r>
+      <w:proofErr w:type="spellStart"/>
+      <w:r>
+        <w:rPr>
+          <w:rFonts w:ascii="Arial" w:hAnsi="Arial" w:cs="Arial"/>
+          <w:sz w:val="24"/>
+        </w:rPr>
+        <w:t>auth</w:t>
+      </w:r>
+      <w:proofErr w:type="spellEnd"/>
+      <w:r>
+        <w:rPr>
+          <w:rFonts w:ascii="Arial" w:hAnsi="Arial" w:cs="Arial"/>
+          <w:sz w:val="24"/>
+        </w:rPr>
+        <w:t>/</w:t>
+      </w:r>
+      <w:proofErr w:type="spellStart"/>
+      <w:r>
+        <w:rPr>
+          <w:rFonts w:ascii="Arial" w:hAnsi="Arial" w:cs="Arial"/>
+          <w:sz w:val="24"/>
+        </w:rPr>
+        <w:t>profile</w:t>
+      </w:r>
+      <w:proofErr w:type="spellEnd"/>
+      <w:r>
+        <w:rPr>
+          <w:rFonts w:ascii="Arial" w:hAnsi="Arial" w:cs="Arial"/>
+          <w:sz w:val="24"/>
+        </w:rPr>
+        <w:t xml:space="preserve"> (actualizar nombre y foto)</w:t>
+      </w:r>
+    </w:p>
+    <w:p>
+      <w:pPr>
+        <w:spacing w:line="240" w:lineRule="auto"/>
+        <w:rPr>
+          <w:rFonts w:ascii="Arial" w:hAnsi="Arial" w:cs="Arial"/>
+          <w:sz w:val="24"/>
+        </w:rPr>
+      </w:pPr>
+      <w:r>
+        <w:rPr>
+          <w:rFonts w:ascii="Arial" w:hAnsi="Arial" w:cs="Arial"/>
+          <w:sz w:val="24"/>
+        </w:rPr>
+        <w:t>PUT /api/</w:t>
+      </w:r>
+      <w:proofErr w:type="spellStart"/>
+      <w:r>
+        <w:rPr>
+          <w:rFonts w:ascii="Arial" w:hAnsi="Arial" w:cs="Arial"/>
+          <w:sz w:val="24"/>
+        </w:rPr>
+        <w:t>auth</w:t>
+      </w:r>
+      <w:proofErr w:type="spellEnd"/>
+      <w:r>
+        <w:rPr>
+          <w:rFonts w:ascii="Arial" w:hAnsi="Arial" w:cs="Arial"/>
+          <w:sz w:val="24"/>
+        </w:rPr>
+        <w:t>/</w:t>
+      </w:r>
+      <w:proofErr w:type="spellStart"/>
+      <w:r>
+        <w:rPr>
+          <w:rFonts w:ascii="Arial" w:hAnsi="Arial" w:cs="Arial"/>
+          <w:sz w:val="24"/>
+        </w:rPr>
+        <w:t>password</w:t>
+      </w:r>
+      <w:proofErr w:type="spellEnd"/>
+      <w:r>
+        <w:rPr>
+          <w:rFonts w:ascii="Arial" w:hAnsi="Arial" w:cs="Arial"/>
+          <w:sz w:val="24"/>
+        </w:rPr>
+        <w:t xml:space="preserve"> (cambiar contraseña con validación)</w:t>
+      </w:r>
+    </w:p>
+    <w:p>
+      <w:pPr>
+        <w:spacing w:line="240" w:lineRule="auto"/>
+        <w:rPr>
+          <w:rFonts w:ascii="Arial" w:hAnsi="Arial" w:cs="Arial"/>
+          <w:sz w:val="24"/>
+        </w:rPr>
+      </w:pPr>
+      <w:proofErr w:type="spellStart"/>
+      <w:r>
+        <w:rPr>
+          <w:rFonts w:ascii="Arial" w:hAnsi="Arial" w:cs="Arial"/>
+          <w:sz w:val="24"/>
+        </w:rPr>
+        <w:t>Frontend</w:t>
+      </w:r>
+      <w:proofErr w:type="spellEnd"/>
+      <w:r>
+        <w:rPr>
+          <w:rFonts w:ascii="Arial" w:hAnsi="Arial" w:cs="Arial"/>
+          <w:sz w:val="24"/>
+        </w:rPr>
+        <w:t>:</w:t>
+      </w:r>
+    </w:p>
+    <w:p>
+      <w:pPr>
+        <w:spacing w:line="240" w:lineRule="auto"/>
+        <w:rPr>
+          <w:rFonts w:ascii="Arial" w:hAnsi="Arial" w:cs="Arial"/>
+          <w:sz w:val="24"/>
+        </w:rPr>
+      </w:pPr>
+      <w:proofErr w:type="spellStart"/>
+      <w:r>
+        <w:rPr>
+          <w:rFonts w:ascii="Arial" w:hAnsi="Arial" w:cs="Arial"/>
+          <w:sz w:val="24"/>
+        </w:rPr>
+        <w:t>ProfileModal.jsx</w:t>
+      </w:r>
+      <w:proofErr w:type="spellEnd"/>
+      <w:r>
+        <w:rPr>
+          <w:rFonts w:ascii="Arial" w:hAnsi="Arial" w:cs="Arial"/>
+          <w:sz w:val="24"/>
+        </w:rPr>
+        <w:t xml:space="preserve"> (nuevo) — Modal con:</w:t>
+      </w:r>
+    </w:p>
+    <w:p>
+      <w:pPr>
+        <w:spacing w:line="240" w:lineRule="auto"/>
+        <w:rPr>
+          <w:rFonts w:ascii="Arial" w:hAnsi="Arial" w:cs="Arial"/>
+          <w:sz w:val="24"/>
+        </w:rPr>
+      </w:pPr>
+      <w:r>
+        <w:rPr>
+          <w:rFonts w:ascii="Arial" w:hAnsi="Arial" w:cs="Arial"/>
+          <w:sz w:val="24"/>
+        </w:rPr>
+        <w:t xml:space="preserve">Foto de perfil </w:t>
+      </w:r>
+      <w:proofErr w:type="spellStart"/>
+      <w:r>
+        <w:rPr>
+          <w:rFonts w:ascii="Arial" w:hAnsi="Arial" w:cs="Arial"/>
+          <w:sz w:val="24"/>
+        </w:rPr>
+        <w:t>clickeable</w:t>
+      </w:r>
+      <w:proofErr w:type="spellEnd"/>
+      <w:r>
+        <w:rPr>
+          <w:rFonts w:ascii="Arial" w:hAnsi="Arial" w:cs="Arial"/>
+          <w:sz w:val="24"/>
+        </w:rPr>
+        <w:t xml:space="preserve"> para cambiarla (convierte a base64, </w:t>
+      </w:r>
+      <w:proofErr w:type="spellStart"/>
+      <w:r>
+        <w:rPr>
+          <w:rFonts w:ascii="Arial" w:hAnsi="Arial" w:cs="Arial"/>
+          <w:sz w:val="24"/>
+        </w:rPr>
+        <w:t>máx</w:t>
+      </w:r>
+      <w:proofErr w:type="spellEnd"/>
+      <w:r>
+        <w:rPr>
+          <w:rFonts w:ascii="Arial" w:hAnsi="Arial" w:cs="Arial"/>
+          <w:sz w:val="24"/>
+        </w:rPr>
+        <w:t xml:space="preserve"> 2MB)</w:t>
+      </w:r>
+    </w:p>
+    <w:p>
+      <w:pPr>
+        <w:spacing w:line="240" w:lineRule="auto"/>
+        <w:rPr>
+          <w:rFonts w:ascii="Arial" w:hAnsi="Arial" w:cs="Arial"/>
+          <w:sz w:val="24"/>
+        </w:rPr>
+      </w:pPr>
+      <w:r>
+        <w:rPr>
+          <w:rFonts w:ascii="Arial" w:hAnsi="Arial" w:cs="Arial"/>
+          <w:sz w:val="24"/>
+        </w:rPr>
+        <w:t>Campo de nombre editable</w:t>
+      </w:r>
+    </w:p>
+    <w:p>
+      <w:pPr>
+        <w:spacing w:line="240" w:lineRule="auto"/>
+        <w:rPr>
+          <w:rFonts w:ascii="Arial" w:hAnsi="Arial" w:cs="Arial"/>
+          <w:sz w:val="24"/>
+        </w:rPr>
+      </w:pPr>
+      <w:r>
+        <w:rPr>
+          <w:rFonts w:ascii="Arial" w:hAnsi="Arial" w:cs="Arial"/>
+          <w:sz w:val="24"/>
+        </w:rPr>
+        <w:t>Sección de cambio de contraseña (pide la actual + la nueva 2 veces)</w:t>
+      </w:r>
+    </w:p>
+    <w:p>
+      <w:pPr>
+        <w:spacing w:line="240" w:lineRule="auto"/>
+        <w:rPr>
+          <w:rFonts w:ascii="Arial" w:hAnsi="Arial" w:cs="Arial"/>
+          <w:sz w:val="24"/>
+        </w:rPr>
+      </w:pPr>
+      <w:proofErr w:type="spellStart"/>
+      <w:r>
+        <w:rPr>
+          <w:rFonts w:ascii="Arial" w:hAnsi="Arial" w:cs="Arial"/>
+          <w:sz w:val="24"/>
+        </w:rPr>
+        <w:t>Dashboard.jsx</w:t>
+      </w:r>
+      <w:proofErr w:type="spellEnd"/>
+      <w:r>
+        <w:rPr>
+          <w:rFonts w:ascii="Arial" w:hAnsi="Arial" w:cs="Arial"/>
+          <w:sz w:val="24"/>
+        </w:rPr>
+        <w:t xml:space="preserve"> — El nombre y avatar en la esquina superior derecha ahora son </w:t>
+      </w:r>
+      <w:proofErr w:type="spellStart"/>
+      <w:r>
+        <w:rPr>
+          <w:rFonts w:ascii="Arial" w:hAnsi="Arial" w:cs="Arial"/>
+          <w:sz w:val="24"/>
+        </w:rPr>
+        <w:t>clickeables</w:t>
+      </w:r>
+      <w:proofErr w:type="spellEnd"/>
+      <w:r>
+        <w:rPr>
+          <w:rFonts w:ascii="Arial" w:hAnsi="Arial" w:cs="Arial"/>
+          <w:sz w:val="24"/>
+        </w:rPr>
+        <w:t xml:space="preserve"> → abren el modal</w:t>
+      </w:r>
+    </w:p>
+    <w:p>
+      <w:pPr>
+        <w:spacing w:line="240" w:lineRule="auto"/>
+        <w:rPr>
+          <w:rFonts w:ascii="Arial" w:hAnsi="Arial" w:cs="Arial"/>
+          <w:sz w:val="24"/>
+        </w:rPr>
+      </w:pPr>
+      <w:proofErr w:type="spellStart"/>
+      <w:r>
+        <w:rPr>
+          <w:rFonts w:ascii="Arial" w:hAnsi="Arial" w:cs="Arial"/>
+          <w:sz w:val="24"/>
+        </w:rPr>
+        <w:t>AuthContext.jsx</w:t>
+      </w:r>
+      <w:proofErr w:type="spellEnd"/>
+      <w:r>
+        <w:rPr>
+          <w:rFonts w:ascii="Arial" w:hAnsi="Arial" w:cs="Arial"/>
+          <w:sz w:val="24"/>
+        </w:rPr>
+        <w:t xml:space="preserve"> — Función </w:t>
+      </w:r>
+      <w:proofErr w:type="spellStart"/>
+      <w:r>
+        <w:rPr>
+          <w:rFonts w:ascii="Arial" w:hAnsi="Arial" w:cs="Arial"/>
+          <w:sz w:val="24"/>
+        </w:rPr>
+        <w:t>updateUser</w:t>
+      </w:r>
+      <w:proofErr w:type="spellEnd"/>
+      <w:r>
+        <w:rPr>
+          <w:rFonts w:ascii="Arial" w:hAnsi="Arial" w:cs="Arial"/>
+          <w:sz w:val="24"/>
+        </w:rPr>
+        <w:t xml:space="preserve"> para sincronizar los cambios</w:t>
+      </w:r>
+      <w:r>
+        <w:rPr>
+          <w:rFonts w:ascii="Arial" w:hAnsi="Arial" w:cs="Arial"/>
+          <w:sz w:val="24"/>
+        </w:rPr>
+        <w:t>.</w:t>
+      </w:r>
+    </w:p>
+    <w:p>
+      <w:pPr>
+        <w:spacing w:line="240" w:lineRule="auto"/>
+        <w:rPr>
+          <w:rFonts w:ascii="Arial" w:hAnsi="Arial" w:cs="Arial"/>
+          <w:sz w:val="24"/>
+        </w:rPr>
+      </w:pPr>
+      <w:r>
+        <w:rPr>
+          <w:rFonts w:ascii="Arial" w:hAnsi="Arial" w:cs="Arial"/>
+          <w:noProof/>
+          <w:sz w:val="24"/>
+          <w:lang w:eastAsia="es-MX"/>
+        </w:rPr>
+        <w:lastRenderedPageBreak/>
+        <w:drawing>
+          <wp:inline distT="0" distB="0" distL="0" distR="0">
+            <wp:extent cx="5612130" cy="2686685"/>
+            <wp:effectExtent l="0" t="0" r="7620" b="0"/>
+            <wp:docPr id="10" name="Imagen 10"/>
+            <wp:cNvGraphicFramePr>
+              <a:graphicFrameLocks xmlns:a="http://schemas.openxmlformats.org/drawingml/2006/main" noChangeAspect="1"/>
+            </wp:cNvGraphicFramePr>
+            <a:graphic xmlns:a="http://schemas.openxmlformats.org/drawingml/2006/main">
+              <a:graphicData uri="http://schemas.openxmlformats.org/drawingml/2006/picture">
+                <pic:pic xmlns:pic="http://schemas.openxmlformats.org/drawingml/2006/picture">
+                  <pic:nvPicPr>
+                    <pic:cNvPr id="10" name="WhatsApp Image 2026-03-25 at 8.43.37 PM.jpeg"/>
+                    <pic:cNvPicPr/>
+                  </pic:nvPicPr>
+                  <pic:blipFill>
+                    <a:blip r:embed="rId12" cstate="print">
+                      <a:extLst>
+                        <a:ext uri="{28A0092B-C50C-407E-A947-70E740481C1C}">
+                          <a14:useLocalDpi xmlns:a14="http://schemas.microsoft.com/office/drawing/2010/main" val="0"/>
+                        </a:ext>
+                      </a:extLst>
+                    </a:blip>
+                    <a:stretch>
+                      <a:fillRect/>
+                    </a:stretch>
+                  </pic:blipFill>
+                  <pic:spPr>
+                    <a:xfrm>
+                      <a:off x="0" y="0"/>
+                      <a:ext cx="5612130" cy="2686685"/>
+                    </a:xfrm>
+                    <a:prstGeom prst="rect">
+                      <a:avLst/>
+                    </a:prstGeom>
+                  </pic:spPr>
+                </pic:pic>
+              </a:graphicData>
+            </a:graphic>
+          </wp:inline>
+        </w:drawing>
+      </w:r>
+    </w:p>
+    <w:p>
+      <w:pPr>
+        <w:spacing w:line="240" w:lineRule="auto"/>
+        <w:rPr>
+          <w:rFonts w:ascii="Arial" w:hAnsi="Arial" w:cs="Arial"/>
+          <w:sz w:val="24"/>
+        </w:rPr>
+      </w:pPr>
+      <w:r>
+        <w:rPr>
+          <w:rFonts w:ascii="Arial" w:hAnsi="Arial" w:cs="Arial"/>
+          <w:sz w:val="24"/>
+        </w:rPr>
+        <w:t>*</w:t>
+      </w:r>
+      <w:proofErr w:type="spellStart"/>
+      <w:r>
+        <w:rPr>
+          <w:rFonts w:ascii="Arial" w:hAnsi="Arial" w:cs="Arial"/>
+          <w:sz w:val="24"/>
+        </w:rPr>
+        <w:t>Backend</w:t>
+      </w:r>
+      <w:proofErr w:type="spellEnd"/>
+      <w:r>
+        <w:rPr>
+          <w:rFonts w:ascii="Arial" w:hAnsi="Arial" w:cs="Arial"/>
+          <w:sz w:val="24"/>
+        </w:rPr>
+        <w:t>:</w:t>
+      </w:r>
+    </w:p>
+    <w:p>
+      <w:pPr>
+        <w:spacing w:line="240" w:lineRule="auto"/>
+        <w:rPr>
+          <w:rFonts w:ascii="Arial" w:hAnsi="Arial" w:cs="Arial"/>
+          <w:sz w:val="24"/>
+        </w:rPr>
+      </w:pPr>
+      <w:r>
+        <w:rPr>
+          <w:rFonts w:ascii="Arial" w:hAnsi="Arial" w:cs="Arial"/>
+          <w:sz w:val="24"/>
+        </w:rPr>
+        <w:t>Nueva tabla conversaciones (máx. 5 por usuario, la más vieja se borra automáticamente)</w:t>
+      </w:r>
+    </w:p>
+    <w:p>
+      <w:pPr>
+        <w:spacing w:line="240" w:lineRule="auto"/>
+        <w:rPr>
+          <w:rFonts w:ascii="Arial" w:hAnsi="Arial" w:cs="Arial"/>
+          <w:sz w:val="24"/>
+        </w:rPr>
+      </w:pPr>
+      <w:r>
+        <w:rPr>
+          <w:rFonts w:ascii="Arial" w:hAnsi="Arial" w:cs="Arial"/>
+          <w:sz w:val="24"/>
+        </w:rPr>
+        <w:t xml:space="preserve">Columna </w:t>
+      </w:r>
+      <w:proofErr w:type="spellStart"/>
+      <w:r>
+        <w:rPr>
+          <w:rFonts w:ascii="Arial" w:hAnsi="Arial" w:cs="Arial"/>
+          <w:sz w:val="24"/>
+        </w:rPr>
+        <w:t>conversacion_id</w:t>
+      </w:r>
+      <w:proofErr w:type="spellEnd"/>
+      <w:r>
+        <w:rPr>
+          <w:rFonts w:ascii="Arial" w:hAnsi="Arial" w:cs="Arial"/>
+          <w:sz w:val="24"/>
+        </w:rPr>
+        <w:t xml:space="preserve"> en mensajes para agrupar mensajes</w:t>
+      </w:r>
+    </w:p>
+    <w:p>
+      <w:pPr>
+        <w:spacing w:line="240" w:lineRule="auto"/>
+        <w:rPr>
+          <w:rFonts w:ascii="Arial" w:hAnsi="Arial" w:cs="Arial"/>
+          <w:sz w:val="24"/>
+        </w:rPr>
+      </w:pPr>
+      <w:proofErr w:type="spellStart"/>
+      <w:r>
+        <w:rPr>
+          <w:rFonts w:ascii="Arial" w:hAnsi="Arial" w:cs="Arial"/>
+          <w:sz w:val="24"/>
+        </w:rPr>
+        <w:t>Endpoints</w:t>
+      </w:r>
+      <w:proofErr w:type="spellEnd"/>
+      <w:r>
+        <w:rPr>
+          <w:rFonts w:ascii="Arial" w:hAnsi="Arial" w:cs="Arial"/>
+          <w:sz w:val="24"/>
+        </w:rPr>
+        <w:t>: GET/</w:t>
+      </w:r>
+      <w:bookmarkStart w:id="0" w:name="_GoBack"/>
+      <w:bookmarkEnd w:id="0"/>
+      <w:r>
+        <w:rPr>
+          <w:rFonts w:ascii="Arial" w:hAnsi="Arial" w:cs="Arial"/>
+          <w:sz w:val="24"/>
+        </w:rPr>
+        <w:t>POST/DELETE /api/chat/</w:t>
+      </w:r>
+      <w:proofErr w:type="spellStart"/>
+      <w:proofErr w:type="gramStart"/>
+      <w:r>
+        <w:rPr>
+          <w:rFonts w:ascii="Arial" w:hAnsi="Arial" w:cs="Arial"/>
+          <w:sz w:val="24"/>
+        </w:rPr>
+        <w:t>conversacion</w:t>
+      </w:r>
+      <w:proofErr w:type="spellEnd"/>
+      <w:r>
+        <w:rPr>
+          <w:rFonts w:ascii="Arial" w:hAnsi="Arial" w:cs="Arial"/>
+          <w:sz w:val="24"/>
+        </w:rPr>
+        <w:t>[</w:t>
+      </w:r>
+      <w:proofErr w:type="gramEnd"/>
+      <w:r>
+        <w:rPr>
+          <w:rFonts w:ascii="Arial" w:hAnsi="Arial" w:cs="Arial"/>
+          <w:sz w:val="24"/>
+        </w:rPr>
+        <w:t>es]</w:t>
+      </w:r>
+    </w:p>
+    <w:p>
+      <w:pPr>
+        <w:spacing w:line="240" w:lineRule="auto"/>
+        <w:rPr>
+          <w:rFonts w:ascii="Arial" w:hAnsi="Arial" w:cs="Arial"/>
+          <w:sz w:val="24"/>
+        </w:rPr>
+      </w:pPr>
+      <w:proofErr w:type="spellStart"/>
+      <w:r>
+        <w:rPr>
+          <w:rFonts w:ascii="Arial" w:hAnsi="Arial" w:cs="Arial"/>
+          <w:sz w:val="24"/>
+        </w:rPr>
+        <w:t>chat_local</w:t>
+      </w:r>
+      <w:proofErr w:type="spellEnd"/>
+      <w:r>
+        <w:rPr>
+          <w:rFonts w:ascii="Arial" w:hAnsi="Arial" w:cs="Arial"/>
+          <w:sz w:val="24"/>
+        </w:rPr>
+        <w:t xml:space="preserve"> reescrito: envía los últimos 6 mensajes como contexto al LLM y asocia cada mensaje a una conversación</w:t>
+      </w:r>
+    </w:p>
+    <w:p>
+      <w:pPr>
+        <w:spacing w:line="240" w:lineRule="auto"/>
+        <w:rPr>
+          <w:rFonts w:ascii="Arial" w:hAnsi="Arial" w:cs="Arial"/>
+          <w:sz w:val="24"/>
+        </w:rPr>
+      </w:pPr>
+      <w:proofErr w:type="spellStart"/>
+      <w:r>
+        <w:rPr>
+          <w:rFonts w:ascii="Arial" w:hAnsi="Arial" w:cs="Arial"/>
+          <w:sz w:val="24"/>
+        </w:rPr>
+        <w:t>Fron</w:t>
+      </w:r>
+      <w:r>
+        <w:rPr>
+          <w:rFonts w:ascii="Arial" w:hAnsi="Arial" w:cs="Arial"/>
+          <w:sz w:val="24"/>
+        </w:rPr>
+        <w:t>tend</w:t>
+      </w:r>
+      <w:proofErr w:type="spellEnd"/>
+      <w:r>
+        <w:rPr>
+          <w:rFonts w:ascii="Arial" w:hAnsi="Arial" w:cs="Arial"/>
+          <w:sz w:val="24"/>
+        </w:rPr>
+        <w:t xml:space="preserve"> (</w:t>
+      </w:r>
+      <w:proofErr w:type="spellStart"/>
+      <w:r>
+        <w:rPr>
+          <w:rFonts w:ascii="Arial" w:hAnsi="Arial" w:cs="Arial"/>
+          <w:sz w:val="24"/>
+        </w:rPr>
+        <w:t>ChatTutor.jsx</w:t>
+      </w:r>
+      <w:proofErr w:type="spellEnd"/>
+      <w:r>
+        <w:rPr>
+          <w:rFonts w:ascii="Arial" w:hAnsi="Arial" w:cs="Arial"/>
+          <w:sz w:val="24"/>
+        </w:rPr>
+        <w:t xml:space="preserve"> reescrito):</w:t>
+      </w:r>
+    </w:p>
+    <w:p>
+      <w:pPr>
+        <w:spacing w:line="240" w:lineRule="auto"/>
+        <w:rPr>
+          <w:rFonts w:ascii="Arial" w:hAnsi="Arial" w:cs="Arial"/>
+          <w:sz w:val="24"/>
+        </w:rPr>
+      </w:pPr>
+      <w:proofErr w:type="spellStart"/>
+      <w:r>
+        <w:rPr>
+          <w:rFonts w:ascii="Arial" w:hAnsi="Arial" w:cs="Arial"/>
+          <w:sz w:val="24"/>
+        </w:rPr>
+        <w:t>Sidebar</w:t>
+      </w:r>
+      <w:proofErr w:type="spellEnd"/>
+      <w:r>
+        <w:rPr>
+          <w:rFonts w:ascii="Arial" w:hAnsi="Arial" w:cs="Arial"/>
+          <w:sz w:val="24"/>
+        </w:rPr>
+        <w:t xml:space="preserve"> de conversaciones (botón </w:t>
+      </w:r>
+      <w:r>
+        <w:rPr>
+          <w:rFonts w:ascii="Segoe UI Symbol" w:hAnsi="Segoe UI Symbol" w:cs="Segoe UI Symbol"/>
+          <w:sz w:val="24"/>
+        </w:rPr>
+        <w:t>💬</w:t>
+      </w:r>
+      <w:r>
+        <w:rPr>
+          <w:rFonts w:ascii="Arial" w:hAnsi="Arial" w:cs="Arial"/>
+          <w:sz w:val="24"/>
+        </w:rPr>
+        <w:t>) — ver, crear, eliminar conversaciones</w:t>
+      </w:r>
+    </w:p>
+    <w:p>
+      <w:pPr>
+        <w:spacing w:line="240" w:lineRule="auto"/>
+        <w:rPr>
+          <w:rFonts w:ascii="Arial" w:hAnsi="Arial" w:cs="Arial"/>
+          <w:sz w:val="24"/>
+        </w:rPr>
+      </w:pPr>
+      <w:r>
+        <w:rPr>
+          <w:rFonts w:ascii="Arial" w:hAnsi="Arial" w:cs="Arial"/>
+          <w:sz w:val="24"/>
+        </w:rPr>
+        <w:t xml:space="preserve">Selector de lecciones (botón </w:t>
+      </w:r>
+      <w:r>
+        <w:rPr>
+          <w:rFonts w:ascii="Segoe UI Symbol" w:hAnsi="Segoe UI Symbol" w:cs="Segoe UI Symbol"/>
+          <w:sz w:val="24"/>
+        </w:rPr>
+        <w:t>📎</w:t>
+      </w:r>
+      <w:r>
+        <w:rPr>
+          <w:rFonts w:ascii="Arial" w:hAnsi="Arial" w:cs="Arial"/>
+          <w:sz w:val="24"/>
+        </w:rPr>
+        <w:t>) — muestra todas tus lecciones (completadas y en curso) para adjuntar al chat</w:t>
+      </w:r>
+    </w:p>
+    <w:p>
+      <w:pPr>
+        <w:spacing w:line="240" w:lineRule="auto"/>
+        <w:rPr>
+          <w:rFonts w:ascii="Arial" w:hAnsi="Arial" w:cs="Arial"/>
+          <w:sz w:val="24"/>
+        </w:rPr>
+      </w:pPr>
+      <w:r>
+        <w:rPr>
+          <w:rFonts w:ascii="Arial" w:hAnsi="Arial" w:cs="Arial"/>
+          <w:sz w:val="24"/>
+        </w:rPr>
+        <w:t>Los mensajes se persisten y se recargan al abrir una conversación</w:t>
+      </w:r>
+    </w:p>
+    <w:p>
+      <w:pPr>
+        <w:spacing w:line="240" w:lineRule="auto"/>
+        <w:rPr>
+          <w:rFonts w:ascii="Arial" w:hAnsi="Arial" w:cs="Arial"/>
+          <w:sz w:val="24"/>
+        </w:rPr>
+      </w:pPr>
+      <w:r>
+        <w:rPr>
+          <w:rFonts w:ascii="Arial" w:hAnsi="Arial" w:cs="Arial"/>
+          <w:sz w:val="24"/>
+        </w:rPr>
+        <w:t>Al enviar el primer mensaje se crea la conversación automáticamente</w:t>
+      </w:r>
+    </w:p>
+    <w:p>
+      <w:pPr>
+        <w:spacing w:line="240" w:lineRule="auto"/>
+        <w:rPr>
+          <w:rFonts w:ascii="Arial" w:hAnsi="Arial" w:cs="Arial"/>
+          <w:sz w:val="24"/>
+        </w:rPr>
+      </w:pPr>
     </w:p>
     <w:sectPr>
       <w:pgSz w:w="12240" w:h="15840"/>

</xml_diff>

<commit_message>
Se agregaron nuevas modificaciones al archivo Word
</commit_message>
<xml_diff>
--- a/Bitácora-PolyIA.docx
+++ b/Bitácora-PolyIA.docx
@@ -1893,93 +1893,23 @@
           <w:rFonts w:ascii="Arial" w:hAnsi="Arial" w:cs="Arial"/>
           <w:sz w:val="24"/>
         </w:rPr>
-        <w:t>Existía</w:t>
-      </w:r>
-      <w:r>
-        <w:rPr>
-          <w:rFonts w:ascii="Arial" w:hAnsi="Arial" w:cs="Arial"/>
-          <w:sz w:val="24"/>
-        </w:rPr>
-        <w:t xml:space="preserve"> un problema bastante grande cuando el sistema </w:t>
-      </w:r>
-      <w:r>
-        <w:rPr>
-          <w:rFonts w:ascii="Arial" w:hAnsi="Arial" w:cs="Arial"/>
-          <w:sz w:val="24"/>
-        </w:rPr>
-        <w:t>generaba</w:t>
-      </w:r>
-      <w:r>
-        <w:rPr>
-          <w:rFonts w:ascii="Arial" w:hAnsi="Arial" w:cs="Arial"/>
-          <w:sz w:val="24"/>
-        </w:rPr>
-        <w:t xml:space="preserve"> una </w:t>
-      </w:r>
-      <w:r>
-        <w:rPr>
-          <w:rFonts w:ascii="Arial" w:hAnsi="Arial" w:cs="Arial"/>
-          <w:sz w:val="24"/>
-        </w:rPr>
-        <w:t>lección</w:t>
-      </w:r>
-      <w:r>
-        <w:rPr>
-          <w:rFonts w:ascii="Arial" w:hAnsi="Arial" w:cs="Arial"/>
-          <w:sz w:val="24"/>
-        </w:rPr>
-        <w:t xml:space="preserve">, el audio no se </w:t>
-      </w:r>
-      <w:r>
-        <w:rPr>
-          <w:rFonts w:ascii="Arial" w:hAnsi="Arial" w:cs="Arial"/>
-          <w:sz w:val="24"/>
-        </w:rPr>
-        <w:t>generaba</w:t>
-      </w:r>
-      <w:r>
-        <w:rPr>
-          <w:rFonts w:ascii="Arial" w:hAnsi="Arial" w:cs="Arial"/>
-          <w:sz w:val="24"/>
-        </w:rPr>
-        <w:t xml:space="preserve"> correctamente, ahora esto se </w:t>
-      </w:r>
-      <w:r>
-        <w:rPr>
-          <w:rFonts w:ascii="Arial" w:hAnsi="Arial" w:cs="Arial"/>
-          <w:sz w:val="24"/>
-        </w:rPr>
-        <w:t>solucionó</w:t>
-      </w:r>
-      <w:r>
-        <w:rPr>
-          <w:rFonts w:ascii="Arial" w:hAnsi="Arial" w:cs="Arial"/>
-          <w:sz w:val="24"/>
-        </w:rPr>
-        <w:t xml:space="preserve"> haciendo lo siguiente:</w:t>
-      </w:r>
-    </w:p>
-    <w:p>
-      <w:pPr>
-        <w:spacing w:line="240" w:lineRule="auto"/>
-        <w:rPr>
-          <w:rFonts w:ascii="Arial" w:hAnsi="Arial" w:cs="Arial"/>
-          <w:sz w:val="24"/>
-        </w:rPr>
-      </w:pPr>
-      <w:r>
-        <w:rPr>
-          <w:rFonts w:ascii="Arial" w:hAnsi="Arial" w:cs="Arial"/>
-          <w:sz w:val="24"/>
-        </w:rPr>
-        <w:t>Tenía</w:t>
-      </w:r>
-      <w:r>
-        <w:rPr>
-          <w:rFonts w:ascii="Arial" w:hAnsi="Arial" w:cs="Arial"/>
-          <w:sz w:val="24"/>
-        </w:rPr>
-        <w:t xml:space="preserve"> un bug de conexión </w:t>
+        <w:t>Existía un problema bastante grande cuando el sistema generaba una lección, el audio no se generaba correctamente, ahora esto se solucionó haciendo lo siguiente:</w:t>
+      </w:r>
+    </w:p>
+    <w:p>
+      <w:pPr>
+        <w:spacing w:line="240" w:lineRule="auto"/>
+        <w:rPr>
+          <w:rFonts w:ascii="Arial" w:hAnsi="Arial" w:cs="Arial"/>
+          <w:sz w:val="24"/>
+        </w:rPr>
+      </w:pPr>
+      <w:r>
+        <w:rPr>
+          <w:rFonts w:ascii="Arial" w:hAnsi="Arial" w:cs="Arial"/>
+          <w:sz w:val="24"/>
+        </w:rPr>
+        <w:t xml:space="preserve">Tenía un bug de conexión </w:t>
       </w:r>
       <w:proofErr w:type="spellStart"/>
       <w:r>
@@ -2075,21 +2005,7 @@
           <w:rFonts w:ascii="Arial" w:hAnsi="Arial" w:cs="Arial"/>
           <w:sz w:val="24"/>
         </w:rPr>
-        <w:t xml:space="preserve"> —Se </w:t>
-      </w:r>
-      <w:r>
-        <w:rPr>
-          <w:rFonts w:ascii="Arial" w:hAnsi="Arial" w:cs="Arial"/>
-          <w:sz w:val="24"/>
-        </w:rPr>
-        <w:t>reescribió</w:t>
-      </w:r>
-      <w:r>
-        <w:rPr>
-          <w:rFonts w:ascii="Arial" w:hAnsi="Arial" w:cs="Arial"/>
-          <w:sz w:val="24"/>
-        </w:rPr>
-        <w:t xml:space="preserve"> el componente </w:t>
+        <w:t xml:space="preserve"> —Se reescribió el componente </w:t>
       </w:r>
       <w:proofErr w:type="spellStart"/>
       <w:r>
@@ -2652,21 +2568,7 @@
           <w:rFonts w:ascii="Arial" w:hAnsi="Arial" w:cs="Arial"/>
           <w:sz w:val="24"/>
         </w:rPr>
-        <w:t xml:space="preserve">models.py — Nueva columna </w:t>
-      </w:r>
-      <w:r>
-        <w:rPr>
-          <w:rFonts w:ascii="Arial" w:hAnsi="Arial" w:cs="Arial"/>
-          <w:sz w:val="24"/>
-        </w:rPr>
-        <w:t>foto perfil</w:t>
-      </w:r>
-      <w:r>
-        <w:rPr>
-          <w:rFonts w:ascii="Arial" w:hAnsi="Arial" w:cs="Arial"/>
-          <w:sz w:val="24"/>
-        </w:rPr>
-        <w:t xml:space="preserve"> en la tabla usuarios</w:t>
+        <w:t>models.py — Nueva columna foto perfil en la tabla usuarios</w:t>
       </w:r>
     </w:p>
     <w:p>
@@ -3234,225 +3136,1296 @@
           <w:rFonts w:ascii="Arial" w:hAnsi="Arial" w:cs="Arial"/>
           <w:sz w:val="24"/>
         </w:rPr>
-        <w:t>: GET/</w:t>
+        <w:t>: GET/POST/DELETE /api/chat/</w:t>
+      </w:r>
+      <w:proofErr w:type="spellStart"/>
+      <w:proofErr w:type="gramStart"/>
+      <w:r>
+        <w:rPr>
+          <w:rFonts w:ascii="Arial" w:hAnsi="Arial" w:cs="Arial"/>
+          <w:sz w:val="24"/>
+        </w:rPr>
+        <w:t>conversacion</w:t>
+      </w:r>
+      <w:proofErr w:type="spellEnd"/>
+      <w:r>
+        <w:rPr>
+          <w:rFonts w:ascii="Arial" w:hAnsi="Arial" w:cs="Arial"/>
+          <w:sz w:val="24"/>
+        </w:rPr>
+        <w:t>[</w:t>
+      </w:r>
+      <w:proofErr w:type="gramEnd"/>
+      <w:r>
+        <w:rPr>
+          <w:rFonts w:ascii="Arial" w:hAnsi="Arial" w:cs="Arial"/>
+          <w:sz w:val="24"/>
+        </w:rPr>
+        <w:t>es]</w:t>
+      </w:r>
+    </w:p>
+    <w:p>
+      <w:pPr>
+        <w:spacing w:line="240" w:lineRule="auto"/>
+        <w:rPr>
+          <w:rFonts w:ascii="Arial" w:hAnsi="Arial" w:cs="Arial"/>
+          <w:sz w:val="24"/>
+        </w:rPr>
+      </w:pPr>
+      <w:proofErr w:type="spellStart"/>
+      <w:r>
+        <w:rPr>
+          <w:rFonts w:ascii="Arial" w:hAnsi="Arial" w:cs="Arial"/>
+          <w:sz w:val="24"/>
+        </w:rPr>
+        <w:t>chat_local</w:t>
+      </w:r>
+      <w:proofErr w:type="spellEnd"/>
+      <w:r>
+        <w:rPr>
+          <w:rFonts w:ascii="Arial" w:hAnsi="Arial" w:cs="Arial"/>
+          <w:sz w:val="24"/>
+        </w:rPr>
+        <w:t xml:space="preserve"> reescrito: envía los últimos 6 mensajes como contexto al LLM y asocia cada mensaje a una conversación</w:t>
+      </w:r>
+    </w:p>
+    <w:p>
+      <w:pPr>
+        <w:spacing w:line="240" w:lineRule="auto"/>
+        <w:rPr>
+          <w:rFonts w:ascii="Arial" w:hAnsi="Arial" w:cs="Arial"/>
+          <w:sz w:val="24"/>
+        </w:rPr>
+      </w:pPr>
+      <w:proofErr w:type="spellStart"/>
+      <w:r>
+        <w:rPr>
+          <w:rFonts w:ascii="Arial" w:hAnsi="Arial" w:cs="Arial"/>
+          <w:sz w:val="24"/>
+        </w:rPr>
+        <w:t>Fron</w:t>
+      </w:r>
+      <w:r>
+        <w:rPr>
+          <w:rFonts w:ascii="Arial" w:hAnsi="Arial" w:cs="Arial"/>
+          <w:sz w:val="24"/>
+        </w:rPr>
+        <w:t>tend</w:t>
+      </w:r>
+      <w:proofErr w:type="spellEnd"/>
+      <w:r>
+        <w:rPr>
+          <w:rFonts w:ascii="Arial" w:hAnsi="Arial" w:cs="Arial"/>
+          <w:sz w:val="24"/>
+        </w:rPr>
+        <w:t xml:space="preserve"> (</w:t>
+      </w:r>
+      <w:proofErr w:type="spellStart"/>
+      <w:r>
+        <w:rPr>
+          <w:rFonts w:ascii="Arial" w:hAnsi="Arial" w:cs="Arial"/>
+          <w:sz w:val="24"/>
+        </w:rPr>
+        <w:t>ChatTutor.jsx</w:t>
+      </w:r>
+      <w:proofErr w:type="spellEnd"/>
+      <w:r>
+        <w:rPr>
+          <w:rFonts w:ascii="Arial" w:hAnsi="Arial" w:cs="Arial"/>
+          <w:sz w:val="24"/>
+        </w:rPr>
+        <w:t xml:space="preserve"> reescrito):</w:t>
+      </w:r>
+    </w:p>
+    <w:p>
+      <w:pPr>
+        <w:spacing w:line="240" w:lineRule="auto"/>
+        <w:rPr>
+          <w:rFonts w:ascii="Arial" w:hAnsi="Arial" w:cs="Arial"/>
+          <w:sz w:val="24"/>
+        </w:rPr>
+      </w:pPr>
+      <w:proofErr w:type="spellStart"/>
+      <w:r>
+        <w:rPr>
+          <w:rFonts w:ascii="Arial" w:hAnsi="Arial" w:cs="Arial"/>
+          <w:sz w:val="24"/>
+        </w:rPr>
+        <w:t>Sidebar</w:t>
+      </w:r>
+      <w:proofErr w:type="spellEnd"/>
+      <w:r>
+        <w:rPr>
+          <w:rFonts w:ascii="Arial" w:hAnsi="Arial" w:cs="Arial"/>
+          <w:sz w:val="24"/>
+        </w:rPr>
+        <w:t xml:space="preserve"> de conversaciones (botón </w:t>
+      </w:r>
+      <w:r>
+        <w:rPr>
+          <w:rFonts w:ascii="Segoe UI Symbol" w:hAnsi="Segoe UI Symbol" w:cs="Segoe UI Symbol"/>
+          <w:sz w:val="24"/>
+        </w:rPr>
+        <w:t>💬</w:t>
+      </w:r>
+      <w:r>
+        <w:rPr>
+          <w:rFonts w:ascii="Arial" w:hAnsi="Arial" w:cs="Arial"/>
+          <w:sz w:val="24"/>
+        </w:rPr>
+        <w:t>) — ver, crear, eliminar conversaciones</w:t>
+      </w:r>
+    </w:p>
+    <w:p>
+      <w:pPr>
+        <w:spacing w:line="240" w:lineRule="auto"/>
+        <w:rPr>
+          <w:rFonts w:ascii="Arial" w:hAnsi="Arial" w:cs="Arial"/>
+          <w:sz w:val="24"/>
+        </w:rPr>
+      </w:pPr>
+      <w:r>
+        <w:rPr>
+          <w:rFonts w:ascii="Arial" w:hAnsi="Arial" w:cs="Arial"/>
+          <w:sz w:val="24"/>
+        </w:rPr>
+        <w:t xml:space="preserve">Selector de lecciones (botón </w:t>
+      </w:r>
+      <w:r>
+        <w:rPr>
+          <w:rFonts w:ascii="Segoe UI Symbol" w:hAnsi="Segoe UI Symbol" w:cs="Segoe UI Symbol"/>
+          <w:sz w:val="24"/>
+        </w:rPr>
+        <w:t>📎</w:t>
+      </w:r>
+      <w:r>
+        <w:rPr>
+          <w:rFonts w:ascii="Arial" w:hAnsi="Arial" w:cs="Arial"/>
+          <w:sz w:val="24"/>
+        </w:rPr>
+        <w:t>) — muestra todas tus lecciones (completadas y en curso) para adjuntar al chat</w:t>
+      </w:r>
+    </w:p>
+    <w:p>
+      <w:pPr>
+        <w:spacing w:line="240" w:lineRule="auto"/>
+        <w:rPr>
+          <w:rFonts w:ascii="Arial" w:hAnsi="Arial" w:cs="Arial"/>
+          <w:sz w:val="24"/>
+        </w:rPr>
+      </w:pPr>
+      <w:r>
+        <w:rPr>
+          <w:rFonts w:ascii="Arial" w:hAnsi="Arial" w:cs="Arial"/>
+          <w:sz w:val="24"/>
+        </w:rPr>
+        <w:t>Los mensajes se persisten y se recargan al abrir una conversación</w:t>
+      </w:r>
+    </w:p>
+    <w:p>
+      <w:pPr>
+        <w:spacing w:line="240" w:lineRule="auto"/>
+        <w:rPr>
+          <w:rFonts w:ascii="Arial" w:hAnsi="Arial" w:cs="Arial"/>
+          <w:sz w:val="24"/>
+        </w:rPr>
+      </w:pPr>
+      <w:r>
+        <w:rPr>
+          <w:rFonts w:ascii="Arial" w:hAnsi="Arial" w:cs="Arial"/>
+          <w:sz w:val="24"/>
+        </w:rPr>
+        <w:t>Al enviar el primer mensaje se crea la conversación automáticamente</w:t>
+      </w:r>
+    </w:p>
+    <w:p>
+      <w:pPr>
+        <w:spacing w:line="240" w:lineRule="auto"/>
+        <w:rPr>
+          <w:rFonts w:ascii="Arial" w:hAnsi="Arial" w:cs="Arial"/>
+          <w:sz w:val="24"/>
+        </w:rPr>
+      </w:pPr>
+      <w:r>
+        <w:rPr>
+          <w:rFonts w:ascii="Arial" w:hAnsi="Arial" w:cs="Arial"/>
+          <w:noProof/>
+          <w:sz w:val="24"/>
+          <w:lang w:eastAsia="es-MX"/>
+        </w:rPr>
+        <w:lastRenderedPageBreak/>
+        <w:drawing>
+          <wp:inline distT="0" distB="0" distL="0" distR="0">
+            <wp:extent cx="5612130" cy="2686685"/>
+            <wp:effectExtent l="0" t="0" r="7620" b="0"/>
+            <wp:docPr id="9" name="Imagen 9"/>
+            <wp:cNvGraphicFramePr>
+              <a:graphicFrameLocks xmlns:a="http://schemas.openxmlformats.org/drawingml/2006/main" noChangeAspect="1"/>
+            </wp:cNvGraphicFramePr>
+            <a:graphic xmlns:a="http://schemas.openxmlformats.org/drawingml/2006/main">
+              <a:graphicData uri="http://schemas.openxmlformats.org/drawingml/2006/picture">
+                <pic:pic xmlns:pic="http://schemas.openxmlformats.org/drawingml/2006/picture">
+                  <pic:nvPicPr>
+                    <pic:cNvPr id="9" name="WhatsApp Image 2026-04-13 at 6.32.05 PM.jpeg"/>
+                    <pic:cNvPicPr/>
+                  </pic:nvPicPr>
+                  <pic:blipFill>
+                    <a:blip r:embed="rId13" cstate="print">
+                      <a:extLst>
+                        <a:ext uri="{28A0092B-C50C-407E-A947-70E740481C1C}">
+                          <a14:useLocalDpi xmlns:a14="http://schemas.microsoft.com/office/drawing/2010/main" val="0"/>
+                        </a:ext>
+                      </a:extLst>
+                    </a:blip>
+                    <a:stretch>
+                      <a:fillRect/>
+                    </a:stretch>
+                  </pic:blipFill>
+                  <pic:spPr>
+                    <a:xfrm>
+                      <a:off x="0" y="0"/>
+                      <a:ext cx="5612130" cy="2686685"/>
+                    </a:xfrm>
+                    <a:prstGeom prst="rect">
+                      <a:avLst/>
+                    </a:prstGeom>
+                  </pic:spPr>
+                </pic:pic>
+              </a:graphicData>
+            </a:graphic>
+          </wp:inline>
+        </w:drawing>
+      </w:r>
+      <w:r>
+        <w:rPr>
+          <w:rFonts w:ascii="Arial" w:hAnsi="Arial" w:cs="Arial"/>
+          <w:noProof/>
+          <w:sz w:val="24"/>
+          <w:lang w:eastAsia="es-MX"/>
+        </w:rPr>
+        <w:drawing>
+          <wp:inline distT="0" distB="0" distL="0" distR="0">
+            <wp:extent cx="5612130" cy="2665730"/>
+            <wp:effectExtent l="0" t="0" r="7620" b="1270"/>
+            <wp:docPr id="11" name="Imagen 11"/>
+            <wp:cNvGraphicFramePr>
+              <a:graphicFrameLocks xmlns:a="http://schemas.openxmlformats.org/drawingml/2006/main" noChangeAspect="1"/>
+            </wp:cNvGraphicFramePr>
+            <a:graphic xmlns:a="http://schemas.openxmlformats.org/drawingml/2006/main">
+              <a:graphicData uri="http://schemas.openxmlformats.org/drawingml/2006/picture">
+                <pic:pic xmlns:pic="http://schemas.openxmlformats.org/drawingml/2006/picture">
+                  <pic:nvPicPr>
+                    <pic:cNvPr id="11" name="WhatsApp Image 2026-04-13 at 6.32.06 PM.jpeg"/>
+                    <pic:cNvPicPr/>
+                  </pic:nvPicPr>
+                  <pic:blipFill>
+                    <a:blip r:embed="rId14" cstate="print">
+                      <a:extLst>
+                        <a:ext uri="{28A0092B-C50C-407E-A947-70E740481C1C}">
+                          <a14:useLocalDpi xmlns:a14="http://schemas.microsoft.com/office/drawing/2010/main" val="0"/>
+                        </a:ext>
+                      </a:extLst>
+                    </a:blip>
+                    <a:stretch>
+                      <a:fillRect/>
+                    </a:stretch>
+                  </pic:blipFill>
+                  <pic:spPr>
+                    <a:xfrm>
+                      <a:off x="0" y="0"/>
+                      <a:ext cx="5612130" cy="2665730"/>
+                    </a:xfrm>
+                    <a:prstGeom prst="rect">
+                      <a:avLst/>
+                    </a:prstGeom>
+                  </pic:spPr>
+                </pic:pic>
+              </a:graphicData>
+            </a:graphic>
+          </wp:inline>
+        </w:drawing>
+      </w:r>
+    </w:p>
+    <w:p>
+      <w:pPr>
+        <w:spacing w:line="240" w:lineRule="auto"/>
+        <w:rPr>
+          <w:rFonts w:ascii="Arial" w:hAnsi="Arial" w:cs="Arial"/>
+          <w:sz w:val="24"/>
+        </w:rPr>
+      </w:pPr>
+      <w:r>
+        <w:rPr>
+          <w:rFonts w:ascii="Arial" w:hAnsi="Arial" w:cs="Arial"/>
+          <w:sz w:val="24"/>
+        </w:rPr>
+        <w:t>*</w:t>
+      </w:r>
+      <w:r>
+        <w:rPr>
+          <w:rFonts w:ascii="Arial" w:hAnsi="Arial" w:cs="Arial"/>
+          <w:sz w:val="24"/>
+        </w:rPr>
+        <w:t xml:space="preserve">Corregido: Ahora los resultados para la respuesta de cada </w:t>
+      </w:r>
+      <w:proofErr w:type="spellStart"/>
+      <w:r>
+        <w:rPr>
+          <w:rFonts w:ascii="Arial" w:hAnsi="Arial" w:cs="Arial"/>
+          <w:sz w:val="24"/>
+        </w:rPr>
+        <w:t>leccion</w:t>
+      </w:r>
+      <w:proofErr w:type="spellEnd"/>
+      <w:r>
+        <w:rPr>
+          <w:rFonts w:ascii="Arial" w:hAnsi="Arial" w:cs="Arial"/>
+          <w:sz w:val="24"/>
+        </w:rPr>
+        <w:t xml:space="preserve"> guarda todas las respuestas estructuradas, no solo score. Variable </w:t>
+      </w:r>
+      <w:proofErr w:type="spellStart"/>
+      <w:r>
+        <w:rPr>
+          <w:rFonts w:ascii="Arial" w:hAnsi="Arial" w:cs="Arial"/>
+          <w:sz w:val="24"/>
+        </w:rPr>
+        <w:t>resultado_json</w:t>
+      </w:r>
+      <w:proofErr w:type="spellEnd"/>
+      <w:r>
+        <w:rPr>
+          <w:rFonts w:ascii="Arial" w:hAnsi="Arial" w:cs="Arial"/>
+          <w:sz w:val="24"/>
+        </w:rPr>
+        <w:t xml:space="preserve"> cambia.</w:t>
+      </w:r>
+    </w:p>
+    <w:p>
+      <w:pPr>
+        <w:spacing w:line="240" w:lineRule="auto"/>
+        <w:rPr>
+          <w:rFonts w:ascii="Arial" w:hAnsi="Arial" w:cs="Arial"/>
+          <w:sz w:val="24"/>
+        </w:rPr>
+      </w:pPr>
+      <w:r>
+        <w:rPr>
+          <w:rFonts w:ascii="Arial" w:hAnsi="Arial" w:cs="Arial"/>
+          <w:noProof/>
+          <w:sz w:val="24"/>
+          <w:lang w:eastAsia="es-MX"/>
+        </w:rPr>
+        <w:lastRenderedPageBreak/>
+        <w:drawing>
+          <wp:inline distT="0" distB="0" distL="0" distR="0" wp14:anchorId="496D5624" wp14:editId="028E926D">
+            <wp:extent cx="5612130" cy="2676525"/>
+            <wp:effectExtent l="0" t="0" r="7620" b="9525"/>
+            <wp:docPr id="12" name="Imagen 12"/>
+            <wp:cNvGraphicFramePr>
+              <a:graphicFrameLocks xmlns:a="http://schemas.openxmlformats.org/drawingml/2006/main" noChangeAspect="1"/>
+            </wp:cNvGraphicFramePr>
+            <a:graphic xmlns:a="http://schemas.openxmlformats.org/drawingml/2006/main">
+              <a:graphicData uri="http://schemas.openxmlformats.org/drawingml/2006/picture">
+                <pic:pic xmlns:pic="http://schemas.openxmlformats.org/drawingml/2006/picture">
+                  <pic:nvPicPr>
+                    <pic:cNvPr id="12" name="WhatsApp Image 2026-04-13 at 6.32.06 PM (1).jpeg"/>
+                    <pic:cNvPicPr/>
+                  </pic:nvPicPr>
+                  <pic:blipFill>
+                    <a:blip r:embed="rId15" cstate="print">
+                      <a:extLst>
+                        <a:ext uri="{28A0092B-C50C-407E-A947-70E740481C1C}">
+                          <a14:useLocalDpi xmlns:a14="http://schemas.microsoft.com/office/drawing/2010/main" val="0"/>
+                        </a:ext>
+                      </a:extLst>
+                    </a:blip>
+                    <a:stretch>
+                      <a:fillRect/>
+                    </a:stretch>
+                  </pic:blipFill>
+                  <pic:spPr>
+                    <a:xfrm>
+                      <a:off x="0" y="0"/>
+                      <a:ext cx="5612130" cy="2676525"/>
+                    </a:xfrm>
+                    <a:prstGeom prst="rect">
+                      <a:avLst/>
+                    </a:prstGeom>
+                  </pic:spPr>
+                </pic:pic>
+              </a:graphicData>
+            </a:graphic>
+          </wp:inline>
+        </w:drawing>
+      </w:r>
+    </w:p>
+    <w:p>
+      <w:pPr>
+        <w:spacing w:line="240" w:lineRule="auto"/>
+        <w:rPr>
+          <w:rFonts w:ascii="Arial" w:hAnsi="Arial" w:cs="Arial"/>
+          <w:sz w:val="24"/>
+        </w:rPr>
+      </w:pPr>
+      <w:r>
+        <w:rPr>
+          <w:rFonts w:ascii="Arial" w:hAnsi="Arial" w:cs="Arial"/>
+          <w:sz w:val="24"/>
+        </w:rPr>
+        <w:t>*</w:t>
+      </w:r>
+      <w:r>
+        <w:rPr>
+          <w:rFonts w:ascii="Arial" w:hAnsi="Arial" w:cs="Arial"/>
+          <w:sz w:val="24"/>
+        </w:rPr>
+        <w:t>Error: Las lecciones no se guardaban an</w:t>
+      </w:r>
+      <w:r>
+        <w:rPr>
+          <w:rFonts w:ascii="Arial" w:hAnsi="Arial" w:cs="Arial"/>
+          <w:sz w:val="24"/>
+        </w:rPr>
+        <w:t>teriormente. Error solucionado:</w:t>
+      </w:r>
+    </w:p>
+    <w:p>
+      <w:pPr>
+        <w:spacing w:line="240" w:lineRule="auto"/>
+        <w:rPr>
+          <w:rFonts w:ascii="Arial" w:hAnsi="Arial" w:cs="Arial"/>
+          <w:sz w:val="24"/>
+        </w:rPr>
+      </w:pPr>
+      <w:r>
+        <w:rPr>
+          <w:rFonts w:ascii="Arial" w:hAnsi="Arial" w:cs="Arial"/>
+          <w:sz w:val="24"/>
+        </w:rPr>
+        <w:t xml:space="preserve">api.js — Agregado interceptor de </w:t>
+      </w:r>
+      <w:proofErr w:type="spellStart"/>
+      <w:r>
+        <w:rPr>
+          <w:rFonts w:ascii="Arial" w:hAnsi="Arial" w:cs="Arial"/>
+          <w:sz w:val="24"/>
+        </w:rPr>
+        <w:t>request</w:t>
+      </w:r>
+      <w:proofErr w:type="spellEnd"/>
+      <w:r>
+        <w:rPr>
+          <w:rFonts w:ascii="Arial" w:hAnsi="Arial" w:cs="Arial"/>
+          <w:sz w:val="24"/>
+        </w:rPr>
+        <w:t xml:space="preserve"> que lee el </w:t>
+      </w:r>
+      <w:proofErr w:type="spellStart"/>
+      <w:r>
+        <w:rPr>
+          <w:rFonts w:ascii="Arial" w:hAnsi="Arial" w:cs="Arial"/>
+          <w:sz w:val="24"/>
+        </w:rPr>
+        <w:t>token</w:t>
+      </w:r>
+      <w:proofErr w:type="spellEnd"/>
+      <w:r>
+        <w:rPr>
+          <w:rFonts w:ascii="Arial" w:hAnsi="Arial" w:cs="Arial"/>
+          <w:sz w:val="24"/>
+        </w:rPr>
+        <w:t xml:space="preserve"> de </w:t>
+      </w:r>
+      <w:proofErr w:type="spellStart"/>
+      <w:r>
+        <w:rPr>
+          <w:rFonts w:ascii="Arial" w:hAnsi="Arial" w:cs="Arial"/>
+          <w:sz w:val="24"/>
+        </w:rPr>
+        <w:t>localStorage</w:t>
+      </w:r>
+      <w:proofErr w:type="spellEnd"/>
+      <w:r>
+        <w:rPr>
+          <w:rFonts w:ascii="Arial" w:hAnsi="Arial" w:cs="Arial"/>
+          <w:sz w:val="24"/>
+        </w:rPr>
+        <w:t xml:space="preserve"> antes de cada llamada</w:t>
+      </w:r>
+    </w:p>
+    <w:p>
+      <w:pPr>
+        <w:spacing w:line="240" w:lineRule="auto"/>
+        <w:rPr>
+          <w:rFonts w:ascii="Arial" w:hAnsi="Arial" w:cs="Arial"/>
+          <w:sz w:val="24"/>
+        </w:rPr>
+      </w:pPr>
+      <w:proofErr w:type="spellStart"/>
+      <w:r>
+        <w:rPr>
+          <w:rFonts w:ascii="Arial" w:hAnsi="Arial" w:cs="Arial"/>
+          <w:sz w:val="24"/>
+        </w:rPr>
+        <w:t>LessonExercise.jsx</w:t>
+      </w:r>
+      <w:proofErr w:type="spellEnd"/>
+      <w:r>
+        <w:rPr>
+          <w:rFonts w:ascii="Arial" w:hAnsi="Arial" w:cs="Arial"/>
+          <w:sz w:val="24"/>
+        </w:rPr>
+        <w:t xml:space="preserve"> — Ahora muestra un mensaje de error + botón "Reintentar" si el guardado falla</w:t>
+      </w:r>
+      <w:r>
+        <w:rPr>
+          <w:rFonts w:ascii="Arial" w:hAnsi="Arial" w:cs="Arial"/>
+          <w:noProof/>
+          <w:sz w:val="24"/>
+          <w:lang w:eastAsia="es-MX"/>
+        </w:rPr>
+        <w:drawing>
+          <wp:inline distT="0" distB="0" distL="0" distR="0" wp14:anchorId="49046BBA" wp14:editId="49A5A3CC">
+            <wp:extent cx="5612130" cy="2623820"/>
+            <wp:effectExtent l="0" t="0" r="7620" b="5080"/>
+            <wp:docPr id="13" name="Imagen 13"/>
+            <wp:cNvGraphicFramePr>
+              <a:graphicFrameLocks xmlns:a="http://schemas.openxmlformats.org/drawingml/2006/main" noChangeAspect="1"/>
+            </wp:cNvGraphicFramePr>
+            <a:graphic xmlns:a="http://schemas.openxmlformats.org/drawingml/2006/main">
+              <a:graphicData uri="http://schemas.openxmlformats.org/drawingml/2006/picture">
+                <pic:pic xmlns:pic="http://schemas.openxmlformats.org/drawingml/2006/picture">
+                  <pic:nvPicPr>
+                    <pic:cNvPr id="13" name="WhatsApp Image 2026-04-13 at 9.58.43 PM.jpeg"/>
+                    <pic:cNvPicPr/>
+                  </pic:nvPicPr>
+                  <pic:blipFill>
+                    <a:blip r:embed="rId16" cstate="print">
+                      <a:extLst>
+                        <a:ext uri="{28A0092B-C50C-407E-A947-70E740481C1C}">
+                          <a14:useLocalDpi xmlns:a14="http://schemas.microsoft.com/office/drawing/2010/main" val="0"/>
+                        </a:ext>
+                      </a:extLst>
+                    </a:blip>
+                    <a:stretch>
+                      <a:fillRect/>
+                    </a:stretch>
+                  </pic:blipFill>
+                  <pic:spPr>
+                    <a:xfrm>
+                      <a:off x="0" y="0"/>
+                      <a:ext cx="5612130" cy="2623820"/>
+                    </a:xfrm>
+                    <a:prstGeom prst="rect">
+                      <a:avLst/>
+                    </a:prstGeom>
+                  </pic:spPr>
+                </pic:pic>
+              </a:graphicData>
+            </a:graphic>
+          </wp:inline>
+        </w:drawing>
+      </w:r>
+    </w:p>
+    <w:p>
+      <w:pPr>
+        <w:spacing w:line="240" w:lineRule="auto"/>
+        <w:rPr>
+          <w:rFonts w:ascii="Arial" w:hAnsi="Arial" w:cs="Arial"/>
+          <w:sz w:val="24"/>
+        </w:rPr>
+      </w:pPr>
+      <w:r>
+        <w:rPr>
+          <w:rFonts w:ascii="Arial" w:hAnsi="Arial" w:cs="Arial"/>
+          <w:noProof/>
+          <w:sz w:val="24"/>
+          <w:lang w:eastAsia="es-MX"/>
+        </w:rPr>
+        <w:lastRenderedPageBreak/>
+        <w:drawing>
+          <wp:inline distT="0" distB="0" distL="0" distR="0" wp14:anchorId="27849BB3" wp14:editId="2555DC8C">
+            <wp:extent cx="5612130" cy="2644775"/>
+            <wp:effectExtent l="0" t="0" r="7620" b="3175"/>
+            <wp:docPr id="14" name="Imagen 14"/>
+            <wp:cNvGraphicFramePr>
+              <a:graphicFrameLocks xmlns:a="http://schemas.openxmlformats.org/drawingml/2006/main" noChangeAspect="1"/>
+            </wp:cNvGraphicFramePr>
+            <a:graphic xmlns:a="http://schemas.openxmlformats.org/drawingml/2006/main">
+              <a:graphicData uri="http://schemas.openxmlformats.org/drawingml/2006/picture">
+                <pic:pic xmlns:pic="http://schemas.openxmlformats.org/drawingml/2006/picture">
+                  <pic:nvPicPr>
+                    <pic:cNvPr id="14" name="WhatsApp Image 2026-04-13 at 9.58.35 PM.jpeg"/>
+                    <pic:cNvPicPr/>
+                  </pic:nvPicPr>
+                  <pic:blipFill>
+                    <a:blip r:embed="rId17" cstate="print">
+                      <a:extLst>
+                        <a:ext uri="{28A0092B-C50C-407E-A947-70E740481C1C}">
+                          <a14:useLocalDpi xmlns:a14="http://schemas.microsoft.com/office/drawing/2010/main" val="0"/>
+                        </a:ext>
+                      </a:extLst>
+                    </a:blip>
+                    <a:stretch>
+                      <a:fillRect/>
+                    </a:stretch>
+                  </pic:blipFill>
+                  <pic:spPr>
+                    <a:xfrm>
+                      <a:off x="0" y="0"/>
+                      <a:ext cx="5612130" cy="2644775"/>
+                    </a:xfrm>
+                    <a:prstGeom prst="rect">
+                      <a:avLst/>
+                    </a:prstGeom>
+                  </pic:spPr>
+                </pic:pic>
+              </a:graphicData>
+            </a:graphic>
+          </wp:inline>
+        </w:drawing>
+      </w:r>
+      <w:r>
+        <w:rPr>
+          <w:rFonts w:ascii="Arial" w:hAnsi="Arial" w:cs="Arial"/>
+          <w:noProof/>
+          <w:sz w:val="24"/>
+          <w:lang w:eastAsia="es-MX"/>
+        </w:rPr>
+        <w:drawing>
+          <wp:inline distT="0" distB="0" distL="0" distR="0">
+            <wp:extent cx="5612130" cy="2799080"/>
+            <wp:effectExtent l="0" t="0" r="7620" b="1270"/>
+            <wp:docPr id="15" name="Imagen 15"/>
+            <wp:cNvGraphicFramePr>
+              <a:graphicFrameLocks xmlns:a="http://schemas.openxmlformats.org/drawingml/2006/main" noChangeAspect="1"/>
+            </wp:cNvGraphicFramePr>
+            <a:graphic xmlns:a="http://schemas.openxmlformats.org/drawingml/2006/main">
+              <a:graphicData uri="http://schemas.openxmlformats.org/drawingml/2006/picture">
+                <pic:pic xmlns:pic="http://schemas.openxmlformats.org/drawingml/2006/picture">
+                  <pic:nvPicPr>
+                    <pic:cNvPr id="15" name="WhatsApp Image 2026-04-13 at 9.58.23 PM.jpeg"/>
+                    <pic:cNvPicPr/>
+                  </pic:nvPicPr>
+                  <pic:blipFill>
+                    <a:blip r:embed="rId18" cstate="print">
+                      <a:extLst>
+                        <a:ext uri="{28A0092B-C50C-407E-A947-70E740481C1C}">
+                          <a14:useLocalDpi xmlns:a14="http://schemas.microsoft.com/office/drawing/2010/main" val="0"/>
+                        </a:ext>
+                      </a:extLst>
+                    </a:blip>
+                    <a:stretch>
+                      <a:fillRect/>
+                    </a:stretch>
+                  </pic:blipFill>
+                  <pic:spPr>
+                    <a:xfrm>
+                      <a:off x="0" y="0"/>
+                      <a:ext cx="5612130" cy="2799080"/>
+                    </a:xfrm>
+                    <a:prstGeom prst="rect">
+                      <a:avLst/>
+                    </a:prstGeom>
+                  </pic:spPr>
+                </pic:pic>
+              </a:graphicData>
+            </a:graphic>
+          </wp:inline>
+        </w:drawing>
+      </w:r>
+      <w:r>
+        <w:rPr>
+          <w:rFonts w:ascii="Arial" w:hAnsi="Arial" w:cs="Arial"/>
+          <w:sz w:val="24"/>
+        </w:rPr>
+        <w:t>*S</w:t>
+      </w:r>
+      <w:r>
+        <w:rPr>
+          <w:rFonts w:ascii="Arial" w:hAnsi="Arial" w:cs="Arial"/>
+          <w:sz w:val="24"/>
+        </w:rPr>
+        <w:t>istema completo de es</w:t>
+      </w:r>
+      <w:r>
+        <w:rPr>
+          <w:rFonts w:ascii="Arial" w:hAnsi="Arial" w:cs="Arial"/>
+          <w:sz w:val="24"/>
+        </w:rPr>
+        <w:t>tadísticas (</w:t>
+      </w:r>
+      <w:proofErr w:type="spellStart"/>
+      <w:r>
+        <w:rPr>
+          <w:rFonts w:ascii="Arial" w:hAnsi="Arial" w:cs="Arial"/>
+          <w:sz w:val="24"/>
+        </w:rPr>
+        <w:t>backend</w:t>
+      </w:r>
+      <w:proofErr w:type="spellEnd"/>
+      <w:r>
+        <w:rPr>
+          <w:rFonts w:ascii="Arial" w:hAnsi="Arial" w:cs="Arial"/>
+          <w:sz w:val="24"/>
+        </w:rPr>
+        <w:t xml:space="preserve"> + </w:t>
+      </w:r>
+      <w:proofErr w:type="spellStart"/>
+      <w:r>
+        <w:rPr>
+          <w:rFonts w:ascii="Arial" w:hAnsi="Arial" w:cs="Arial"/>
+          <w:sz w:val="24"/>
+        </w:rPr>
+        <w:t>frontend</w:t>
+      </w:r>
+      <w:proofErr w:type="spellEnd"/>
+      <w:r>
+        <w:rPr>
+          <w:rFonts w:ascii="Arial" w:hAnsi="Arial" w:cs="Arial"/>
+          <w:sz w:val="24"/>
+        </w:rPr>
+        <w:t>)</w:t>
+      </w:r>
+    </w:p>
+    <w:p>
+      <w:pPr>
+        <w:spacing w:line="240" w:lineRule="auto"/>
+        <w:rPr>
+          <w:rFonts w:ascii="Arial" w:hAnsi="Arial" w:cs="Arial"/>
+          <w:sz w:val="24"/>
+        </w:rPr>
+      </w:pPr>
+      <w:r>
+        <w:rPr>
+          <w:rFonts w:ascii="Arial" w:hAnsi="Arial" w:cs="Arial"/>
+          <w:sz w:val="24"/>
+        </w:rPr>
+        <w:t xml:space="preserve">- </w:t>
+      </w:r>
+      <w:proofErr w:type="spellStart"/>
+      <w:r>
+        <w:rPr>
+          <w:rFonts w:ascii="Arial" w:hAnsi="Arial" w:cs="Arial"/>
+          <w:sz w:val="24"/>
+        </w:rPr>
+        <w:t>Backend</w:t>
+      </w:r>
+      <w:proofErr w:type="spellEnd"/>
+      <w:r>
+        <w:rPr>
+          <w:rFonts w:ascii="Arial" w:hAnsi="Arial" w:cs="Arial"/>
+          <w:sz w:val="24"/>
+        </w:rPr>
+        <w:t xml:space="preserve"> (main.py):</w:t>
+      </w:r>
+    </w:p>
+    <w:p>
+      <w:pPr>
+        <w:spacing w:line="240" w:lineRule="auto"/>
+        <w:rPr>
+          <w:rFonts w:ascii="Arial" w:hAnsi="Arial" w:cs="Arial"/>
+          <w:sz w:val="24"/>
+        </w:rPr>
+      </w:pPr>
+      <w:r>
+        <w:rPr>
+          <w:rFonts w:ascii="Arial" w:hAnsi="Arial" w:cs="Arial"/>
+          <w:sz w:val="24"/>
+        </w:rPr>
+        <w:t xml:space="preserve">  - Nuevo </w:t>
+      </w:r>
+      <w:proofErr w:type="spellStart"/>
+      <w:r>
+        <w:rPr>
+          <w:rFonts w:ascii="Arial" w:hAnsi="Arial" w:cs="Arial"/>
+          <w:sz w:val="24"/>
+        </w:rPr>
+        <w:t>endpoint</w:t>
+      </w:r>
+      <w:proofErr w:type="spellEnd"/>
+      <w:r>
+        <w:rPr>
+          <w:rFonts w:ascii="Arial" w:hAnsi="Arial" w:cs="Arial"/>
+          <w:sz w:val="24"/>
+        </w:rPr>
+        <w:t xml:space="preserve"> protegido con JWT: GET /api/</w:t>
+      </w:r>
+      <w:proofErr w:type="spellStart"/>
+      <w:r>
+        <w:rPr>
+          <w:rFonts w:ascii="Arial" w:hAnsi="Arial" w:cs="Arial"/>
+          <w:sz w:val="24"/>
+        </w:rPr>
+        <w:t>estadisticas</w:t>
+      </w:r>
+      <w:proofErr w:type="spellEnd"/>
+    </w:p>
+    <w:p>
+      <w:pPr>
+        <w:spacing w:line="240" w:lineRule="auto"/>
+        <w:rPr>
+          <w:rFonts w:ascii="Arial" w:hAnsi="Arial" w:cs="Arial"/>
+          <w:sz w:val="24"/>
+        </w:rPr>
+      </w:pPr>
+      <w:r>
+        <w:rPr>
+          <w:rFonts w:ascii="Arial" w:hAnsi="Arial" w:cs="Arial"/>
+          <w:sz w:val="24"/>
+        </w:rPr>
+        <w:t xml:space="preserve">  - Retorna:</w:t>
+      </w:r>
+    </w:p>
+    <w:p>
+      <w:pPr>
+        <w:spacing w:line="240" w:lineRule="auto"/>
+        <w:rPr>
+          <w:rFonts w:ascii="Arial" w:hAnsi="Arial" w:cs="Arial"/>
+          <w:sz w:val="24"/>
+        </w:rPr>
+      </w:pPr>
+      <w:r>
+        <w:rPr>
+          <w:rFonts w:ascii="Arial" w:hAnsi="Arial" w:cs="Arial"/>
+          <w:sz w:val="24"/>
+        </w:rPr>
+        <w:t xml:space="preserve">    - </w:t>
+      </w:r>
+      <w:proofErr w:type="spellStart"/>
+      <w:r>
+        <w:rPr>
+          <w:rFonts w:ascii="Arial" w:hAnsi="Arial" w:cs="Arial"/>
+          <w:sz w:val="24"/>
+        </w:rPr>
+        <w:t>weekly_activity</w:t>
+      </w:r>
+      <w:proofErr w:type="spellEnd"/>
+      <w:r>
+        <w:rPr>
+          <w:rFonts w:ascii="Arial" w:hAnsi="Arial" w:cs="Arial"/>
+          <w:sz w:val="24"/>
+        </w:rPr>
+        <w:t xml:space="preserve"> (7 días con lecciones, </w:t>
+      </w:r>
+      <w:proofErr w:type="spellStart"/>
+      <w:r>
+        <w:rPr>
+          <w:rFonts w:ascii="Arial" w:hAnsi="Arial" w:cs="Arial"/>
+          <w:sz w:val="24"/>
+        </w:rPr>
+        <w:t>avg_score</w:t>
+      </w:r>
+      <w:proofErr w:type="spellEnd"/>
+      <w:r>
+        <w:rPr>
+          <w:rFonts w:ascii="Arial" w:hAnsi="Arial" w:cs="Arial"/>
+          <w:sz w:val="24"/>
+        </w:rPr>
+        <w:t xml:space="preserve"> y </w:t>
+      </w:r>
+      <w:proofErr w:type="spellStart"/>
+      <w:r>
+        <w:rPr>
+          <w:rFonts w:ascii="Arial" w:hAnsi="Arial" w:cs="Arial"/>
+          <w:sz w:val="24"/>
+        </w:rPr>
+        <w:t>day_name</w:t>
+      </w:r>
+      <w:proofErr w:type="spellEnd"/>
+      <w:r>
+        <w:rPr>
+          <w:rFonts w:ascii="Arial" w:hAnsi="Arial" w:cs="Arial"/>
+          <w:sz w:val="24"/>
+        </w:rPr>
+        <w:t>)</w:t>
+      </w:r>
+    </w:p>
+    <w:p>
+      <w:pPr>
+        <w:spacing w:line="240" w:lineRule="auto"/>
+        <w:rPr>
+          <w:rFonts w:ascii="Arial" w:hAnsi="Arial" w:cs="Arial"/>
+          <w:sz w:val="24"/>
+        </w:rPr>
+      </w:pPr>
+      <w:r>
+        <w:rPr>
+          <w:rFonts w:ascii="Arial" w:hAnsi="Arial" w:cs="Arial"/>
+          <w:sz w:val="24"/>
+        </w:rPr>
+        <w:t xml:space="preserve">    - </w:t>
+      </w:r>
+      <w:proofErr w:type="spellStart"/>
+      <w:r>
+        <w:rPr>
+          <w:rFonts w:ascii="Arial" w:hAnsi="Arial" w:cs="Arial"/>
+          <w:sz w:val="24"/>
+        </w:rPr>
+        <w:t>summary</w:t>
+      </w:r>
+      <w:proofErr w:type="spellEnd"/>
+      <w:r>
+        <w:rPr>
+          <w:rFonts w:ascii="Arial" w:hAnsi="Arial" w:cs="Arial"/>
+          <w:sz w:val="24"/>
+        </w:rPr>
+        <w:t xml:space="preserve"> (totales, promedio, mejor puntaje, favoritos)</w:t>
+      </w:r>
+    </w:p>
+    <w:p>
+      <w:pPr>
+        <w:spacing w:line="240" w:lineRule="auto"/>
+        <w:rPr>
+          <w:rFonts w:ascii="Arial" w:hAnsi="Arial" w:cs="Arial"/>
+          <w:sz w:val="24"/>
+        </w:rPr>
+      </w:pPr>
+      <w:r>
+        <w:rPr>
+          <w:rFonts w:ascii="Arial" w:hAnsi="Arial" w:cs="Arial"/>
+          <w:sz w:val="24"/>
+        </w:rPr>
+        <w:t xml:space="preserve">    - </w:t>
+      </w:r>
+      <w:proofErr w:type="spellStart"/>
+      <w:r>
+        <w:rPr>
+          <w:rFonts w:ascii="Arial" w:hAnsi="Arial" w:cs="Arial"/>
+          <w:sz w:val="24"/>
+        </w:rPr>
+        <w:t>per_language</w:t>
+      </w:r>
+      <w:proofErr w:type="spellEnd"/>
+      <w:r>
+        <w:rPr>
+          <w:rFonts w:ascii="Arial" w:hAnsi="Arial" w:cs="Arial"/>
+          <w:sz w:val="24"/>
+        </w:rPr>
+        <w:t xml:space="preserve">, </w:t>
+      </w:r>
+      <w:proofErr w:type="spellStart"/>
+      <w:r>
+        <w:rPr>
+          <w:rFonts w:ascii="Arial" w:hAnsi="Arial" w:cs="Arial"/>
+          <w:sz w:val="24"/>
+        </w:rPr>
+        <w:t>per_topic</w:t>
+      </w:r>
+      <w:proofErr w:type="spellEnd"/>
+      <w:r>
+        <w:rPr>
+          <w:rFonts w:ascii="Arial" w:hAnsi="Arial" w:cs="Arial"/>
+          <w:sz w:val="24"/>
+        </w:rPr>
+        <w:t xml:space="preserve">, </w:t>
+      </w:r>
+      <w:proofErr w:type="spellStart"/>
+      <w:r>
+        <w:rPr>
+          <w:rFonts w:ascii="Arial" w:hAnsi="Arial" w:cs="Arial"/>
+          <w:sz w:val="24"/>
+        </w:rPr>
+        <w:t>per_type</w:t>
+      </w:r>
+      <w:proofErr w:type="spellEnd"/>
+      <w:r>
+        <w:rPr>
+          <w:rFonts w:ascii="Arial" w:hAnsi="Arial" w:cs="Arial"/>
+          <w:sz w:val="24"/>
+        </w:rPr>
+        <w:t xml:space="preserve"> (dis</w:t>
+      </w:r>
+      <w:r>
+        <w:rPr>
+          <w:rFonts w:ascii="Arial" w:hAnsi="Arial" w:cs="Arial"/>
+          <w:sz w:val="24"/>
+        </w:rPr>
+        <w:t>tribuciones)</w:t>
+      </w:r>
+    </w:p>
+    <w:p>
+      <w:pPr>
+        <w:spacing w:line="240" w:lineRule="auto"/>
+        <w:rPr>
+          <w:rFonts w:ascii="Arial" w:hAnsi="Arial" w:cs="Arial"/>
+          <w:sz w:val="24"/>
+        </w:rPr>
+      </w:pPr>
+      <w:r>
+        <w:rPr>
+          <w:rFonts w:ascii="Arial" w:hAnsi="Arial" w:cs="Arial"/>
+          <w:sz w:val="24"/>
+        </w:rPr>
+        <w:t xml:space="preserve">- </w:t>
+      </w:r>
+      <w:proofErr w:type="spellStart"/>
+      <w:r>
+        <w:rPr>
+          <w:rFonts w:ascii="Arial" w:hAnsi="Arial" w:cs="Arial"/>
+          <w:sz w:val="24"/>
+        </w:rPr>
+        <w:t>Frontend</w:t>
+      </w:r>
+      <w:proofErr w:type="spellEnd"/>
+      <w:r>
+        <w:rPr>
+          <w:rFonts w:ascii="Arial" w:hAnsi="Arial" w:cs="Arial"/>
+          <w:sz w:val="24"/>
+        </w:rPr>
+        <w:t>:</w:t>
+      </w:r>
+    </w:p>
+    <w:p>
+      <w:pPr>
+        <w:spacing w:line="240" w:lineRule="auto"/>
+        <w:rPr>
+          <w:rFonts w:ascii="Arial" w:hAnsi="Arial" w:cs="Arial"/>
+          <w:sz w:val="24"/>
+        </w:rPr>
+      </w:pPr>
+      <w:r>
+        <w:rPr>
+          <w:rFonts w:ascii="Arial" w:hAnsi="Arial" w:cs="Arial"/>
+          <w:sz w:val="24"/>
+        </w:rPr>
+        <w:t xml:space="preserve">  - Nueva página </w:t>
+      </w:r>
+      <w:proofErr w:type="spellStart"/>
+      <w:r>
+        <w:rPr>
+          <w:rFonts w:ascii="Arial" w:hAnsi="Arial" w:cs="Arial"/>
+          <w:sz w:val="24"/>
+        </w:rPr>
+        <w:t>StatsPage.jsx</w:t>
+      </w:r>
+      <w:proofErr w:type="spellEnd"/>
+      <w:r>
+        <w:rPr>
+          <w:rFonts w:ascii="Arial" w:hAnsi="Arial" w:cs="Arial"/>
+          <w:sz w:val="24"/>
+        </w:rPr>
+        <w:t xml:space="preserve"> con:</w:t>
+      </w:r>
+    </w:p>
+    <w:p>
+      <w:pPr>
+        <w:spacing w:line="240" w:lineRule="auto"/>
+        <w:rPr>
+          <w:rFonts w:ascii="Arial" w:hAnsi="Arial" w:cs="Arial"/>
+          <w:sz w:val="24"/>
+        </w:rPr>
+      </w:pPr>
+      <w:r>
+        <w:rPr>
+          <w:rFonts w:ascii="Arial" w:hAnsi="Arial" w:cs="Arial"/>
+          <w:sz w:val="24"/>
+        </w:rPr>
+        <w:t xml:space="preserve">    - Tarjetas resumen (total, completadas, pendientes, promedio, mejor)</w:t>
+      </w:r>
+    </w:p>
+    <w:p>
+      <w:pPr>
+        <w:spacing w:line="240" w:lineRule="auto"/>
+        <w:rPr>
+          <w:rFonts w:ascii="Arial" w:hAnsi="Arial" w:cs="Arial"/>
+          <w:sz w:val="24"/>
+        </w:rPr>
+      </w:pPr>
+      <w:r>
+        <w:rPr>
+          <w:rFonts w:ascii="Arial" w:hAnsi="Arial" w:cs="Arial"/>
+          <w:sz w:val="24"/>
+        </w:rPr>
+        <w:lastRenderedPageBreak/>
+        <w:t xml:space="preserve">    - Indicadores de favoritos (tema, tipo de ejercicio)</w:t>
+      </w:r>
+    </w:p>
+    <w:p>
+      <w:pPr>
+        <w:spacing w:line="240" w:lineRule="auto"/>
+        <w:rPr>
+          <w:rFonts w:ascii="Arial" w:hAnsi="Arial" w:cs="Arial"/>
+          <w:sz w:val="24"/>
+        </w:rPr>
+      </w:pPr>
+      <w:r>
+        <w:rPr>
+          <w:rFonts w:ascii="Arial" w:hAnsi="Arial" w:cs="Arial"/>
+          <w:sz w:val="24"/>
+        </w:rPr>
+        <w:t xml:space="preserve">    - Gráfica semanal (barras con CSS, sin librerías)</w:t>
+      </w:r>
+    </w:p>
+    <w:p>
+      <w:pPr>
+        <w:spacing w:line="240" w:lineRule="auto"/>
+        <w:rPr>
+          <w:rFonts w:ascii="Arial" w:hAnsi="Arial" w:cs="Arial"/>
+          <w:sz w:val="24"/>
+        </w:rPr>
+      </w:pPr>
+      <w:r>
+        <w:rPr>
+          <w:rFonts w:ascii="Arial" w:hAnsi="Arial" w:cs="Arial"/>
+          <w:sz w:val="24"/>
+        </w:rPr>
+        <w:t xml:space="preserve">    - Barras de progreso/distribución (idioma, tema, tipo)</w:t>
+      </w:r>
+    </w:p>
+    <w:p>
+      <w:pPr>
+        <w:spacing w:line="240" w:lineRule="auto"/>
+        <w:rPr>
+          <w:rFonts w:ascii="Arial" w:hAnsi="Arial" w:cs="Arial"/>
+          <w:sz w:val="24"/>
+        </w:rPr>
+      </w:pPr>
+      <w:r>
+        <w:rPr>
+          <w:rFonts w:ascii="Arial" w:hAnsi="Arial" w:cs="Arial"/>
+          <w:sz w:val="24"/>
+        </w:rPr>
+        <w:t xml:space="preserve">    - Es</w:t>
+      </w:r>
+      <w:r>
+        <w:rPr>
+          <w:rFonts w:ascii="Arial" w:hAnsi="Arial" w:cs="Arial"/>
+          <w:sz w:val="24"/>
+        </w:rPr>
+        <w:t>tado vacío para usuarios nuevos</w:t>
+      </w:r>
+    </w:p>
+    <w:p>
+      <w:pPr>
+        <w:spacing w:line="240" w:lineRule="auto"/>
+        <w:rPr>
+          <w:rFonts w:ascii="Arial" w:hAnsi="Arial" w:cs="Arial"/>
+          <w:sz w:val="24"/>
+        </w:rPr>
+      </w:pPr>
+      <w:r>
+        <w:rPr>
+          <w:rFonts w:ascii="Arial" w:hAnsi="Arial" w:cs="Arial"/>
+          <w:sz w:val="24"/>
+        </w:rPr>
+        <w:t xml:space="preserve">- </w:t>
+      </w:r>
+      <w:proofErr w:type="spellStart"/>
+      <w:r>
+        <w:rPr>
+          <w:rFonts w:ascii="Arial" w:hAnsi="Arial" w:cs="Arial"/>
+          <w:sz w:val="24"/>
+        </w:rPr>
+        <w:t>App.jsx</w:t>
+      </w:r>
+      <w:proofErr w:type="spellEnd"/>
+      <w:r>
+        <w:rPr>
+          <w:rFonts w:ascii="Arial" w:hAnsi="Arial" w:cs="Arial"/>
+          <w:sz w:val="24"/>
+        </w:rPr>
+        <w:t>:</w:t>
+      </w:r>
+    </w:p>
+    <w:p>
+      <w:pPr>
+        <w:spacing w:line="240" w:lineRule="auto"/>
+        <w:rPr>
+          <w:rFonts w:ascii="Arial" w:hAnsi="Arial" w:cs="Arial"/>
+          <w:sz w:val="24"/>
+        </w:rPr>
+      </w:pPr>
+      <w:r>
+        <w:rPr>
+          <w:rFonts w:ascii="Arial" w:hAnsi="Arial" w:cs="Arial"/>
+          <w:sz w:val="24"/>
+        </w:rPr>
+        <w:t xml:space="preserve">  - Ruta p</w:t>
+      </w:r>
+      <w:r>
+        <w:rPr>
+          <w:rFonts w:ascii="Arial" w:hAnsi="Arial" w:cs="Arial"/>
+          <w:sz w:val="24"/>
+        </w:rPr>
+        <w:t>rotegida añadida: /</w:t>
+      </w:r>
+      <w:proofErr w:type="spellStart"/>
+      <w:r>
+        <w:rPr>
+          <w:rFonts w:ascii="Arial" w:hAnsi="Arial" w:cs="Arial"/>
+          <w:sz w:val="24"/>
+        </w:rPr>
+        <w:t>estadisticas</w:t>
       </w:r>
       <w:bookmarkStart w:id="0" w:name="_GoBack"/>
       <w:bookmarkEnd w:id="0"/>
-      <w:r>
-        <w:rPr>
-          <w:rFonts w:ascii="Arial" w:hAnsi="Arial" w:cs="Arial"/>
-          <w:sz w:val="24"/>
-        </w:rPr>
-        <w:t>POST/DELETE /api/chat/</w:t>
-      </w:r>
-      <w:proofErr w:type="spellStart"/>
-      <w:proofErr w:type="gramStart"/>
-      <w:r>
-        <w:rPr>
-          <w:rFonts w:ascii="Arial" w:hAnsi="Arial" w:cs="Arial"/>
-          <w:sz w:val="24"/>
-        </w:rPr>
-        <w:t>conversacion</w:t>
-      </w:r>
-      <w:proofErr w:type="spellEnd"/>
-      <w:r>
-        <w:rPr>
-          <w:rFonts w:ascii="Arial" w:hAnsi="Arial" w:cs="Arial"/>
-          <w:sz w:val="24"/>
-        </w:rPr>
-        <w:t>[</w:t>
-      </w:r>
-      <w:proofErr w:type="gramEnd"/>
-      <w:r>
-        <w:rPr>
-          <w:rFonts w:ascii="Arial" w:hAnsi="Arial" w:cs="Arial"/>
-          <w:sz w:val="24"/>
-        </w:rPr>
-        <w:t>es]</w:t>
-      </w:r>
-    </w:p>
-    <w:p>
-      <w:pPr>
-        <w:spacing w:line="240" w:lineRule="auto"/>
-        <w:rPr>
-          <w:rFonts w:ascii="Arial" w:hAnsi="Arial" w:cs="Arial"/>
-          <w:sz w:val="24"/>
-        </w:rPr>
-      </w:pPr>
-      <w:proofErr w:type="spellStart"/>
-      <w:r>
-        <w:rPr>
-          <w:rFonts w:ascii="Arial" w:hAnsi="Arial" w:cs="Arial"/>
-          <w:sz w:val="24"/>
-        </w:rPr>
-        <w:t>chat_local</w:t>
-      </w:r>
-      <w:proofErr w:type="spellEnd"/>
-      <w:r>
-        <w:rPr>
-          <w:rFonts w:ascii="Arial" w:hAnsi="Arial" w:cs="Arial"/>
-          <w:sz w:val="24"/>
-        </w:rPr>
-        <w:t xml:space="preserve"> reescrito: envía los últimos 6 mensajes como contexto al LLM y asocia cada mensaje a una conversación</w:t>
-      </w:r>
-    </w:p>
-    <w:p>
-      <w:pPr>
-        <w:spacing w:line="240" w:lineRule="auto"/>
-        <w:rPr>
-          <w:rFonts w:ascii="Arial" w:hAnsi="Arial" w:cs="Arial"/>
-          <w:sz w:val="24"/>
-        </w:rPr>
-      </w:pPr>
-      <w:proofErr w:type="spellStart"/>
-      <w:r>
-        <w:rPr>
-          <w:rFonts w:ascii="Arial" w:hAnsi="Arial" w:cs="Arial"/>
-          <w:sz w:val="24"/>
-        </w:rPr>
-        <w:t>Fron</w:t>
-      </w:r>
-      <w:r>
-        <w:rPr>
-          <w:rFonts w:ascii="Arial" w:hAnsi="Arial" w:cs="Arial"/>
-          <w:sz w:val="24"/>
-        </w:rPr>
-        <w:t>tend</w:t>
-      </w:r>
-      <w:proofErr w:type="spellEnd"/>
-      <w:r>
-        <w:rPr>
-          <w:rFonts w:ascii="Arial" w:hAnsi="Arial" w:cs="Arial"/>
-          <w:sz w:val="24"/>
-        </w:rPr>
-        <w:t xml:space="preserve"> (</w:t>
-      </w:r>
-      <w:proofErr w:type="spellStart"/>
-      <w:r>
-        <w:rPr>
-          <w:rFonts w:ascii="Arial" w:hAnsi="Arial" w:cs="Arial"/>
-          <w:sz w:val="24"/>
-        </w:rPr>
-        <w:t>ChatTutor.jsx</w:t>
-      </w:r>
-      <w:proofErr w:type="spellEnd"/>
-      <w:r>
-        <w:rPr>
-          <w:rFonts w:ascii="Arial" w:hAnsi="Arial" w:cs="Arial"/>
-          <w:sz w:val="24"/>
-        </w:rPr>
-        <w:t xml:space="preserve"> reescrito):</w:t>
-      </w:r>
-    </w:p>
-    <w:p>
-      <w:pPr>
-        <w:spacing w:line="240" w:lineRule="auto"/>
-        <w:rPr>
-          <w:rFonts w:ascii="Arial" w:hAnsi="Arial" w:cs="Arial"/>
-          <w:sz w:val="24"/>
-        </w:rPr>
-      </w:pPr>
-      <w:proofErr w:type="spellStart"/>
-      <w:r>
-        <w:rPr>
-          <w:rFonts w:ascii="Arial" w:hAnsi="Arial" w:cs="Arial"/>
-          <w:sz w:val="24"/>
-        </w:rPr>
-        <w:t>Sidebar</w:t>
-      </w:r>
-      <w:proofErr w:type="spellEnd"/>
-      <w:r>
-        <w:rPr>
-          <w:rFonts w:ascii="Arial" w:hAnsi="Arial" w:cs="Arial"/>
-          <w:sz w:val="24"/>
-        </w:rPr>
-        <w:t xml:space="preserve"> de conversaciones (botón </w:t>
-      </w:r>
-      <w:r>
-        <w:rPr>
-          <w:rFonts w:ascii="Segoe UI Symbol" w:hAnsi="Segoe UI Symbol" w:cs="Segoe UI Symbol"/>
-          <w:sz w:val="24"/>
-        </w:rPr>
-        <w:t>💬</w:t>
-      </w:r>
-      <w:r>
-        <w:rPr>
-          <w:rFonts w:ascii="Arial" w:hAnsi="Arial" w:cs="Arial"/>
-          <w:sz w:val="24"/>
-        </w:rPr>
-        <w:t>) — ver, crear, eliminar conversaciones</w:t>
-      </w:r>
-    </w:p>
-    <w:p>
-      <w:pPr>
-        <w:spacing w:line="240" w:lineRule="auto"/>
-        <w:rPr>
-          <w:rFonts w:ascii="Arial" w:hAnsi="Arial" w:cs="Arial"/>
-          <w:sz w:val="24"/>
-        </w:rPr>
-      </w:pPr>
-      <w:r>
-        <w:rPr>
-          <w:rFonts w:ascii="Arial" w:hAnsi="Arial" w:cs="Arial"/>
-          <w:sz w:val="24"/>
-        </w:rPr>
-        <w:t xml:space="preserve">Selector de lecciones (botón </w:t>
-      </w:r>
-      <w:r>
-        <w:rPr>
-          <w:rFonts w:ascii="Segoe UI Symbol" w:hAnsi="Segoe UI Symbol" w:cs="Segoe UI Symbol"/>
-          <w:sz w:val="24"/>
-        </w:rPr>
-        <w:t>📎</w:t>
-      </w:r>
-      <w:r>
-        <w:rPr>
-          <w:rFonts w:ascii="Arial" w:hAnsi="Arial" w:cs="Arial"/>
-          <w:sz w:val="24"/>
-        </w:rPr>
-        <w:t>) — muestra todas tus lecciones (completadas y en curso) para adjuntar al chat</w:t>
-      </w:r>
-    </w:p>
-    <w:p>
-      <w:pPr>
-        <w:spacing w:line="240" w:lineRule="auto"/>
-        <w:rPr>
-          <w:rFonts w:ascii="Arial" w:hAnsi="Arial" w:cs="Arial"/>
-          <w:sz w:val="24"/>
-        </w:rPr>
-      </w:pPr>
-      <w:r>
-        <w:rPr>
-          <w:rFonts w:ascii="Arial" w:hAnsi="Arial" w:cs="Arial"/>
-          <w:sz w:val="24"/>
-        </w:rPr>
-        <w:t>Los mensajes se persisten y se recargan al abrir una conversación</w:t>
-      </w:r>
-    </w:p>
-    <w:p>
-      <w:pPr>
-        <w:spacing w:line="240" w:lineRule="auto"/>
-        <w:rPr>
-          <w:rFonts w:ascii="Arial" w:hAnsi="Arial" w:cs="Arial"/>
-          <w:sz w:val="24"/>
-        </w:rPr>
-      </w:pPr>
-      <w:r>
-        <w:rPr>
-          <w:rFonts w:ascii="Arial" w:hAnsi="Arial" w:cs="Arial"/>
-          <w:sz w:val="24"/>
-        </w:rPr>
-        <w:t>Al enviar el primer mensaje se crea la conversación automáticamente</w:t>
-      </w:r>
-    </w:p>
-    <w:p>
-      <w:pPr>
-        <w:spacing w:line="240" w:lineRule="auto"/>
-        <w:rPr>
-          <w:rFonts w:ascii="Arial" w:hAnsi="Arial" w:cs="Arial"/>
-          <w:sz w:val="24"/>
-        </w:rPr>
-      </w:pPr>
+      <w:proofErr w:type="spellEnd"/>
+    </w:p>
+    <w:p>
+      <w:pPr>
+        <w:spacing w:line="240" w:lineRule="auto"/>
+        <w:rPr>
+          <w:rFonts w:ascii="Arial" w:hAnsi="Arial" w:cs="Arial"/>
+          <w:sz w:val="24"/>
+        </w:rPr>
+      </w:pPr>
+      <w:r>
+        <w:rPr>
+          <w:rFonts w:ascii="Arial" w:hAnsi="Arial" w:cs="Arial"/>
+          <w:sz w:val="24"/>
+        </w:rPr>
+        <w:t xml:space="preserve">- </w:t>
+      </w:r>
+      <w:proofErr w:type="spellStart"/>
+      <w:r>
+        <w:rPr>
+          <w:rFonts w:ascii="Arial" w:hAnsi="Arial" w:cs="Arial"/>
+          <w:sz w:val="24"/>
+        </w:rPr>
+        <w:t>Dashboard.jsx</w:t>
+      </w:r>
+      <w:proofErr w:type="spellEnd"/>
+      <w:r>
+        <w:rPr>
+          <w:rFonts w:ascii="Arial" w:hAnsi="Arial" w:cs="Arial"/>
+          <w:sz w:val="24"/>
+        </w:rPr>
+        <w:t>:</w:t>
+      </w:r>
+    </w:p>
+    <w:p>
+      <w:pPr>
+        <w:spacing w:line="240" w:lineRule="auto"/>
+        <w:rPr>
+          <w:rFonts w:ascii="Arial" w:hAnsi="Arial" w:cs="Arial"/>
+          <w:sz w:val="24"/>
+        </w:rPr>
+      </w:pPr>
+      <w:r>
+        <w:rPr>
+          <w:rFonts w:ascii="Arial" w:hAnsi="Arial" w:cs="Arial"/>
+          <w:sz w:val="24"/>
+        </w:rPr>
+        <w:t xml:space="preserve">  - Nueva </w:t>
+      </w:r>
+      <w:proofErr w:type="spellStart"/>
+      <w:r>
+        <w:rPr>
+          <w:rFonts w:ascii="Arial" w:hAnsi="Arial" w:cs="Arial"/>
+          <w:sz w:val="24"/>
+        </w:rPr>
+        <w:t>card</w:t>
+      </w:r>
+      <w:proofErr w:type="spellEnd"/>
+      <w:r>
+        <w:rPr>
+          <w:rFonts w:ascii="Arial" w:hAnsi="Arial" w:cs="Arial"/>
+          <w:sz w:val="24"/>
+        </w:rPr>
+        <w:t xml:space="preserve"> "Mis Estadísticas" con botón de acceso</w:t>
+      </w:r>
     </w:p>
     <w:sectPr>
       <w:pgSz w:w="12240" w:h="15840"/>

</xml_diff>